<commit_message>
Buch 6: STUFE zu SCHRITT umbenannt, passend zum Text in Einleitung und Nachwort
</commit_message>
<xml_diff>
--- a/outputs/buch6/buch6-MANUSKRIPT.docx
+++ b/outputs/buch6/buch6-MANUSKRIPT.docx
@@ -1126,7 +1126,7 @@
           <w:color w:val="000000"/>
           <w:sz w:val="32"/>
         </w:rPr>
-        <w:t>STUFE 1 — SEHEN</w:t>
+        <w:t>SCHRITT 1 — SEHEN</w:t>
       </w:r>
     </w:p>
     <w:p>
@@ -5916,7 +5916,7 @@
           <w:color w:val="000000"/>
           <w:sz w:val="32"/>
         </w:rPr>
-        <w:t>STUFE 2 — VERSTEHEN</w:t>
+        <w:t>SCHRITT 2 — VERSTEHEN</w:t>
       </w:r>
     </w:p>
     <w:p>
@@ -10504,7 +10504,7 @@
           <w:color w:val="000000"/>
           <w:sz w:val="32"/>
         </w:rPr>
-        <w:t>STUFE 3 — ERLAUBEN</w:t>
+        <w:t>SCHRITT 3 — ERLAUBEN</w:t>
       </w:r>
     </w:p>
     <w:p>
@@ -14498,7 +14498,7 @@
           <w:color w:val="000000"/>
           <w:sz w:val="32"/>
         </w:rPr>
-        <w:t>STUFE 4 — LERNEN</w:t>
+        <w:t>SCHRITT 4 — LERNEN</w:t>
       </w:r>
     </w:p>
     <w:p>
@@ -14513,7 +14513,7 @@
           <w:i/>
           <w:sz w:val="22"/>
         </w:rPr>
-        <w:t>Das sind konkrete Schritte. Klein. Machbar. Heute.</w:t>
+        <w:t>Konkret. Klein. Machbar. Heute.</w:t>
       </w:r>
     </w:p>
     <w:p>
@@ -19143,7 +19143,7 @@
           <w:color w:val="000000"/>
           <w:sz w:val="32"/>
         </w:rPr>
-        <w:t>STUFE 5 — WERDEN</w:t>
+        <w:t>SCHRITT 5 — WERDEN</w:t>
       </w:r>
     </w:p>
     <w:p>

</xml_diff>

<commit_message>
Buch 6: echte Untertitel der anderen Buecher eingesetzt
</commit_message>
<xml_diff>
--- a/outputs/buch6/buch6-MANUSKRIPT.docx
+++ b/outputs/buch6/buch6-MANUSKRIPT.docx
@@ -14579,7 +14579,7 @@
         <w:rPr>
           <w:i/>
         </w:rPr>
-        <w:t>Über das stille Ausbrennen in Partnerschaften und Familien.</w:t>
+        <w:t>Warum du gibst, bis nichts mehr von dir übrig ist — und wie du dich zurückholst.</w:t>
       </w:r>
     </w:p>
     <w:p>
@@ -14603,7 +14603,7 @@
         <w:rPr>
           <w:i/>
         </w:rPr>
-        <w:t>Warum Frauen sich ständig entschuldigen — und wie sie damit aufhören.</w:t>
+        <w:t>Warum du dich immer schuldig fühlst — und wie du damit aufhörst.</w:t>
       </w:r>
     </w:p>
     <w:p>

</xml_diff>

<commit_message>
Buch 6: zwei Handlungskapitel ergaenzt, Claudia als roter Faden, TikTok-Zeilen geschaerft, 19 Kapitel / 107 Seiten
</commit_message>
<xml_diff>
--- a/outputs/buch6/buch6-MANUSKRIPT.docx
+++ b/outputs/buch6/buch6-MANUSKRIPT.docx
@@ -5334,7 +5334,7 @@
           <w:b/>
           <w:i/>
         </w:rPr>
-        <w:t>„Wenn du so lange für andere gelebt hast, vergisst du irgendwann wer du bist."</w:t>
+        <w:t>„Jemand fragt, was du willst. Und du stockst. Das ist der Moment, in dem du merkst, dass du weg bist."</w:t>
       </w:r>
     </w:p>
     <w:p>
@@ -7217,7 +7217,7 @@
           <w:b/>
           <w:i/>
         </w:rPr>
-        <w:t>„Das Nein das sich falsch anfühlt ist meistens das richtigste das du sagen kannst."</w:t>
+        <w:t>„Das Nein, das sich falsch anfühlt, ist meistens das richtige. Das Gefühl ist alt, nicht wahr."</w:t>
       </w:r>
     </w:p>
     <w:p>
@@ -9970,6 +9970,18 @@
         <w:rPr>
           <w:sz w:val="22"/>
         </w:rPr>
+        <w:t>Wenn der andere nicht mitmacht</w:t>
+      </w:r>
+    </w:p>
+    <w:p>
+      <w:pPr>
+        <w:spacing w:after="60"/>
+        <w:jc w:val="center"/>
+      </w:pPr>
+      <w:r>
+        <w:rPr>
+          <w:sz w:val="22"/>
+        </w:rPr>
         <w:t>Um Hilfe bitten ohne dich zu erklären</w:t>
       </w:r>
     </w:p>
@@ -9983,6 +9995,18 @@
           <w:sz w:val="22"/>
         </w:rPr>
         <w:t>Wenn andere enttäuscht sind — und das okay ist</w:t>
+      </w:r>
+    </w:p>
+    <w:p>
+      <w:pPr>
+        <w:spacing w:after="60"/>
+        <w:jc w:val="center"/>
+      </w:pPr>
+      <w:r>
+        <w:rPr>
+          <w:sz w:val="22"/>
+        </w:rPr>
+        <w:t>Die ersten vier Wochen</w:t>
       </w:r>
     </w:p>
     <w:p>
@@ -10037,7 +10061,7 @@
           <w:b/>
           <w:i/>
         </w:rPr>
-        <w:t>„Bedürfnisse zu haben ist kein Egoismus. Es ist Biologie."</w:t>
+        <w:t>„Du weisst, was alle anderen brauchen. Frag dich einmal am Tag, was du brauchst. Nur einmal."</w:t>
       </w:r>
     </w:p>
     <w:p>
@@ -11103,10 +11127,15 @@
       </w:r>
     </w:p>
     <w:p>
+      <w:r>
+        <w:br w:type="page"/>
+      </w:r>
+    </w:p>
+    <w:p>
       <w:pPr>
         <w:pStyle w:val="berschrift2"/>
       </w:pPr>
-      <w:bookmarkStart w:id="19" w:name="_Toc235888481"/>
+      <w:bookmarkStart w:id="3" w:name="_Toc235888465"/>
       <w:r>
         <w:rPr>
           <w:rFonts w:ascii="Times New Roman" w:hAnsi="Times New Roman"/>
@@ -11114,21 +11143,9 @@
           <w:sz w:val="28"/>
         </w:rPr>
         <w:lastRenderedPageBreak/>
-        <w:t>Kapitel 14: Um Hilfe bitten ohne dich zu erklären</w:t>
-      </w:r>
-      <w:bookmarkEnd w:id="19"/>
-    </w:p>
-    <w:p>
-      <w:pPr>
-        <w:pBdr>
-          <w:bottom w:val="single" w:sz="4" w:space="0" w:color="AAAAAA"/>
-        </w:pBdr>
-      </w:pPr>
-    </w:p>
-    <w:p>
-      <w:pPr>
-        <w:spacing w:after="57"/>
-      </w:pPr>
+        <w:t xml:space="preserve">Kapitel 14: Wenn der andere nicht mitmacht</w:t>
+      </w:r>
+      <w:bookmarkEnd w:id="3"/>
     </w:p>
     <w:p>
       <w:pPr>
@@ -11142,7 +11159,695 @@
           <w:b/>
           <w:i/>
         </w:rPr>
-        <w:t>„Hilfe ist keine Schuld die du zurückzahlen musst. Du bist kein Konto das ausgeglichen werden muss."</w:t>
+        <w:t xml:space="preserve">„Nein sagen kann jede. Das Problem ist der Satz danach."</w:t>
+      </w:r>
+    </w:p>
+    <w:p>
+      <w:pPr>
+        <w:jc w:val="both"/>
+      </w:pPr>
+      <w:r>
+        <w:t xml:space="preserve">Die meisten Bücher hören genau hier auf.</w:t>
+      </w:r>
+    </w:p>
+    <w:p>
+      <w:pPr>
+        <w:jc w:val="both"/>
+      </w:pPr>
+      <w:r>
+        <w:t xml:space="preserve">Sag Nein. Setz Grenzen. Steh für dich ein.</w:t>
+      </w:r>
+    </w:p>
+    <w:p>
+      <w:pPr>
+        <w:spacing w:after="71"/>
+      </w:pPr>
+    </w:p>
+    <w:p>
+      <w:pPr>
+        <w:jc w:val="both"/>
+      </w:pPr>
+      <w:r>
+        <w:t xml:space="preserve">Und dann stehst du da, hast deinen Satz gesagt, und die andere Person antwortet.</w:t>
+      </w:r>
+    </w:p>
+    <w:p>
+      <w:pPr>
+        <w:spacing w:after="71"/>
+      </w:pPr>
+    </w:p>
+    <w:p>
+      <w:pPr>
+        <w:jc w:val="both"/>
+      </w:pPr>
+      <w:r>
+        <w:t xml:space="preserve">Das ist der Moment, in dem es kippt.</w:t>
+      </w:r>
+    </w:p>
+    <w:p>
+      <w:pPr>
+        <w:spacing w:after="71"/>
+      </w:pPr>
+    </w:p>
+    <w:p>
+      <w:pPr>
+        <w:jc w:val="both"/>
+      </w:pPr>
+      <w:r>
+        <w:t xml:space="preserve">Nicht beim Nein. Danach.</w:t>
+      </w:r>
+    </w:p>
+    <w:p>
+      <w:pPr>
+        <w:spacing w:after="71"/>
+      </w:pPr>
+    </w:p>
+    <w:p>
+      <w:pPr>
+        <w:jc w:val="both"/>
+      </w:pPr>
+      <w:r>
+        <w:t xml:space="preserve">Deshalb bekommst du hier keine Haltung, sondern Sätze. Zum Auswendiglernen.</w:t>
+      </w:r>
+    </w:p>
+    <w:p>
+      <w:pPr>
+        <w:spacing w:after="71"/>
+      </w:pPr>
+    </w:p>
+    <w:p>
+      <w:pPr>
+        <w:jc w:val="both"/>
+      </w:pPr>
+      <w:r>
+        <w:t xml:space="preserve">Situation 1: Sie fragt nach dem Grund.</w:t>
+      </w:r>
+    </w:p>
+    <w:p>
+      <w:pPr>
+        <w:spacing w:after="71"/>
+      </w:pPr>
+    </w:p>
+    <w:p>
+      <w:pPr>
+        <w:jc w:val="both"/>
+      </w:pPr>
+      <w:r>
+        <w:t xml:space="preserve">„Warum denn nicht? Du hast doch sonst immer Zeit."</w:t>
+      </w:r>
+    </w:p>
+    <w:p>
+      <w:pPr>
+        <w:spacing w:after="71"/>
+      </w:pPr>
+    </w:p>
+    <w:p>
+      <w:pPr>
+        <w:jc w:val="both"/>
+      </w:pPr>
+      <w:r>
+        <w:t xml:space="preserve">Dein Reflex: erklären. Und beim Erklären verlierst du.</w:t>
+      </w:r>
+    </w:p>
+    <w:p>
+      <w:pPr>
+        <w:spacing w:after="71"/>
+      </w:pPr>
+    </w:p>
+    <w:p>
+      <w:pPr>
+        <w:jc w:val="both"/>
+      </w:pPr>
+      <w:r>
+        <w:t xml:space="preserve">Denn jeder Grund ist verhandelbar. Wenn du sagst, du bist müde, kommt: Dann ruh dich halt nachher aus. Wenn du sagst, du hast keine Zeit, kommt: Es dauert doch nur zwanzig Minuten.</w:t>
+      </w:r>
+    </w:p>
+    <w:p>
+      <w:pPr>
+        <w:spacing w:after="71"/>
+      </w:pPr>
+    </w:p>
+    <w:p>
+      <w:pPr>
+        <w:jc w:val="both"/>
+      </w:pPr>
+      <w:r>
+        <w:t xml:space="preserve">Also gib keinen Grund. Wiederhol deinen Satz.</w:t>
+      </w:r>
+    </w:p>
+    <w:p>
+      <w:pPr>
+        <w:spacing w:after="71"/>
+      </w:pPr>
+    </w:p>
+    <w:p>
+      <w:pPr>
+        <w:jc w:val="both"/>
+      </w:pPr>
+      <w:r>
+        <w:t xml:space="preserve">„Es geht diesmal einfach nicht."</w:t>
+      </w:r>
+    </w:p>
+    <w:p>
+      <w:pPr>
+        <w:spacing w:after="71"/>
+      </w:pPr>
+    </w:p>
+    <w:p>
+      <w:pPr>
+        <w:jc w:val="both"/>
+      </w:pPr>
+      <w:r>
+        <w:t xml:space="preserve">Sie fragt nochmal. Du sagst dasselbe. Ruhig, freundlich, gleicher Wortlaut.</w:t>
+      </w:r>
+    </w:p>
+    <w:p>
+      <w:pPr>
+        <w:spacing w:after="71"/>
+      </w:pPr>
+    </w:p>
+    <w:p>
+      <w:pPr>
+        <w:jc w:val="both"/>
+      </w:pPr>
+      <w:r>
+        <w:t xml:space="preserve">„Ich weiss, es kommt ungelegen. Es geht trotzdem nicht."</w:t>
+      </w:r>
+    </w:p>
+    <w:p>
+      <w:pPr>
+        <w:spacing w:after="71"/>
+      </w:pPr>
+    </w:p>
+    <w:p>
+      <w:pPr>
+        <w:jc w:val="both"/>
+      </w:pPr>
+      <w:r>
+        <w:t xml:space="preserve">Beim dritten Mal hört sie auf.</w:t>
+      </w:r>
+    </w:p>
+    <w:p>
+      <w:pPr>
+        <w:jc w:val="both"/>
+      </w:pPr>
+      <w:r>
+        <w:t xml:space="preserve">Fast immer beim zweiten.</w:t>
+      </w:r>
+    </w:p>
+    <w:p>
+      <w:pPr>
+        <w:spacing w:after="71"/>
+      </w:pPr>
+    </w:p>
+    <w:p>
+      <w:pPr>
+        <w:jc w:val="both"/>
+      </w:pPr>
+      <w:r>
+        <w:t xml:space="preserve">Das fühlt sich stur an. Ist es auch. Und es ist das Einzige, was funktioniert.</w:t>
+      </w:r>
+    </w:p>
+    <w:p>
+      <w:pPr>
+        <w:spacing w:after="71"/>
+      </w:pPr>
+    </w:p>
+    <w:p>
+      <w:pPr>
+        <w:jc w:val="both"/>
+      </w:pPr>
+      <w:r>
+        <w:t xml:space="preserve">Situation 2: Sie erinnert dich an ihre Verdienste.</w:t>
+      </w:r>
+    </w:p>
+    <w:p>
+      <w:pPr>
+        <w:spacing w:after="71"/>
+      </w:pPr>
+    </w:p>
+    <w:p>
+      <w:pPr>
+        <w:jc w:val="both"/>
+      </w:pPr>
+      <w:r>
+        <w:t xml:space="preserve">„Ich war auch immer für dich da."</w:t>
+      </w:r>
+    </w:p>
+    <w:p>
+      <w:pPr>
+        <w:spacing w:after="71"/>
+      </w:pPr>
+    </w:p>
+    <w:p>
+      <w:pPr>
+        <w:jc w:val="both"/>
+      </w:pPr>
+      <w:r>
+        <w:t xml:space="preserve">Dieser Satz zielt genau auf die Stelle, die bei dir offen ist.</w:t>
+      </w:r>
+    </w:p>
+    <w:p>
+      <w:pPr>
+        <w:spacing w:after="71"/>
+      </w:pPr>
+    </w:p>
+    <w:p>
+      <w:pPr>
+        <w:jc w:val="both"/>
+      </w:pPr>
+      <w:r>
+        <w:t xml:space="preserve">Und er verwechselt zwei Dinge. Hilfe ist kein Kredit. Wer hilft, um später etwas einzufordern, hat nicht geholfen, sondern investiert.</w:t>
+      </w:r>
+    </w:p>
+    <w:p>
+      <w:pPr>
+        <w:spacing w:after="71"/>
+      </w:pPr>
+    </w:p>
+    <w:p>
+      <w:pPr>
+        <w:jc w:val="both"/>
+      </w:pPr>
+      <w:r>
+        <w:t xml:space="preserve">Du musst das nicht aussprechen. Sag stattdessen:</w:t>
+      </w:r>
+    </w:p>
+    <w:p>
+      <w:pPr>
+        <w:spacing w:after="71"/>
+      </w:pPr>
+    </w:p>
+    <w:p>
+      <w:pPr>
+        <w:jc w:val="both"/>
+      </w:pPr>
+      <w:r>
+        <w:t xml:space="preserve">„Das stimmt, und ich bin dir dankbar dafür. Diesmal geht es trotzdem nicht."</w:t>
+      </w:r>
+    </w:p>
+    <w:p>
+      <w:pPr>
+        <w:spacing w:after="71"/>
+      </w:pPr>
+    </w:p>
+    <w:p>
+      <w:pPr>
+        <w:jc w:val="both"/>
+      </w:pPr>
+      <w:r>
+        <w:t xml:space="preserve">Du bestätigst und bleibst. Beides gleichzeitig.</w:t>
+      </w:r>
+    </w:p>
+    <w:p>
+      <w:pPr>
+        <w:spacing w:after="71"/>
+      </w:pPr>
+    </w:p>
+    <w:p>
+      <w:pPr>
+        <w:jc w:val="both"/>
+      </w:pPr>
+      <w:r>
+        <w:t xml:space="preserve">Das nimmt dem Satz die Kraft, ohne dass ein Streit daraus wird.</w:t>
+      </w:r>
+    </w:p>
+    <w:p>
+      <w:pPr>
+        <w:spacing w:after="71"/>
+      </w:pPr>
+    </w:p>
+    <w:p>
+      <w:pPr>
+        <w:jc w:val="both"/>
+      </w:pPr>
+      <w:r>
+        <w:t xml:space="preserve">Situation 3: Sie schweigt.</w:t>
+      </w:r>
+    </w:p>
+    <w:p>
+      <w:pPr>
+        <w:spacing w:after="71"/>
+      </w:pPr>
+    </w:p>
+    <w:p>
+      <w:pPr>
+        <w:jc w:val="both"/>
+      </w:pPr>
+      <w:r>
+        <w:t xml:space="preserve">Das ist die schwerste.</w:t>
+      </w:r>
+    </w:p>
+    <w:p>
+      <w:pPr>
+        <w:spacing w:after="71"/>
+      </w:pPr>
+    </w:p>
+    <w:p>
+      <w:pPr>
+        <w:jc w:val="both"/>
+      </w:pPr>
+      <w:r>
+        <w:t xml:space="preserve">Kein Gegenargument. Nur ein knapper Ton, eine kurze Antwort, tagelang nichts.</w:t>
+      </w:r>
+    </w:p>
+    <w:p>
+      <w:pPr>
+        <w:spacing w:after="71"/>
+      </w:pPr>
+    </w:p>
+    <w:p>
+      <w:pPr>
+        <w:jc w:val="both"/>
+      </w:pPr>
+      <w:r>
+        <w:t xml:space="preserve">Schweigen wirkt, weil du es aus deiner Kindheit kennst. Dein Körper übersetzt es sofort: Ich habe etwas kaputtgemacht.</w:t>
+      </w:r>
+    </w:p>
+    <w:p>
+      <w:pPr>
+        <w:spacing w:after="71"/>
+      </w:pPr>
+    </w:p>
+    <w:p>
+      <w:pPr>
+        <w:jc w:val="both"/>
+      </w:pPr>
+      <w:r>
+        <w:t xml:space="preserve">Was du jetzt auf keinen Fall tust: nachfragen, ob alles in Ordnung ist. Das ist der Anfang vom Zurückrudern.</w:t>
+      </w:r>
+    </w:p>
+    <w:p>
+      <w:pPr>
+        <w:spacing w:after="71"/>
+      </w:pPr>
+    </w:p>
+    <w:p>
+      <w:pPr>
+        <w:jc w:val="both"/>
+      </w:pPr>
+      <w:r>
+        <w:t xml:space="preserve">Was du stattdessen tust: gar nichts.</w:t>
+      </w:r>
+    </w:p>
+    <w:p>
+      <w:pPr>
+        <w:spacing w:after="71"/>
+      </w:pPr>
+    </w:p>
+    <w:p>
+      <w:pPr>
+        <w:jc w:val="both"/>
+      </w:pPr>
+      <w:r>
+        <w:t xml:space="preserve">Verhalte dich normal. Schreib wie sonst. Sei freundlich wie sonst.</w:t>
+      </w:r>
+    </w:p>
+    <w:p>
+      <w:pPr>
+        <w:jc w:val="both"/>
+      </w:pPr>
+      <w:r>
+        <w:t xml:space="preserve">Aber nimm dein Nein nicht zurück und erwähne es nicht.</w:t>
+      </w:r>
+    </w:p>
+    <w:p>
+      <w:pPr>
+        <w:spacing w:after="71"/>
+      </w:pPr>
+    </w:p>
+    <w:p>
+      <w:pPr>
+        <w:jc w:val="both"/>
+      </w:pPr>
+      <w:r>
+        <w:t xml:space="preserve">Schweigen hält niemand ewig durch, wenn es keine Wirkung zeigt.</w:t>
+      </w:r>
+    </w:p>
+    <w:p>
+      <w:pPr>
+        <w:spacing w:after="71"/>
+      </w:pPr>
+    </w:p>
+    <w:p>
+      <w:pPr>
+        <w:jc w:val="both"/>
+      </w:pPr>
+      <w:r>
+        <w:t xml:space="preserve">Und falls doch: Dann hast du gerade etwas Wichtiges über diese Beziehung erfahren. Unbezahlbar, auch wenn es wehtut.</w:t>
+      </w:r>
+    </w:p>
+    <w:p>
+      <w:pPr>
+        <w:spacing w:after="71"/>
+      </w:pPr>
+    </w:p>
+    <w:p>
+      <w:pPr>
+        <w:jc w:val="both"/>
+      </w:pPr>
+      <w:r>
+        <w:t xml:space="preserve">Die einzige Regel, die du dir merken musst:</w:t>
+      </w:r>
+    </w:p>
+    <w:p>
+      <w:pPr>
+        <w:spacing w:after="71"/>
+      </w:pPr>
+    </w:p>
+    <w:p>
+      <w:pPr>
+        <w:jc w:val="both"/>
+      </w:pPr>
+      <w:r>
+        <w:t xml:space="preserve">Du musst nicht gewinnen.</w:t>
+      </w:r>
+    </w:p>
+    <w:p>
+      <w:pPr>
+        <w:jc w:val="both"/>
+      </w:pPr>
+      <w:r>
+        <w:t xml:space="preserve">Du musst nur bei deinem Satz bleiben.</w:t>
+      </w:r>
+    </w:p>
+    <w:p>
+      <w:pPr>
+        <w:spacing w:after="71"/>
+      </w:pPr>
+    </w:p>
+    <w:p>
+      <w:pPr>
+        <w:jc w:val="both"/>
+      </w:pPr>
+      <w:r>
+        <w:t xml:space="preserve">Es gibt kein Argument, das die andere Person überzeugt und gleichzeitig dein Nein rettet. Diese Kombination existiert nicht.</w:t>
+      </w:r>
+    </w:p>
+    <w:p>
+      <w:pPr>
+        <w:spacing w:after="71"/>
+      </w:pPr>
+    </w:p>
+    <w:p>
+      <w:pPr>
+        <w:jc w:val="both"/>
+      </w:pPr>
+      <w:r>
+        <w:t xml:space="preserve">Wer sein Nein verteidigt, hat es schon zur Verhandlung freigegeben.</w:t>
+      </w:r>
+    </w:p>
+    <w:p>
+      <w:pPr>
+        <w:spacing w:after="71"/>
+      </w:pPr>
+    </w:p>
+    <w:p>
+      <w:pPr>
+        <w:jc w:val="both"/>
+      </w:pPr>
+      <w:r>
+        <w:t xml:space="preserve">Claudia, die du aus dem ersten Kapitel kennst, hat es zuerst bei ihrer Schwester versucht.</w:t>
+      </w:r>
+    </w:p>
+    <w:p>
+      <w:pPr>
+        <w:spacing w:after="71"/>
+      </w:pPr>
+    </w:p>
+    <w:p>
+      <w:pPr>
+        <w:jc w:val="both"/>
+      </w:pPr>
+      <w:r>
+        <w:t xml:space="preserve">Zwei Sätze weit ist sie gekommen. Dann hat sie doch erklärt, dass die Kinder krank sind und die Woche schwierig war.</w:t>
+      </w:r>
+    </w:p>
+    <w:p>
+      <w:pPr>
+        <w:spacing w:after="71"/>
+      </w:pPr>
+    </w:p>
+    <w:p>
+      <w:pPr>
+        <w:jc w:val="both"/>
+      </w:pPr>
+      <w:r>
+        <w:t xml:space="preserve">„Ich hab es gemerkt, während ich geredet habe", sagte sie. „Und konnte trotzdem nicht aufhören."</w:t>
+      </w:r>
+    </w:p>
+    <w:p>
+      <w:pPr>
+        <w:spacing w:after="71"/>
+      </w:pPr>
+    </w:p>
+    <w:p>
+      <w:pPr>
+        <w:jc w:val="both"/>
+      </w:pPr>
+      <w:r>
+        <w:t xml:space="preserve">Beim nächsten Mal hat sie es aufgeschrieben. Wörtlich, auf einen Zettel neben dem Telefon.</w:t>
+      </w:r>
+    </w:p>
+    <w:p>
+      <w:pPr>
+        <w:spacing w:after="71"/>
+      </w:pPr>
+    </w:p>
+    <w:p>
+      <w:pPr>
+        <w:jc w:val="both"/>
+      </w:pPr>
+      <w:r>
+        <w:t xml:space="preserve">„Es geht diesmal einfach nicht."</w:t>
+      </w:r>
+    </w:p>
+    <w:p>
+      <w:pPr>
+        <w:spacing w:after="71"/>
+      </w:pPr>
+    </w:p>
+    <w:p>
+      <w:pPr>
+        <w:jc w:val="both"/>
+      </w:pPr>
+      <w:r>
+        <w:t xml:space="preserve">Sie hat den Satz zweimal gesagt und sonst nichts.</w:t>
+      </w:r>
+    </w:p>
+    <w:p>
+      <w:pPr>
+        <w:spacing w:after="71"/>
+      </w:pPr>
+    </w:p>
+    <w:p>
+      <w:pPr>
+        <w:jc w:val="both"/>
+      </w:pPr>
+      <w:r>
+        <w:t xml:space="preserve">Ihre Schwester war kurz still und hat dann gefragt, ob sie am Sonntag Zeit hätte.</w:t>
+      </w:r>
+    </w:p>
+    <w:p>
+      <w:pPr>
+        <w:spacing w:after="71"/>
+      </w:pPr>
+    </w:p>
+    <w:p>
+      <w:pPr>
+        <w:jc w:val="both"/>
+      </w:pPr>
+      <w:r>
+        <w:t xml:space="preserve">Das war alles.</w:t>
+      </w:r>
+    </w:p>
+    <w:p>
+      <w:pPr>
+        <w:spacing w:after="71"/>
+      </w:pPr>
+    </w:p>
+    <w:p>
+      <w:pPr>
+        <w:jc w:val="both"/>
+      </w:pPr>
+      <w:r>
+        <w:t xml:space="preserve">Acht Jahre Angst vor diesem Gespräch. Und es hat vierzig Sekunden gedauert.</w:t>
+      </w:r>
+    </w:p>
+    <w:p>
+      <w:pPr>
+        <w:spacing w:after="71"/>
+      </w:pPr>
+    </w:p>
+    <w:p>
+      <w:pPr>
+        <w:spacing w:after="120"/>
+        <w:ind w:left="340" w:right="340"/>
+      </w:pPr>
+      <w:r>
+        <w:rPr>
+          <w:i/>
+          <w:sz w:val="21"/>
+        </w:rPr>
+        <w:t xml:space="preserve">Welches Gespräch schiebst du vor dir her?</w:t>
+        <w:br/>
+        <w:t xml:space="preserve"/>
+        <w:br/>
+        <w:t xml:space="preserve">Schreib deinen Satz auf. Einen. Höchstens acht Wörter.</w:t>
+        <w:br/>
+        <w:t xml:space="preserve"/>
+        <w:br/>
+        <w:t xml:space="preserve">Und schreib darunter, was die andere Person vermutlich antwortet.</w:t>
+        <w:br/>
+        <w:t xml:space="preserve">Du weisst es meistens genau.</w:t>
+        <w:br/>
+        <w:t xml:space="preserve"/>
+        <w:br/>
+        <w:t xml:space="preserve">Dann schreib deinen Satz noch einmal darunter.</w:t>
+        <w:br/>
+        <w:t xml:space="preserve">Denselben. Das ist deine Antwort.</w:t>
+      </w:r>
+    </w:p>
+    <w:p>
+      <w:pPr>
+        <w:pStyle w:val="berschrift2"/>
+      </w:pPr>
+      <w:bookmarkStart w:id="19" w:name="_Toc235888481"/>
+      <w:r>
+        <w:rPr>
+          <w:rFonts w:ascii="Times New Roman" w:hAnsi="Times New Roman"/>
+          <w:color w:val="000000"/>
+          <w:sz w:val="28"/>
+        </w:rPr>
+        <w:t>Kapitel 15: Um Hilfe bitten ohne dich zu erklären</w:t>
+      </w:r>
+      <w:bookmarkEnd w:id="19"/>
+    </w:p>
+    <w:p>
+      <w:pPr>
+        <w:pBdr>
+          <w:bottom w:val="single" w:sz="4" w:space="0" w:color="AAAAAA"/>
+        </w:pBdr>
+      </w:pPr>
+    </w:p>
+    <w:p>
+      <w:pPr>
+        <w:spacing w:after="57"/>
+      </w:pPr>
+    </w:p>
+    <w:p>
+      <w:pPr>
+        <w:shd w:val="clear" w:color="auto" w:fill="F0F0F0"/>
+        <w:spacing w:before="160" w:after="280"/>
+        <w:ind w:left="283" w:right="283"/>
+        <w:jc w:val="center"/>
+      </w:pPr>
+      <w:r>
+        <w:rPr>
+          <w:b/>
+          <w:i/>
+        </w:rPr>
+        <w:t>„Du hilfst allen und erwartest nie etwas zurück. Warum gilt das nicht auch für dich?"</w:t>
       </w:r>
     </w:p>
     <w:p>
@@ -11872,6 +12577,506 @@
         <w:pStyle w:val="berschrift2"/>
       </w:pPr>
       <w:bookmarkStart w:id="20" w:name="_Toc235888482"/>
+      <w:r>
+        <w:rPr>
+          <w:rFonts w:ascii="Times New Roman" w:hAnsi="Times New Roman"/>
+          <w:color w:val="000000"/>
+          <w:sz w:val="28"/>
+        </w:rPr>
+        <w:t>Kapitel 16: Wenn andere enttäuscht sind — und das okay ist</w:t>
+      </w:r>
+      <w:bookmarkEnd w:id="20"/>
+    </w:p>
+    <w:p>
+      <w:pPr>
+        <w:pBdr>
+          <w:bottom w:val="single" w:sz="4" w:space="0" w:color="AAAAAA"/>
+        </w:pBdr>
+      </w:pPr>
+    </w:p>
+    <w:p>
+      <w:pPr>
+        <w:spacing w:after="57"/>
+      </w:pPr>
+    </w:p>
+    <w:p>
+      <w:pPr>
+        <w:shd w:val="clear" w:color="auto" w:fill="F0F0F0"/>
+        <w:spacing w:before="160" w:after="280"/>
+        <w:ind w:left="283" w:right="283"/>
+        <w:jc w:val="center"/>
+      </w:pPr>
+      <w:r>
+        <w:rPr>
+          <w:b/>
+          <w:i/>
+        </w:rPr>
+        <w:t>„Wenn jemand geht weil du Grenzen setzt, hat er nie dich geliebt. Nur was du geleistet hast."</w:t>
+      </w:r>
+    </w:p>
+    <w:p>
+      <w:pPr>
+        <w:spacing w:after="57"/>
+      </w:pPr>
+    </w:p>
+    <w:p>
+      <w:pPr>
+        <w:jc w:val="both"/>
+      </w:pPr>
+      <w:r>
+        <w:t>Hier ist die Frage die alles blockiert:</w:t>
+      </w:r>
+    </w:p>
+    <w:p>
+      <w:pPr>
+        <w:spacing w:after="71"/>
+      </w:pPr>
+    </w:p>
+    <w:p>
+      <w:pPr>
+        <w:jc w:val="both"/>
+      </w:pPr>
+      <w:r>
+        <w:t>Was wenn sie enttäuscht sind?</w:t>
+      </w:r>
+    </w:p>
+    <w:p>
+      <w:pPr>
+        <w:spacing w:after="71"/>
+      </w:pPr>
+    </w:p>
+    <w:p>
+      <w:pPr>
+        <w:jc w:val="both"/>
+      </w:pPr>
+      <w:r>
+        <w:t>Was wenn sie böse werden?</w:t>
+      </w:r>
+    </w:p>
+    <w:p>
+      <w:pPr>
+        <w:jc w:val="both"/>
+      </w:pPr>
+      <w:r>
+        <w:t>Was wenn sie mich nicht mehr mögen?</w:t>
+      </w:r>
+    </w:p>
+    <w:p>
+      <w:pPr>
+        <w:jc w:val="both"/>
+      </w:pPr>
+      <w:r>
+        <w:t>Was wenn ich die Beziehung zerstöre?</w:t>
+      </w:r>
+    </w:p>
+    <w:p>
+      <w:pPr>
+        <w:spacing w:after="71"/>
+      </w:pPr>
+    </w:p>
+    <w:p>
+      <w:pPr>
+        <w:jc w:val="both"/>
+      </w:pPr>
+      <w:r>
+        <w:t>Diese Fragen sind real.</w:t>
+      </w:r>
+    </w:p>
+    <w:p>
+      <w:pPr>
+        <w:jc w:val="both"/>
+      </w:pPr>
+      <w:r>
+        <w:t>Die Angst dahinter ist real.</w:t>
+      </w:r>
+    </w:p>
+    <w:p>
+      <w:pPr>
+        <w:spacing w:after="71"/>
+      </w:pPr>
+    </w:p>
+    <w:p>
+      <w:pPr>
+        <w:jc w:val="both"/>
+      </w:pPr>
+      <w:r>
+        <w:t>Und trotzdem: Manchmal werden sie enttäuscht sein.</w:t>
+      </w:r>
+    </w:p>
+    <w:p>
+      <w:pPr>
+        <w:jc w:val="both"/>
+      </w:pPr>
+      <w:r>
+        <w:t>Das ist okay.</w:t>
+      </w:r>
+    </w:p>
+    <w:p>
+      <w:pPr>
+        <w:spacing w:after="113"/>
+      </w:pPr>
+    </w:p>
+    <w:p>
+      <w:pPr>
+        <w:jc w:val="both"/>
+      </w:pPr>
+      <w:r>
+        <w:t>Wenn du dein ganzes Leben so lebst, dass niemand enttäuscht wird, lebst du für andere.</w:t>
+      </w:r>
+    </w:p>
+    <w:p>
+      <w:pPr>
+        <w:jc w:val="both"/>
+      </w:pPr>
+      <w:r>
+        <w:t>Nicht für dich.</w:t>
+      </w:r>
+    </w:p>
+    <w:p>
+      <w:pPr>
+        <w:spacing w:after="71"/>
+      </w:pPr>
+    </w:p>
+    <w:p>
+      <w:pPr>
+        <w:jc w:val="both"/>
+      </w:pPr>
+      <w:r>
+        <w:t>Und das hat einen Preis.</w:t>
+      </w:r>
+    </w:p>
+    <w:p>
+      <w:pPr>
+        <w:jc w:val="both"/>
+      </w:pPr>
+      <w:r>
+        <w:t>Den zahlst du. Täglich. Mit deiner Energie. Deiner Zeit. Dir selbst.</w:t>
+      </w:r>
+    </w:p>
+    <w:p>
+      <w:pPr>
+        <w:spacing w:after="113"/>
+      </w:pPr>
+    </w:p>
+    <w:p>
+      <w:pPr>
+        <w:jc w:val="both"/>
+      </w:pPr>
+      <w:r>
+        <w:t>Es gibt Menschen die schlecht reagieren wenn du Grenzen setzt.</w:t>
+      </w:r>
+    </w:p>
+    <w:p>
+      <w:pPr>
+        <w:jc w:val="both"/>
+      </w:pPr>
+      <w:r>
+        <w:t>Die beleidigt sind. Die argumentieren.</w:t>
+      </w:r>
+    </w:p>
+    <w:p>
+      <w:pPr>
+        <w:spacing w:after="71"/>
+      </w:pPr>
+    </w:p>
+    <w:p>
+      <w:pPr>
+        <w:jc w:val="both"/>
+      </w:pPr>
+      <w:r>
+        <w:t>Das ist unangenehm.</w:t>
+      </w:r>
+    </w:p>
+    <w:p>
+      <w:pPr>
+        <w:jc w:val="both"/>
+      </w:pPr>
+      <w:r>
+        <w:t>Und es zeigt dir etwas:</w:t>
+      </w:r>
+    </w:p>
+    <w:p>
+      <w:pPr>
+        <w:spacing w:after="71"/>
+      </w:pPr>
+    </w:p>
+    <w:p>
+      <w:pPr>
+        <w:jc w:val="both"/>
+      </w:pPr>
+      <w:r>
+        <w:t>Diese Person war nicht an dir interessiert.</w:t>
+      </w:r>
+    </w:p>
+    <w:p>
+      <w:pPr>
+        <w:jc w:val="both"/>
+      </w:pPr>
+      <w:r>
+        <w:t>Sie war an dem interessiert was du geleistet hast.</w:t>
+      </w:r>
+    </w:p>
+    <w:p>
+      <w:pPr>
+        <w:spacing w:after="71"/>
+      </w:pPr>
+    </w:p>
+    <w:p>
+      <w:pPr>
+        <w:jc w:val="both"/>
+      </w:pPr>
+      <w:r>
+        <w:t>Das tut weh.</w:t>
+      </w:r>
+    </w:p>
+    <w:p>
+      <w:pPr>
+        <w:jc w:val="both"/>
+      </w:pPr>
+      <w:r>
+        <w:t>Und es ist wichtig.</w:t>
+      </w:r>
+    </w:p>
+    <w:p>
+      <w:pPr>
+        <w:spacing w:after="113"/>
+      </w:pPr>
+    </w:p>
+    <w:p>
+      <w:pPr>
+        <w:jc w:val="both"/>
+      </w:pPr>
+      <w:r>
+        <w:t>Die Menschen die wirklich für dich da sind, bleiben.</w:t>
+      </w:r>
+    </w:p>
+    <w:p>
+      <w:pPr>
+        <w:jc w:val="both"/>
+      </w:pPr>
+      <w:r>
+        <w:t>Nicht weil du so viel gibst.</w:t>
+      </w:r>
+    </w:p>
+    <w:p>
+      <w:pPr>
+        <w:jc w:val="both"/>
+      </w:pPr>
+      <w:r>
+        <w:t>Weil du du bist.</w:t>
+      </w:r>
+    </w:p>
+    <w:p>
+      <w:pPr>
+        <w:spacing w:after="71"/>
+      </w:pPr>
+    </w:p>
+    <w:p>
+      <w:pPr>
+        <w:jc w:val="both"/>
+      </w:pPr>
+      <w:r>
+        <w:t>Diese Beziehungen tragen es aus wenn du Nein sagst.</w:t>
+      </w:r>
+    </w:p>
+    <w:p>
+      <w:pPr>
+        <w:jc w:val="both"/>
+      </w:pPr>
+      <w:r>
+        <w:t>Die anderen zeigen dir, was diese Beziehung wirklich war.</w:t>
+      </w:r>
+    </w:p>
+    <w:p>
+      <w:pPr>
+        <w:spacing w:after="113"/>
+      </w:pPr>
+    </w:p>
+    <w:p>
+      <w:pPr>
+        <w:jc w:val="both"/>
+      </w:pPr>
+      <w:r>
+        <w:lastRenderedPageBreak/>
+        <w:t>Ich hatte eine Freundschaft die damit nicht umgehen konnte.</w:t>
+      </w:r>
+    </w:p>
+    <w:p>
+      <w:pPr>
+        <w:spacing w:after="71"/>
+      </w:pPr>
+    </w:p>
+    <w:p>
+      <w:pPr>
+        <w:jc w:val="both"/>
+      </w:pPr>
+      <w:r>
+        <w:t>Als ich anfing Grenzen zu setzen, wurde sie kühler.</w:t>
+      </w:r>
+    </w:p>
+    <w:p>
+      <w:pPr>
+        <w:jc w:val="both"/>
+      </w:pPr>
+      <w:r>
+        <w:t>Dann war sie weg.</w:t>
+      </w:r>
+    </w:p>
+    <w:p>
+      <w:pPr>
+        <w:spacing w:after="71"/>
+      </w:pPr>
+    </w:p>
+    <w:p>
+      <w:pPr>
+        <w:jc w:val="both"/>
+      </w:pPr>
+      <w:r>
+        <w:t>Das hat wehgetan.</w:t>
+      </w:r>
+    </w:p>
+    <w:p>
+      <w:pPr>
+        <w:jc w:val="both"/>
+      </w:pPr>
+      <w:r>
+        <w:t>Früher wäre ich zurückgerudert.</w:t>
+      </w:r>
+    </w:p>
+    <w:p>
+      <w:pPr>
+        <w:jc w:val="both"/>
+      </w:pPr>
+      <w:r>
+        <w:t>Mich entschuldigt. Ja gesagt.</w:t>
+      </w:r>
+    </w:p>
+    <w:p>
+      <w:pPr>
+        <w:spacing w:after="71"/>
+      </w:pPr>
+    </w:p>
+    <w:p>
+      <w:pPr>
+        <w:jc w:val="both"/>
+      </w:pPr>
+      <w:r>
+        <w:t>Nicht dieses Mal.</w:t>
+      </w:r>
+    </w:p>
+    <w:p>
+      <w:pPr>
+        <w:spacing w:after="71"/>
+      </w:pPr>
+    </w:p>
+    <w:p>
+      <w:pPr>
+        <w:jc w:val="both"/>
+      </w:pPr>
+      <w:r>
+        <w:t>Eine Beziehung die nur existiert wenn ich mich verbiege, ist keine die ich verlieren muss.</w:t>
+      </w:r>
+    </w:p>
+    <w:p>
+      <w:pPr>
+        <w:spacing w:after="142"/>
+      </w:pPr>
+    </w:p>
+    <w:p>
+      <w:pPr>
+        <w:spacing w:after="85"/>
+      </w:pPr>
+    </w:p>
+    <w:p>
+      <w:pPr>
+        <w:jc w:val="both"/>
+      </w:pPr>
+      <w:r>
+        <w:rPr>
+          <w:b/>
+        </w:rPr>
+        <w:t>Reflexion</w:t>
+      </w:r>
+    </w:p>
+    <w:p>
+      <w:pPr>
+        <w:spacing w:after="120"/>
+        <w:ind w:left="340" w:right="340"/>
+      </w:pPr>
+      <w:r>
+        <w:rPr>
+          <w:i/>
+          <w:sz w:val="21"/>
+        </w:rPr>
+        <w:t>Wessen Enttäuschung fürchtest du am meisten?</w:t>
+      </w:r>
+      <w:r>
+        <w:br/>
+      </w:r>
+      <w:r>
+        <w:br/>
+      </w:r>
+      <w:r>
+        <w:rPr>
+          <w:i/>
+          <w:sz w:val="21"/>
+        </w:rPr>
+        <w:t>Was würde wirklich passieren wenn diese Person enttäuscht wäre?</w:t>
+      </w:r>
+      <w:r>
+        <w:br/>
+      </w:r>
+      <w:r>
+        <w:br/>
+      </w:r>
+      <w:r>
+        <w:rPr>
+          <w:i/>
+          <w:sz w:val="21"/>
+        </w:rPr>
+        <w:t>Ist die Beziehung stabil genug um das zu tragen?</w:t>
+      </w:r>
+      <w:r>
+        <w:br/>
+      </w:r>
+      <w:r>
+        <w:rPr>
+          <w:i/>
+          <w:sz w:val="21"/>
+        </w:rPr>
+        <w:t>Wenn ja: Das Nein ist sicherer als du denkst.</w:t>
+      </w:r>
+      <w:r>
+        <w:br/>
+      </w:r>
+      <w:r>
+        <w:rPr>
+          <w:i/>
+          <w:sz w:val="21"/>
+        </w:rPr>
+        <w:t>Wenn nein: Das ist eine wichtige Information.</w:t>
+      </w:r>
+    </w:p>
+    <w:p>
+      <w:r>
+        <w:br w:type="page"/>
+      </w:r>
+    </w:p>
+    <w:p>
+      <w:pPr>
+        <w:spacing w:after="992"/>
+      </w:pPr>
+    </w:p>
+    <w:p>
+      <w:r>
+        <w:br w:type="page"/>
+      </w:r>
+    </w:p>
+    <w:p>
+      <w:pPr>
+        <w:pStyle w:val="berschrift2"/>
+      </w:pPr>
+      <w:bookmarkStart w:id="3" w:name="_Toc235888465"/>
       <w:r>
         <w:rPr>
           <w:rFonts w:ascii="Times New Roman" w:hAnsi="Times New Roman"/>
@@ -11879,21 +13084,9 @@
           <w:sz w:val="28"/>
         </w:rPr>
         <w:lastRenderedPageBreak/>
-        <w:t>Kapitel 15: Wenn andere enttäuscht sind — und das okay ist</w:t>
-      </w:r>
-      <w:bookmarkEnd w:id="20"/>
-    </w:p>
-    <w:p>
-      <w:pPr>
-        <w:pBdr>
-          <w:bottom w:val="single" w:sz="4" w:space="0" w:color="AAAAAA"/>
-        </w:pBdr>
-      </w:pPr>
-    </w:p>
-    <w:p>
-      <w:pPr>
-        <w:spacing w:after="57"/>
-      </w:pPr>
+        <w:t xml:space="preserve">Kapitel 17: Die ersten vier Wochen</w:t>
+      </w:r>
+      <w:bookmarkEnd w:id="3"/>
     </w:p>
     <w:p>
       <w:pPr>
@@ -11907,392 +13100,542 @@
           <w:b/>
           <w:i/>
         </w:rPr>
-        <w:t>„Wenn jemand geht weil du Grenzen setzt, hat er nie dich geliebt. Nur was du geleistet hast."</w:t>
-      </w:r>
-    </w:p>
-    <w:p>
-      <w:pPr>
-        <w:spacing w:after="57"/>
-      </w:pPr>
-    </w:p>
-    <w:p>
-      <w:pPr>
-        <w:jc w:val="both"/>
-      </w:pPr>
-      <w:r>
-        <w:t>Hier ist die Frage die alles blockiert:</w:t>
-      </w:r>
-    </w:p>
-    <w:p>
-      <w:pPr>
-        <w:spacing w:after="71"/>
-      </w:pPr>
-    </w:p>
-    <w:p>
-      <w:pPr>
-        <w:jc w:val="both"/>
-      </w:pPr>
-      <w:r>
-        <w:t>Was wenn sie enttäuscht sind?</w:t>
-      </w:r>
-    </w:p>
-    <w:p>
-      <w:pPr>
-        <w:spacing w:after="71"/>
-      </w:pPr>
-    </w:p>
-    <w:p>
-      <w:pPr>
-        <w:jc w:val="both"/>
-      </w:pPr>
-      <w:r>
-        <w:t>Was wenn sie böse werden?</w:t>
-      </w:r>
-    </w:p>
-    <w:p>
-      <w:pPr>
-        <w:jc w:val="both"/>
-      </w:pPr>
-      <w:r>
-        <w:t>Was wenn sie mich nicht mehr mögen?</w:t>
-      </w:r>
-    </w:p>
-    <w:p>
-      <w:pPr>
-        <w:jc w:val="both"/>
-      </w:pPr>
-      <w:r>
-        <w:t>Was wenn ich die Beziehung zerstöre?</w:t>
-      </w:r>
-    </w:p>
-    <w:p>
-      <w:pPr>
-        <w:spacing w:after="71"/>
-      </w:pPr>
-    </w:p>
-    <w:p>
-      <w:pPr>
-        <w:jc w:val="both"/>
-      </w:pPr>
-      <w:r>
-        <w:t>Diese Fragen sind real.</w:t>
-      </w:r>
-    </w:p>
-    <w:p>
-      <w:pPr>
-        <w:jc w:val="both"/>
-      </w:pPr>
-      <w:r>
-        <w:t>Die Angst dahinter ist real.</w:t>
-      </w:r>
-    </w:p>
-    <w:p>
-      <w:pPr>
-        <w:spacing w:after="71"/>
-      </w:pPr>
-    </w:p>
-    <w:p>
-      <w:pPr>
-        <w:jc w:val="both"/>
-      </w:pPr>
-      <w:r>
-        <w:t>Und trotzdem: Manchmal werden sie enttäuscht sein.</w:t>
-      </w:r>
-    </w:p>
-    <w:p>
-      <w:pPr>
-        <w:jc w:val="both"/>
-      </w:pPr>
-      <w:r>
-        <w:t>Das ist okay.</w:t>
-      </w:r>
-    </w:p>
-    <w:p>
-      <w:pPr>
-        <w:spacing w:after="113"/>
-      </w:pPr>
-    </w:p>
-    <w:p>
-      <w:pPr>
-        <w:jc w:val="both"/>
-      </w:pPr>
-      <w:r>
-        <w:t>Wenn du dein ganzes Leben so lebst, dass niemand enttäuscht wird, lebst du für andere.</w:t>
-      </w:r>
-    </w:p>
-    <w:p>
-      <w:pPr>
-        <w:jc w:val="both"/>
-      </w:pPr>
-      <w:r>
-        <w:t>Nicht für dich.</w:t>
-      </w:r>
-    </w:p>
-    <w:p>
-      <w:pPr>
-        <w:spacing w:after="71"/>
-      </w:pPr>
-    </w:p>
-    <w:p>
-      <w:pPr>
-        <w:jc w:val="both"/>
-      </w:pPr>
-      <w:r>
-        <w:t>Und das hat einen Preis.</w:t>
-      </w:r>
-    </w:p>
-    <w:p>
-      <w:pPr>
-        <w:jc w:val="both"/>
-      </w:pPr>
-      <w:r>
-        <w:t>Den zahlst du. Täglich. Mit deiner Energie. Deiner Zeit. Dir selbst.</w:t>
-      </w:r>
-    </w:p>
-    <w:p>
-      <w:pPr>
-        <w:spacing w:after="113"/>
-      </w:pPr>
-    </w:p>
-    <w:p>
-      <w:pPr>
-        <w:jc w:val="both"/>
-      </w:pPr>
-      <w:r>
-        <w:t>Es gibt Menschen die schlecht reagieren wenn du Grenzen setzt.</w:t>
-      </w:r>
-    </w:p>
-    <w:p>
-      <w:pPr>
-        <w:jc w:val="both"/>
-      </w:pPr>
-      <w:r>
-        <w:t>Die beleidigt sind. Die argumentieren.</w:t>
-      </w:r>
-    </w:p>
-    <w:p>
-      <w:pPr>
-        <w:spacing w:after="71"/>
-      </w:pPr>
-    </w:p>
-    <w:p>
-      <w:pPr>
-        <w:jc w:val="both"/>
-      </w:pPr>
-      <w:r>
-        <w:t>Das ist unangenehm.</w:t>
-      </w:r>
-    </w:p>
-    <w:p>
-      <w:pPr>
-        <w:jc w:val="both"/>
-      </w:pPr>
-      <w:r>
-        <w:t>Und es zeigt dir etwas:</w:t>
-      </w:r>
-    </w:p>
-    <w:p>
-      <w:pPr>
-        <w:spacing w:after="71"/>
-      </w:pPr>
-    </w:p>
-    <w:p>
-      <w:pPr>
-        <w:jc w:val="both"/>
-      </w:pPr>
-      <w:r>
-        <w:t>Diese Person war nicht an dir interessiert.</w:t>
-      </w:r>
-    </w:p>
-    <w:p>
-      <w:pPr>
-        <w:jc w:val="both"/>
-      </w:pPr>
-      <w:r>
-        <w:t>Sie war an dem interessiert was du geleistet hast.</w:t>
-      </w:r>
-    </w:p>
-    <w:p>
-      <w:pPr>
-        <w:spacing w:after="71"/>
-      </w:pPr>
-    </w:p>
-    <w:p>
-      <w:pPr>
-        <w:jc w:val="both"/>
-      </w:pPr>
-      <w:r>
-        <w:t>Das tut weh.</w:t>
-      </w:r>
-    </w:p>
-    <w:p>
-      <w:pPr>
-        <w:jc w:val="both"/>
-      </w:pPr>
-      <w:r>
-        <w:t>Und es ist wichtig.</w:t>
-      </w:r>
-    </w:p>
-    <w:p>
-      <w:pPr>
-        <w:spacing w:after="113"/>
-      </w:pPr>
-    </w:p>
-    <w:p>
-      <w:pPr>
-        <w:jc w:val="both"/>
-      </w:pPr>
-      <w:r>
-        <w:t>Die Menschen die wirklich für dich da sind, bleiben.</w:t>
-      </w:r>
-    </w:p>
-    <w:p>
-      <w:pPr>
-        <w:jc w:val="both"/>
-      </w:pPr>
-      <w:r>
-        <w:t>Nicht weil du so viel gibst.</w:t>
-      </w:r>
-    </w:p>
-    <w:p>
-      <w:pPr>
-        <w:jc w:val="both"/>
-      </w:pPr>
-      <w:r>
-        <w:t>Weil du du bist.</w:t>
-      </w:r>
-    </w:p>
-    <w:p>
-      <w:pPr>
-        <w:spacing w:after="71"/>
-      </w:pPr>
-    </w:p>
-    <w:p>
-      <w:pPr>
-        <w:jc w:val="both"/>
-      </w:pPr>
-      <w:r>
-        <w:t>Diese Beziehungen tragen es aus wenn du Nein sagst.</w:t>
-      </w:r>
-    </w:p>
-    <w:p>
-      <w:pPr>
-        <w:jc w:val="both"/>
-      </w:pPr>
-      <w:r>
-        <w:t>Die anderen zeigen dir, was diese Beziehung wirklich war.</w:t>
-      </w:r>
-    </w:p>
-    <w:p>
-      <w:pPr>
-        <w:spacing w:after="113"/>
-      </w:pPr>
-    </w:p>
-    <w:p>
-      <w:pPr>
-        <w:jc w:val="both"/>
-      </w:pPr>
-      <w:r>
-        <w:lastRenderedPageBreak/>
-        <w:t>Ich hatte eine Freundschaft die damit nicht umgehen konnte.</w:t>
-      </w:r>
-    </w:p>
-    <w:p>
-      <w:pPr>
-        <w:spacing w:after="71"/>
-      </w:pPr>
-    </w:p>
-    <w:p>
-      <w:pPr>
-        <w:jc w:val="both"/>
-      </w:pPr>
-      <w:r>
-        <w:t>Als ich anfing Grenzen zu setzen, wurde sie kühler.</w:t>
-      </w:r>
-    </w:p>
-    <w:p>
-      <w:pPr>
-        <w:jc w:val="both"/>
-      </w:pPr>
-      <w:r>
-        <w:t>Dann war sie weg.</w:t>
-      </w:r>
-    </w:p>
-    <w:p>
-      <w:pPr>
-        <w:spacing w:after="71"/>
-      </w:pPr>
-    </w:p>
-    <w:p>
-      <w:pPr>
-        <w:jc w:val="both"/>
-      </w:pPr>
-      <w:r>
-        <w:t>Das hat wehgetan.</w:t>
-      </w:r>
-    </w:p>
-    <w:p>
-      <w:pPr>
-        <w:jc w:val="both"/>
-      </w:pPr>
-      <w:r>
-        <w:t>Früher wäre ich zurückgerudert.</w:t>
-      </w:r>
-    </w:p>
-    <w:p>
-      <w:pPr>
-        <w:jc w:val="both"/>
-      </w:pPr>
-      <w:r>
-        <w:t>Mich entschuldigt. Ja gesagt.</w:t>
-      </w:r>
-    </w:p>
-    <w:p>
-      <w:pPr>
-        <w:spacing w:after="71"/>
-      </w:pPr>
-    </w:p>
-    <w:p>
-      <w:pPr>
-        <w:jc w:val="both"/>
-      </w:pPr>
-      <w:r>
-        <w:t>Nicht dieses Mal.</w:t>
-      </w:r>
-    </w:p>
-    <w:p>
-      <w:pPr>
-        <w:spacing w:after="71"/>
-      </w:pPr>
-    </w:p>
-    <w:p>
-      <w:pPr>
-        <w:jc w:val="both"/>
-      </w:pPr>
-      <w:r>
-        <w:t>Eine Beziehung die nur existiert wenn ich mich verbiege, ist keine die ich verlieren muss.</w:t>
-      </w:r>
-    </w:p>
-    <w:p>
-      <w:pPr>
-        <w:spacing w:after="142"/>
-      </w:pPr>
-    </w:p>
-    <w:p>
-      <w:pPr>
-        <w:spacing w:after="85"/>
-      </w:pPr>
-    </w:p>
-    <w:p>
-      <w:pPr>
-        <w:jc w:val="both"/>
-      </w:pPr>
-      <w:r>
-        <w:rPr>
-          <w:b/>
-        </w:rPr>
-        <w:t>Reflexion</w:t>
-      </w:r>
+        <w:t xml:space="preserve">„Du brauchst kein neues Leben. Du brauchst vier Wochen und eine einzige Sache pro Woche."</w:t>
+      </w:r>
+    </w:p>
+    <w:p>
+      <w:pPr>
+        <w:jc w:val="both"/>
+      </w:pPr>
+      <w:r>
+        <w:t xml:space="preserve">Du hast jetzt viel gelesen.</w:t>
+      </w:r>
+    </w:p>
+    <w:p>
+      <w:pPr>
+        <w:jc w:val="both"/>
+      </w:pPr>
+      <w:r>
+        <w:t xml:space="preserve">Und die Gefahr an diesem Punkt ist immer dieselbe.</w:t>
+      </w:r>
+    </w:p>
+    <w:p>
+      <w:pPr>
+        <w:spacing w:after="71"/>
+      </w:pPr>
+    </w:p>
+    <w:p>
+      <w:pPr>
+        <w:jc w:val="both"/>
+      </w:pPr>
+      <w:r>
+        <w:t xml:space="preserve">Du klappst das Buch zu, nimmst dir alles gleichzeitig vor, hältst drei Tage durch und bist danach überzeugt, dass es bei dir nicht funktioniert.</w:t>
+      </w:r>
+    </w:p>
+    <w:p>
+      <w:pPr>
+        <w:spacing w:after="71"/>
+      </w:pPr>
+    </w:p>
+    <w:p>
+      <w:pPr>
+        <w:jc w:val="both"/>
+      </w:pPr>
+      <w:r>
+        <w:t xml:space="preserve">Deshalb hier ein Plan, der klein genug ist, dass er nicht scheitern kann.</w:t>
+      </w:r>
+    </w:p>
+    <w:p>
+      <w:pPr>
+        <w:spacing w:after="71"/>
+      </w:pPr>
+    </w:p>
+    <w:p>
+      <w:pPr>
+        <w:jc w:val="both"/>
+      </w:pPr>
+      <w:r>
+        <w:t xml:space="preserve">Vier Wochen. Pro Woche eine Sache. Nicht mehr.</w:t>
+      </w:r>
+    </w:p>
+    <w:p>
+      <w:pPr>
+        <w:spacing w:after="71"/>
+      </w:pPr>
+    </w:p>
+    <w:p>
+      <w:pPr>
+        <w:jc w:val="both"/>
+      </w:pPr>
+      <w:r>
+        <w:t xml:space="preserve">Woche 1: Nur merken. Nichts ändern.</w:t>
+      </w:r>
+    </w:p>
+    <w:p>
+      <w:pPr>
+        <w:spacing w:after="71"/>
+      </w:pPr>
+    </w:p>
+    <w:p>
+      <w:pPr>
+        <w:jc w:val="both"/>
+      </w:pPr>
+      <w:r>
+        <w:t xml:space="preserve">Diese Woche änderst du gar nichts.</w:t>
+      </w:r>
+    </w:p>
+    <w:p>
+      <w:pPr>
+        <w:spacing w:after="71"/>
+      </w:pPr>
+    </w:p>
+    <w:p>
+      <w:pPr>
+        <w:jc w:val="both"/>
+      </w:pPr>
+      <w:r>
+        <w:t xml:space="preserve">Du sagst weiter Ja. Du machst weiter alles. Du funktionierst wie immer.</w:t>
+      </w:r>
+    </w:p>
+    <w:p>
+      <w:pPr>
+        <w:spacing w:after="71"/>
+      </w:pPr>
+    </w:p>
+    <w:p>
+      <w:pPr>
+        <w:jc w:val="both"/>
+      </w:pPr>
+      <w:r>
+        <w:t xml:space="preserve">Du merkst es nur.</w:t>
+      </w:r>
+    </w:p>
+    <w:p>
+      <w:pPr>
+        <w:spacing w:after="71"/>
+      </w:pPr>
+    </w:p>
+    <w:p>
+      <w:pPr>
+        <w:jc w:val="both"/>
+      </w:pPr>
+      <w:r>
+        <w:t xml:space="preserve">Jedes Mal, wenn du Ja sagst und innerlich Nein denkst, machst du einen Strich. Handy, Notizzettel, egal.</w:t>
+      </w:r>
+    </w:p>
+    <w:p>
+      <w:pPr>
+        <w:spacing w:after="71"/>
+      </w:pPr>
+    </w:p>
+    <w:p>
+      <w:pPr>
+        <w:jc w:val="both"/>
+      </w:pPr>
+      <w:r>
+        <w:t xml:space="preserve">Am Sonntag zählst du.</w:t>
+      </w:r>
+    </w:p>
+    <w:p>
+      <w:pPr>
+        <w:spacing w:after="71"/>
+      </w:pPr>
+    </w:p>
+    <w:p>
+      <w:pPr>
+        <w:jc w:val="both"/>
+      </w:pPr>
+      <w:r>
+        <w:t xml:space="preserve">Mehr nicht. Das ist die ganze Aufgabe.</w:t>
+      </w:r>
+    </w:p>
+    <w:p>
+      <w:pPr>
+        <w:spacing w:after="71"/>
+      </w:pPr>
+    </w:p>
+    <w:p>
+      <w:pPr>
+        <w:jc w:val="both"/>
+      </w:pPr>
+      <w:r>
+        <w:t xml:space="preserve">Die meisten sind über ihre eigene Zahl erschrocken. Und genau dieser Schreck trägt dich durch die nächsten drei Wochen.</w:t>
+      </w:r>
+    </w:p>
+    <w:p>
+      <w:pPr>
+        <w:spacing w:after="71"/>
+      </w:pPr>
+    </w:p>
+    <w:p>
+      <w:pPr>
+        <w:jc w:val="both"/>
+      </w:pPr>
+      <w:r>
+        <w:t xml:space="preserve">Woche 2: Eine Sache am Tag für dich.</w:t>
+      </w:r>
+    </w:p>
+    <w:p>
+      <w:pPr>
+        <w:spacing w:after="71"/>
+      </w:pPr>
+    </w:p>
+    <w:p>
+      <w:pPr>
+        <w:jc w:val="both"/>
+      </w:pPr>
+      <w:r>
+        <w:t xml:space="preserve">Eine. Kleine. Jeden Tag.</w:t>
+      </w:r>
+    </w:p>
+    <w:p>
+      <w:pPr>
+        <w:spacing w:after="71"/>
+      </w:pPr>
+    </w:p>
+    <w:p>
+      <w:pPr>
+        <w:jc w:val="both"/>
+      </w:pPr>
+      <w:r>
+        <w:t xml:space="preserve">Nicht das Fitnessabo. Nicht der Wochenendtrip.</w:t>
+      </w:r>
+    </w:p>
+    <w:p>
+      <w:pPr>
+        <w:spacing w:after="71"/>
+      </w:pPr>
+    </w:p>
+    <w:p>
+      <w:pPr>
+        <w:jc w:val="both"/>
+      </w:pPr>
+      <w:r>
+        <w:t xml:space="preserve">Fünf Minuten vor dem Aufstehen liegen bleiben. Der Kaffee im Sitzen statt im Stehen. Einmal um den Block, ohne Handy.</w:t>
+      </w:r>
+    </w:p>
+    <w:p>
+      <w:pPr>
+        <w:spacing w:after="71"/>
+      </w:pPr>
+    </w:p>
+    <w:p>
+      <w:pPr>
+        <w:jc w:val="both"/>
+      </w:pPr>
+      <w:r>
+        <w:t xml:space="preserve">Es muss so klein sein, dass es an einem schlechten Tag trotzdem geht.</w:t>
+      </w:r>
+    </w:p>
+    <w:p>
+      <w:pPr>
+        <w:spacing w:after="71"/>
+      </w:pPr>
+    </w:p>
+    <w:p>
+      <w:pPr>
+        <w:jc w:val="both"/>
+      </w:pPr>
+      <w:r>
+        <w:t xml:space="preserve">Und niemand muss davon wissen.</w:t>
+      </w:r>
+    </w:p>
+    <w:p>
+      <w:pPr>
+        <w:spacing w:after="71"/>
+      </w:pPr>
+    </w:p>
+    <w:p>
+      <w:pPr>
+        <w:jc w:val="both"/>
+      </w:pPr>
+      <w:r>
+        <w:t xml:space="preserve">Woche 3: Ein Nein.</w:t>
+      </w:r>
+    </w:p>
+    <w:p>
+      <w:pPr>
+        <w:spacing w:after="71"/>
+      </w:pPr>
+    </w:p>
+    <w:p>
+      <w:pPr>
+        <w:jc w:val="both"/>
+      </w:pPr>
+      <w:r>
+        <w:t xml:space="preserve">Ein einziges. In der ganzen Woche.</w:t>
+      </w:r>
+    </w:p>
+    <w:p>
+      <w:pPr>
+        <w:spacing w:after="71"/>
+      </w:pPr>
+    </w:p>
+    <w:p>
+      <w:pPr>
+        <w:jc w:val="both"/>
+      </w:pPr>
+      <w:r>
+        <w:t xml:space="preserve">Such dir die leichteste Stelle. Nicht deine Mutter. Nicht deinen Chef.</w:t>
+      </w:r>
+    </w:p>
+    <w:p>
+      <w:pPr>
+        <w:spacing w:after="71"/>
+      </w:pPr>
+    </w:p>
+    <w:p>
+      <w:pPr>
+        <w:jc w:val="both"/>
+      </w:pPr>
+      <w:r>
+        <w:t xml:space="preserve">Die Kollegin mit der Sammelbestellung. Die Einladung, auf die du keine Lust hast. Der Anruf, der warten kann.</w:t>
+      </w:r>
+    </w:p>
+    <w:p>
+      <w:pPr>
+        <w:spacing w:after="71"/>
+      </w:pPr>
+    </w:p>
+    <w:p>
+      <w:pPr>
+        <w:jc w:val="both"/>
+      </w:pPr>
+      <w:r>
+        <w:t xml:space="preserve">Sag den Satz aus Kapitel 13. Und wenn nachgefragt wird, den aus Kapitel 14.</w:t>
+      </w:r>
+    </w:p>
+    <w:p>
+      <w:pPr>
+        <w:spacing w:after="71"/>
+      </w:pPr>
+    </w:p>
+    <w:p>
+      <w:pPr>
+        <w:jc w:val="both"/>
+      </w:pPr>
+      <w:r>
+        <w:t xml:space="preserve">Dann schau, was in dir passiert. Nicht bei den anderen. Bei dir.</w:t>
+      </w:r>
+    </w:p>
+    <w:p>
+      <w:pPr>
+        <w:spacing w:after="71"/>
+      </w:pPr>
+    </w:p>
+    <w:p>
+      <w:pPr>
+        <w:jc w:val="both"/>
+      </w:pPr>
+      <w:r>
+        <w:t xml:space="preserve">Wie lange bleibt das schlechte Gewissen? Zwanzig Minuten? Zwei Stunden?</w:t>
+      </w:r>
+    </w:p>
+    <w:p>
+      <w:pPr>
+        <w:spacing w:after="71"/>
+      </w:pPr>
+    </w:p>
+    <w:p>
+      <w:pPr>
+        <w:jc w:val="both"/>
+      </w:pPr>
+      <w:r>
+        <w:t xml:space="preserve">Miss es. Denn beim nächsten Mal ist es kürzer, und das wirst du nur merken, wenn du es beim ersten Mal gemessen hast.</w:t>
+      </w:r>
+    </w:p>
+    <w:p>
+      <w:pPr>
+        <w:spacing w:after="71"/>
+      </w:pPr>
+    </w:p>
+    <w:p>
+      <w:pPr>
+        <w:jc w:val="both"/>
+      </w:pPr>
+      <w:r>
+        <w:t xml:space="preserve">Woche 4: Eine Bitte.</w:t>
+      </w:r>
+    </w:p>
+    <w:p>
+      <w:pPr>
+        <w:spacing w:after="71"/>
+      </w:pPr>
+    </w:p>
+    <w:p>
+      <w:pPr>
+        <w:jc w:val="both"/>
+      </w:pPr>
+      <w:r>
+        <w:t xml:space="preserve">Die schwerste Woche.</w:t>
+      </w:r>
+    </w:p>
+    <w:p>
+      <w:pPr>
+        <w:spacing w:after="71"/>
+      </w:pPr>
+    </w:p>
+    <w:p>
+      <w:pPr>
+        <w:jc w:val="both"/>
+      </w:pPr>
+      <w:r>
+        <w:t xml:space="preserve">Bitte einen Menschen um eine Sache. Etwas Kleines.</w:t>
+      </w:r>
+    </w:p>
+    <w:p>
+      <w:pPr>
+        <w:spacing w:after="71"/>
+      </w:pPr>
+    </w:p>
+    <w:p>
+      <w:pPr>
+        <w:jc w:val="both"/>
+      </w:pPr>
+      <w:r>
+        <w:t xml:space="preserve">Ein Satz. Kein Vorbau, kein „nur wenn es dir wirklich nichts ausmacht".</w:t>
+      </w:r>
+    </w:p>
+    <w:p>
+      <w:pPr>
+        <w:spacing w:after="71"/>
+      </w:pPr>
+    </w:p>
+    <w:p>
+      <w:pPr>
+        <w:jc w:val="both"/>
+      </w:pPr>
+      <w:r>
+        <w:t xml:space="preserve">Und wenn die Hilfe kommt: nimm sie an und gib nichts zurück.</w:t>
+      </w:r>
+    </w:p>
+    <w:p>
+      <w:pPr>
+        <w:jc w:val="both"/>
+      </w:pPr>
+      <w:r>
+        <w:t xml:space="preserve">Kein Kuchen. Kein Ausgleich. Nur danke.</w:t>
+      </w:r>
+    </w:p>
+    <w:p>
+      <w:pPr>
+        <w:spacing w:after="71"/>
+      </w:pPr>
+    </w:p>
+    <w:p>
+      <w:pPr>
+        <w:jc w:val="both"/>
+      </w:pPr>
+      <w:r>
+        <w:t xml:space="preserve">Das wird sich falsch anfühlen. Das gehört dazu.</w:t>
+      </w:r>
+    </w:p>
+    <w:p>
+      <w:pPr>
+        <w:spacing w:after="71"/>
+      </w:pPr>
+    </w:p>
+    <w:p>
+      <w:pPr>
+        <w:jc w:val="both"/>
+      </w:pPr>
+      <w:r>
+        <w:t xml:space="preserve">Was am Ende zählt:</w:t>
+      </w:r>
+    </w:p>
+    <w:p>
+      <w:pPr>
+        <w:spacing w:after="71"/>
+      </w:pPr>
+    </w:p>
+    <w:p>
+      <w:pPr>
+        <w:jc w:val="both"/>
+      </w:pPr>
+      <w:r>
+        <w:t xml:space="preserve">Nach vier Wochen bist du nicht verwandelt.</w:t>
+      </w:r>
+    </w:p>
+    <w:p>
+      <w:pPr>
+        <w:spacing w:after="71"/>
+      </w:pPr>
+    </w:p>
+    <w:p>
+      <w:pPr>
+        <w:jc w:val="both"/>
+      </w:pPr>
+      <w:r>
+        <w:t xml:space="preserve">Du hast eine Zahl, die dich erschreckt hat.</w:t>
+      </w:r>
+    </w:p>
+    <w:p>
+      <w:pPr>
+        <w:jc w:val="both"/>
+      </w:pPr>
+      <w:r>
+        <w:t xml:space="preserve">Vier Wochen mit einer kleinen Sache für dich.</w:t>
+      </w:r>
+    </w:p>
+    <w:p>
+      <w:pPr>
+        <w:jc w:val="both"/>
+      </w:pPr>
+      <w:r>
+        <w:t xml:space="preserve">Ein Nein, das du überlebt hast.</w:t>
+      </w:r>
+    </w:p>
+    <w:p>
+      <w:pPr>
+        <w:jc w:val="both"/>
+      </w:pPr>
+      <w:r>
+        <w:t xml:space="preserve">Eine Bitte, die jemand erfüllt hat.</w:t>
+      </w:r>
+    </w:p>
+    <w:p>
+      <w:pPr>
+        <w:spacing w:after="71"/>
+      </w:pPr>
+    </w:p>
+    <w:p>
+      <w:pPr>
+        <w:jc w:val="both"/>
+      </w:pPr>
+      <w:r>
+        <w:t xml:space="preserve">Das klingt nach wenig.</w:t>
+      </w:r>
+    </w:p>
+    <w:p>
+      <w:pPr>
+        <w:spacing w:after="71"/>
+      </w:pPr>
+    </w:p>
+    <w:p>
+      <w:pPr>
+        <w:jc w:val="both"/>
+      </w:pPr>
+      <w:r>
+        <w:t xml:space="preserve">Es ist mehr, als du in den letzten zehn Jahren für dich getan hast.</w:t>
+      </w:r>
+    </w:p>
+    <w:p>
+      <w:pPr>
+        <w:spacing w:after="71"/>
+      </w:pPr>
+    </w:p>
+    <w:p>
+      <w:pPr>
+        <w:jc w:val="both"/>
+      </w:pPr>
+      <w:r>
+        <w:t xml:space="preserve">Und der Beweis, den dein Kopf braucht: Es geht. Ohne dass alles zusammenbricht.</w:t>
+      </w:r>
+    </w:p>
+    <w:p>
+      <w:pPr>
+        <w:spacing w:after="71"/>
+      </w:pPr>
     </w:p>
     <w:p>
       <w:pPr>
@@ -12304,64 +13647,24 @@
           <w:i/>
           <w:sz w:val="21"/>
         </w:rPr>
-        <w:t>Wessen Enttäuschung fürchtest du am meisten?</w:t>
-      </w:r>
-      <w:r>
+        <w:t xml:space="preserve">Wann fängst du an?</w:t>
         <w:br/>
-      </w:r>
-      <w:r>
+        <w:t xml:space="preserve"/>
         <w:br/>
-      </w:r>
-      <w:r>
-        <w:rPr>
-          <w:i/>
-          <w:sz w:val="21"/>
-        </w:rPr>
-        <w:t>Was würde wirklich passieren wenn diese Person enttäuscht wäre?</w:t>
-      </w:r>
-      <w:r>
+        <w:t xml:space="preserve">Nicht „bald". Nicht „wenn es ruhiger wird".</w:t>
         <w:br/>
-      </w:r>
-      <w:r>
+        <w:t xml:space="preserve">Es wird nicht ruhiger. Das weisst du.</w:t>
         <w:br/>
-      </w:r>
-      <w:r>
-        <w:rPr>
-          <w:i/>
-          <w:sz w:val="21"/>
-        </w:rPr>
-        <w:t>Ist die Beziehung stabil genug um das zu tragen?</w:t>
-      </w:r>
-      <w:r>
+        <w:t xml:space="preserve"/>
         <w:br/>
-      </w:r>
-      <w:r>
-        <w:rPr>
-          <w:i/>
-          <w:sz w:val="21"/>
-        </w:rPr>
-        <w:t>Wenn ja: Das Nein ist sicherer als du denkst.</w:t>
-      </w:r>
-      <w:r>
+        <w:t xml:space="preserve">Schreib ein Datum auf. Am besten das von morgen.</w:t>
         <w:br/>
-      </w:r>
-      <w:r>
-        <w:rPr>
-          <w:i/>
-          <w:sz w:val="21"/>
-        </w:rPr>
-        <w:t>Wenn nein: Das ist eine wichtige Information.</w:t>
-      </w:r>
-    </w:p>
-    <w:p>
-      <w:r>
-        <w:br w:type="page"/>
-      </w:r>
-    </w:p>
-    <w:p>
-      <w:pPr>
-        <w:spacing w:after="992"/>
-      </w:pPr>
+        <w:t xml:space="preserve"/>
+        <w:br/>
+        <w:t xml:space="preserve">Und schreib daneben, was in Woche 3 dein leichtestes Nein ist.</w:t>
+        <w:br/>
+        <w:t xml:space="preserve">Du hast schon eins im Kopf.</w:t>
+      </w:r>
     </w:p>
     <w:p>
       <w:pPr>
@@ -12420,6 +13723,18 @@
         <w:rPr>
           <w:sz w:val="22"/>
         </w:rPr>
+        <w:t>Wenn du wieder funktionierst</w:t>
+      </w:r>
+    </w:p>
+    <w:p>
+      <w:pPr>
+        <w:spacing w:after="60"/>
+        <w:jc w:val="center"/>
+      </w:pPr>
+      <w:r>
+        <w:rPr>
+          <w:sz w:val="22"/>
+        </w:rPr>
         <w:t>Ich bin so müde. Und ich erlaube mir, es zu sein</w:t>
       </w:r>
     </w:p>
@@ -12446,8 +13761,7 @@
           <w:color w:val="000000"/>
           <w:sz w:val="28"/>
         </w:rPr>
-        <w:lastRenderedPageBreak/>
-        <w:t>Kapitel 16: Wenn du wieder funktionierst</w:t>
+        <w:t>Kapitel 18: Wenn du wieder funktionierst</w:t>
       </w:r>
       <w:bookmarkEnd w:id="22"/>
     </w:p>
@@ -12948,6 +14262,175 @@
         <w:jc w:val="both"/>
       </w:pPr>
       <w:r>
+        <w:t xml:space="preserve">Claudia hat mir im vierten Monat geschrieben.</w:t>
+      </w:r>
+    </w:p>
+    <w:p>
+      <w:pPr>
+        <w:spacing w:after="71"/>
+      </w:pPr>
+    </w:p>
+    <w:p>
+      <w:pPr>
+        <w:jc w:val="both"/>
+      </w:pPr>
+      <w:r>
+        <w:t xml:space="preserve">Ihre Mutter war gestürzt. Drei Wochen Klinik, danach Reha.</w:t>
+      </w:r>
+    </w:p>
+    <w:p>
+      <w:pPr>
+        <w:spacing w:after="71"/>
+      </w:pPr>
+    </w:p>
+    <w:p>
+      <w:pPr>
+        <w:jc w:val="both"/>
+      </w:pPr>
+      <w:r>
+        <w:t xml:space="preserve">„Ich bin wieder komplett drin. Ich funktioniere nur noch."</w:t>
+      </w:r>
+    </w:p>
+    <w:p>
+      <w:pPr>
+        <w:spacing w:after="71"/>
+      </w:pPr>
+    </w:p>
+    <w:p>
+      <w:pPr>
+        <w:jc w:val="both"/>
+      </w:pPr>
+      <w:r>
+        <w:t xml:space="preserve">Ich habe sie gefragt, wann sie es bemerkt hat.</w:t>
+      </w:r>
+    </w:p>
+    <w:p>
+      <w:pPr>
+        <w:spacing w:after="71"/>
+      </w:pPr>
+    </w:p>
+    <w:p>
+      <w:pPr>
+        <w:jc w:val="both"/>
+      </w:pPr>
+      <w:r>
+        <w:t xml:space="preserve">„Nach neun Tagen. Ich stand im Treppenhaus und wusste plötzlich wieder, wie sich das anfühlt."</w:t>
+      </w:r>
+    </w:p>
+    <w:p>
+      <w:pPr>
+        <w:spacing w:after="71"/>
+      </w:pPr>
+    </w:p>
+    <w:p>
+      <w:pPr>
+        <w:jc w:val="both"/>
+      </w:pPr>
+      <w:r>
+        <w:t xml:space="preserve">Und im Jahr davor?</w:t>
+      </w:r>
+    </w:p>
+    <w:p>
+      <w:pPr>
+        <w:spacing w:after="71"/>
+      </w:pPr>
+    </w:p>
+    <w:p>
+      <w:pPr>
+        <w:jc w:val="both"/>
+      </w:pPr>
+      <w:r>
+        <w:t xml:space="preserve">„Da hätte ich das gar nicht bemerkt. Da wäre das einfach mein Leben gewesen."</w:t>
+      </w:r>
+    </w:p>
+    <w:p>
+      <w:pPr>
+        <w:spacing w:after="71"/>
+      </w:pPr>
+    </w:p>
+    <w:p>
+      <w:pPr>
+        <w:jc w:val="both"/>
+      </w:pPr>
+      <w:r>
+        <w:t xml:space="preserve">Sie hat nichts an der Situation geändert. Ihre Mutter brauchte Hilfe, das war so.</w:t>
+      </w:r>
+    </w:p>
+    <w:p>
+      <w:pPr>
+        <w:spacing w:after="71"/>
+      </w:pPr>
+    </w:p>
+    <w:p>
+      <w:pPr>
+        <w:jc w:val="both"/>
+      </w:pPr>
+      <w:r>
+        <w:t xml:space="preserve">Aber sie hat zwei Dinge behalten. Den Kaffee im Sitzen. Und einen Satz zu ihrem Bruder:</w:t>
+      </w:r>
+    </w:p>
+    <w:p>
+      <w:pPr>
+        <w:spacing w:after="71"/>
+      </w:pPr>
+    </w:p>
+    <w:p>
+      <w:pPr>
+        <w:jc w:val="both"/>
+      </w:pPr>
+      <w:r>
+        <w:t xml:space="preserve">„Ich kann Dienstag und Freitag. Die anderen Tage musst du übernehmen."</w:t>
+      </w:r>
+    </w:p>
+    <w:p>
+      <w:pPr>
+        <w:spacing w:after="71"/>
+      </w:pPr>
+    </w:p>
+    <w:p>
+      <w:pPr>
+        <w:jc w:val="both"/>
+      </w:pPr>
+      <w:r>
+        <w:t xml:space="preserve">Er hat übernommen.</w:t>
+      </w:r>
+    </w:p>
+    <w:p>
+      <w:pPr>
+        <w:spacing w:after="71"/>
+      </w:pPr>
+    </w:p>
+    <w:p>
+      <w:pPr>
+        <w:jc w:val="both"/>
+      </w:pPr>
+      <w:r>
+        <w:t xml:space="preserve">Das ist kein Happy End. Das ist eine Frau, die im Ausnahmezustand zwei Dinge für sich behalten hat.</w:t>
+      </w:r>
+    </w:p>
+    <w:p>
+      <w:pPr>
+        <w:spacing w:after="71"/>
+      </w:pPr>
+    </w:p>
+    <w:p>
+      <w:pPr>
+        <w:jc w:val="both"/>
+      </w:pPr>
+      <w:r>
+        <w:t xml:space="preserve">Vor einem Jahr wären es null gewesen.</w:t>
+      </w:r>
+    </w:p>
+    <w:p>
+      <w:pPr>
+        <w:spacing w:after="71"/>
+      </w:pPr>
+    </w:p>
+    <w:p>
+      <w:pPr>
+        <w:jc w:val="both"/>
+      </w:pPr>
+      <w:r>
         <w:t>Es gibt Anzeichen. Lern sie.</w:t>
       </w:r>
     </w:p>
@@ -13260,8 +14743,7 @@
           <w:color w:val="000000"/>
           <w:sz w:val="28"/>
         </w:rPr>
-        <w:lastRenderedPageBreak/>
-        <w:t>Kapitel 17: Ich bin so müde. Und ich erlaube mir, es zu sein</w:t>
+        <w:t>Kapitel 19: Ich bin so müde. Und ich erlaube mir, es zu sein</w:t>
       </w:r>
       <w:bookmarkEnd w:id="23"/>
     </w:p>
@@ -13289,7 +14771,7 @@
           <w:b/>
           <w:i/>
         </w:rPr>
-        <w:t>„Erschöpft zu sein ist keine Schwäche. Es ist die ehrlichste Wahrheit die du über dich kennst."</w:t>
+        <w:t>„Wer bist du, wenn niemand etwas von dir braucht? Diese Frage hat dir noch nie jemand gestellt."</w:t>
       </w:r>
     </w:p>
     <w:p>

</xml_diff>

<commit_message>
Buch 6: Alleinstellungsmerkmal - Selbsttest, Notfall-Seiten, Satz-Sammlung. Buch-Standard fuer kuenftige Buecher festgehalten
</commit_message>
<xml_diff>
--- a/outputs/buch6/buch6-MANUSKRIPT.docx
+++ b/outputs/buch6/buch6-MANUSKRIPT.docx
@@ -2642,6 +2642,791 @@
       </w:pPr>
     </w:p>
     <w:p>
+      <w:r>
+        <w:br w:type="page"/>
+      </w:r>
+    </w:p>
+    <w:p>
+      <w:pPr>
+        <w:pStyle w:val="berschrift1"/>
+      </w:pPr>
+      <w:bookmarkStart w:id="0" w:name="_Toc235888462"/>
+      <w:r>
+        <w:rPr>
+          <w:rFonts w:ascii="Times New Roman" w:hAnsi="Times New Roman"/>
+          <w:color w:val="000000"/>
+        </w:rPr>
+        <w:lastRenderedPageBreak/>
+        <w:t xml:space="preserve">Wo stehst du gerade?</w:t>
+      </w:r>
+      <w:bookmarkEnd w:id="0"/>
+    </w:p>
+    <w:p>
+      <w:pPr>
+        <w:jc w:val="both"/>
+      </w:pPr>
+      <w:r>
+        <w:t xml:space="preserve">Bevor du anfängst, zwei Minuten für dich.</w:t>
+      </w:r>
+    </w:p>
+    <w:p>
+      <w:pPr>
+        <w:spacing w:after="71"/>
+      </w:pPr>
+    </w:p>
+    <w:p>
+      <w:pPr>
+        <w:jc w:val="both"/>
+      </w:pPr>
+      <w:r>
+        <w:t xml:space="preserve">Unten stehen zwölf Sätze. Lies sie langsam.</w:t>
+      </w:r>
+    </w:p>
+    <w:p>
+      <w:pPr>
+        <w:jc w:val="both"/>
+      </w:pPr>
+      <w:r>
+        <w:t xml:space="preserve">Schreib die Nummern auf, die auf dich zutreffen. Nicht ungefähr. Wirklich.</w:t>
+      </w:r>
+    </w:p>
+    <w:p>
+      <w:pPr>
+        <w:spacing w:after="71"/>
+      </w:pPr>
+    </w:p>
+    <w:p>
+      <w:pPr>
+        <w:jc w:val="both"/>
+      </w:pPr>
+      <w:r>
+        <w:t xml:space="preserve">Niemand sieht das ausser dir.</w:t>
+      </w:r>
+    </w:p>
+    <w:p>
+      <w:pPr>
+        <w:spacing w:after="71"/>
+      </w:pPr>
+    </w:p>
+    <w:p>
+      <w:pPr>
+        <w:jc w:val="both"/>
+      </w:pPr>
+      <w:r>
+        <w:rPr>
+          <w:b/>
+        </w:rPr>
+        <w:t xml:space="preserve">Erster Teil</w:t>
+      </w:r>
+    </w:p>
+    <w:p>
+      <w:pPr>
+        <w:spacing w:after="71"/>
+      </w:pPr>
+    </w:p>
+    <w:p>
+      <w:pPr>
+        <w:jc w:val="both"/>
+      </w:pPr>
+      <w:r>
+        <w:t xml:space="preserve">1. Ich sage Ja, obwohl ich innerlich Nein denke.</w:t>
+      </w:r>
+    </w:p>
+    <w:p>
+      <w:pPr>
+        <w:jc w:val="both"/>
+      </w:pPr>
+      <w:r>
+        <w:t xml:space="preserve">2. Ich schlafe genug und bin trotzdem müde.</w:t>
+      </w:r>
+    </w:p>
+    <w:p>
+      <w:pPr>
+        <w:jc w:val="both"/>
+      </w:pPr>
+      <w:r>
+        <w:t xml:space="preserve">3. Ich kann mich nicht erinnern, wann ich zuletzt etwas nur für mich getan habe.</w:t>
+      </w:r>
+    </w:p>
+    <w:p>
+      <w:pPr>
+        <w:jc w:val="both"/>
+      </w:pPr>
+      <w:r>
+        <w:t xml:space="preserve">4. Ich funktioniere. Aber ich lebe nicht.</w:t>
+      </w:r>
+    </w:p>
+    <w:p>
+      <w:pPr>
+        <w:spacing w:after="71"/>
+      </w:pPr>
+    </w:p>
+    <w:p>
+      <w:pPr>
+        <w:jc w:val="both"/>
+      </w:pPr>
+      <w:r>
+        <w:rPr>
+          <w:b/>
+        </w:rPr>
+        <w:t xml:space="preserve">Zweiter Teil</w:t>
+      </w:r>
+    </w:p>
+    <w:p>
+      <w:pPr>
+        <w:spacing w:after="71"/>
+      </w:pPr>
+    </w:p>
+    <w:p>
+      <w:pPr>
+        <w:jc w:val="both"/>
+      </w:pPr>
+      <w:r>
+        <w:t xml:space="preserve">5. Niemand fragt mich, wie es mir wirklich geht.</w:t>
+      </w:r>
+    </w:p>
+    <w:p>
+      <w:pPr>
+        <w:jc w:val="both"/>
+      </w:pPr>
+      <w:r>
+        <w:t xml:space="preserve">6. Ich weine an Orten, an denen mich niemand sieht.</w:t>
+      </w:r>
+    </w:p>
+    <w:p>
+      <w:pPr>
+        <w:jc w:val="both"/>
+      </w:pPr>
+      <w:r>
+        <w:t xml:space="preserve">7. Ich mache Dinge selbst, weil bitten sich schlimmer anfühlt als tragen.</w:t>
+      </w:r>
+    </w:p>
+    <w:p>
+      <w:pPr>
+        <w:jc w:val="both"/>
+      </w:pPr>
+      <w:r>
+        <w:t xml:space="preserve">8. Stark sein habe ich nicht gewählt. Es war einfach so.</w:t>
+      </w:r>
+    </w:p>
+    <w:p>
+      <w:pPr>
+        <w:spacing w:after="71"/>
+      </w:pPr>
+    </w:p>
+    <w:p>
+      <w:pPr>
+        <w:jc w:val="both"/>
+      </w:pPr>
+      <w:r>
+        <w:rPr>
+          <w:b/>
+        </w:rPr>
+        <w:t xml:space="preserve">Dritter Teil</w:t>
+      </w:r>
+    </w:p>
+    <w:p>
+      <w:pPr>
+        <w:spacing w:after="71"/>
+      </w:pPr>
+    </w:p>
+    <w:p>
+      <w:pPr>
+        <w:jc w:val="both"/>
+      </w:pPr>
+      <w:r>
+        <w:t xml:space="preserve">9. Wenn ich absage, habe ich sofort ein schlechtes Gewissen.</w:t>
+      </w:r>
+    </w:p>
+    <w:p>
+      <w:pPr>
+        <w:jc w:val="both"/>
+      </w:pPr>
+      <w:r>
+        <w:t xml:space="preserve">10. Ich erkläre mich ständig.</w:t>
+      </w:r>
+    </w:p>
+    <w:p>
+      <w:pPr>
+        <w:jc w:val="both"/>
+      </w:pPr>
+      <w:r>
+        <w:t xml:space="preserve">11. Wenn jemand enttäuscht ist, rudere ich zurück.</w:t>
+      </w:r>
+    </w:p>
+    <w:p>
+      <w:pPr>
+        <w:jc w:val="both"/>
+      </w:pPr>
+      <w:r>
+        <w:t xml:space="preserve">12. Ich weiss nicht, wer ich bin, wenn niemand etwas von mir braucht.</w:t>
+      </w:r>
+    </w:p>
+    <w:p>
+      <w:pPr>
+        <w:spacing w:after="71"/>
+      </w:pPr>
+    </w:p>
+    <w:p>
+      <w:pPr>
+        <w:jc w:val="both"/>
+      </w:pPr>
+      <w:r>
+        <w:rPr>
+          <w:b/>
+        </w:rPr>
+        <w:t xml:space="preserve">Und jetzt zähl.</w:t>
+      </w:r>
+    </w:p>
+    <w:p>
+      <w:pPr>
+        <w:spacing w:after="71"/>
+      </w:pPr>
+    </w:p>
+    <w:p>
+      <w:pPr>
+        <w:jc w:val="both"/>
+      </w:pPr>
+      <w:r>
+        <w:t xml:space="preserve">Wo du die meisten Nummern hast, da liegt dein Thema.</w:t>
+      </w:r>
+    </w:p>
+    <w:p>
+      <w:pPr>
+        <w:spacing w:after="71"/>
+      </w:pPr>
+    </w:p>
+    <w:p>
+      <w:pPr>
+        <w:jc w:val="both"/>
+      </w:pPr>
+      <w:r>
+        <w:t xml:space="preserve">Erster Teil: Du siehst dich selbst gerade kaum. Fang bei Schritt 1 an.</w:t>
+      </w:r>
+    </w:p>
+    <w:p>
+      <w:pPr>
+        <w:jc w:val="both"/>
+      </w:pPr>
+      <w:r>
+        <w:t xml:space="preserve">Zweiter Teil: Du spürst es, weisst aber nicht, woher es kommt. Schritt 2 ist deiner.</w:t>
+      </w:r>
+    </w:p>
+    <w:p>
+      <w:pPr>
+        <w:jc w:val="both"/>
+      </w:pPr>
+      <w:r>
+        <w:t xml:space="preserve">Dritter Teil: Du weisst schon viel. Dir fehlen die Sätze. Blätter zu Kapitel 13 und 14.</w:t>
+      </w:r>
+    </w:p>
+    <w:p>
+      <w:pPr>
+        <w:spacing w:after="71"/>
+      </w:pPr>
+    </w:p>
+    <w:p>
+      <w:pPr>
+        <w:jc w:val="both"/>
+      </w:pPr>
+      <w:r>
+        <w:t xml:space="preserve">Wenn überall gleich viel steht: Fang vorne an. Das ist kein Rückschritt.</w:t>
+      </w:r>
+    </w:p>
+    <w:p>
+      <w:pPr>
+        <w:spacing w:after="71"/>
+      </w:pPr>
+    </w:p>
+    <w:p>
+      <w:pPr>
+        <w:jc w:val="both"/>
+      </w:pPr>
+      <w:r>
+        <w:t xml:space="preserve">Und wenn du mehr als acht Nummern aufgeschrieben hast:</w:t>
+      </w:r>
+    </w:p>
+    <w:p>
+      <w:pPr>
+        <w:spacing w:after="71"/>
+      </w:pPr>
+    </w:p>
+    <w:p>
+      <w:pPr>
+        <w:jc w:val="both"/>
+      </w:pPr>
+      <w:r>
+        <w:t xml:space="preserve">Dann bist du nicht empfindlich.</w:t>
+      </w:r>
+    </w:p>
+    <w:p>
+      <w:pPr>
+        <w:jc w:val="both"/>
+      </w:pPr>
+      <w:r>
+        <w:t xml:space="preserve">Dann trägst du seit Jahren zu viel.</w:t>
+      </w:r>
+    </w:p>
+    <w:p>
+      <w:pPr>
+        <w:spacing w:after="71"/>
+      </w:pPr>
+    </w:p>
+    <w:p>
+      <w:pPr>
+        <w:jc w:val="both"/>
+      </w:pPr>
+      <w:r>
+        <w:t xml:space="preserve">Und dieses Buch ist genau für dich geschrieben.</w:t>
+      </w:r>
+    </w:p>
+    <w:p>
+      <w:pPr>
+        <w:spacing w:after="71"/>
+      </w:pPr>
+    </w:p>
+    <w:p>
+      <w:r>
+        <w:br w:type="page"/>
+      </w:r>
+    </w:p>
+    <w:p>
+      <w:pPr>
+        <w:pStyle w:val="berschrift1"/>
+      </w:pPr>
+      <w:bookmarkStart w:id="0" w:name="_Toc235888462"/>
+      <w:r>
+        <w:rPr>
+          <w:rFonts w:ascii="Times New Roman" w:hAnsi="Times New Roman"/>
+          <w:color w:val="000000"/>
+        </w:rPr>
+        <w:lastRenderedPageBreak/>
+        <w:t xml:space="preserve">Wenn du heute nicht kannst</w:t>
+      </w:r>
+      <w:bookmarkEnd w:id="0"/>
+    </w:p>
+    <w:p>
+      <w:pPr>
+        <w:shd w:val="clear" w:color="auto" w:fill="F0F0F0"/>
+        <w:spacing w:before="160" w:after="280"/>
+        <w:ind w:left="283" w:right="283"/>
+        <w:jc w:val="center"/>
+      </w:pPr>
+      <w:r>
+        <w:rPr>
+          <w:b/>
+          <w:i/>
+        </w:rPr>
+        <w:t xml:space="preserve">„Es gibt Tage, an denen du nicht mal ein Buch lesen kannst. Diese Seite ist für genau die."</w:t>
+      </w:r>
+    </w:p>
+    <w:p>
+      <w:pPr>
+        <w:jc w:val="both"/>
+      </w:pPr>
+      <w:r>
+        <w:t xml:space="preserve">Dieses Buch wird Dinge von dir verlangen.</w:t>
+      </w:r>
+    </w:p>
+    <w:p>
+      <w:pPr>
+        <w:jc w:val="both"/>
+      </w:pPr>
+      <w:r>
+        <w:t xml:space="preserve">Nachdenken. Aufschreiben. Etwas anders machen.</w:t>
+      </w:r>
+    </w:p>
+    <w:p>
+      <w:pPr>
+        <w:spacing w:after="71"/>
+      </w:pPr>
+    </w:p>
+    <w:p>
+      <w:pPr>
+        <w:jc w:val="both"/>
+      </w:pPr>
+      <w:r>
+        <w:t xml:space="preserve">Es gibt Tage, an denen du davon nichts kannst.</w:t>
+      </w:r>
+    </w:p>
+    <w:p>
+      <w:pPr>
+        <w:spacing w:after="71"/>
+      </w:pPr>
+    </w:p>
+    <w:p>
+      <w:pPr>
+        <w:jc w:val="both"/>
+      </w:pPr>
+      <w:r>
+        <w:t xml:space="preserve">Für die ist diese Seite da.</w:t>
+      </w:r>
+    </w:p>
+    <w:p>
+      <w:pPr>
+        <w:spacing w:after="71"/>
+      </w:pPr>
+    </w:p>
+    <w:p>
+      <w:pPr>
+        <w:jc w:val="both"/>
+      </w:pPr>
+      <w:r>
+        <w:t xml:space="preserve">Du musst heute nichts weiterlesen. Such dir aus, was gerade passt, mach diese eine Sache, und leg das Buch weg.</w:t>
+      </w:r>
+    </w:p>
+    <w:p>
+      <w:pPr>
+        <w:spacing w:after="71"/>
+      </w:pPr>
+    </w:p>
+    <w:p>
+      <w:pPr>
+        <w:jc w:val="both"/>
+      </w:pPr>
+      <w:r>
+        <w:rPr>
+          <w:b/>
+        </w:rPr>
+        <w:t xml:space="preserve">Es ist drei Uhr nachts und du bist wach.</w:t>
+      </w:r>
+    </w:p>
+    <w:p>
+      <w:pPr>
+        <w:spacing w:after="71"/>
+      </w:pPr>
+    </w:p>
+    <w:p>
+      <w:pPr>
+        <w:jc w:val="both"/>
+      </w:pPr>
+      <w:r>
+        <w:t xml:space="preserve">Steh nicht auf. Mach kein Licht. Nimm nicht das Handy.</w:t>
+      </w:r>
+    </w:p>
+    <w:p>
+      <w:pPr>
+        <w:spacing w:after="71"/>
+      </w:pPr>
+    </w:p>
+    <w:p>
+      <w:pPr>
+        <w:jc w:val="both"/>
+      </w:pPr>
+      <w:r>
+        <w:t xml:space="preserve">Leg eine Hand auf deinen Bauch und atme so aus, dass es länger dauert als das Einatmen.</w:t>
+      </w:r>
+    </w:p>
+    <w:p>
+      <w:pPr>
+        <w:jc w:val="both"/>
+      </w:pPr>
+      <w:r>
+        <w:t xml:space="preserve">Zähl beim Ausatmen bis sechs. Zehnmal.</w:t>
+      </w:r>
+    </w:p>
+    <w:p>
+      <w:pPr>
+        <w:spacing w:after="71"/>
+      </w:pPr>
+    </w:p>
+    <w:p>
+      <w:pPr>
+        <w:jc w:val="both"/>
+      </w:pPr>
+      <w:r>
+        <w:t xml:space="preserve">Das löst nichts. Es holt dich nur aus dem Kopf zurück in den Körper.</w:t>
+      </w:r>
+    </w:p>
+    <w:p>
+      <w:pPr>
+        <w:jc w:val="both"/>
+      </w:pPr>
+      <w:r>
+        <w:t xml:space="preserve">Mehr ist um drei Uhr nachts nicht möglich, und das ist in Ordnung.</w:t>
+      </w:r>
+    </w:p>
+    <w:p>
+      <w:pPr>
+        <w:spacing w:after="71"/>
+      </w:pPr>
+    </w:p>
+    <w:p>
+      <w:pPr>
+        <w:jc w:val="both"/>
+      </w:pPr>
+      <w:r>
+        <w:rPr>
+          <w:b/>
+        </w:rPr>
+        <w:t xml:space="preserve">Du sitzt im Auto und kannst nicht reingehen.</w:t>
+      </w:r>
+    </w:p>
+    <w:p>
+      <w:pPr>
+        <w:spacing w:after="71"/>
+      </w:pPr>
+    </w:p>
+    <w:p>
+      <w:pPr>
+        <w:jc w:val="both"/>
+      </w:pPr>
+      <w:r>
+        <w:t xml:space="preserve">Dann geh nicht rein.</w:t>
+      </w:r>
+    </w:p>
+    <w:p>
+      <w:pPr>
+        <w:spacing w:after="71"/>
+      </w:pPr>
+    </w:p>
+    <w:p>
+      <w:pPr>
+        <w:jc w:val="both"/>
+      </w:pPr>
+      <w:r>
+        <w:t xml:space="preserve">Bleib fünf Minuten sitzen. Stell dir keinen Wecker, schau nicht auf die Uhr.</w:t>
+      </w:r>
+    </w:p>
+    <w:p>
+      <w:pPr>
+        <w:spacing w:after="71"/>
+      </w:pPr>
+    </w:p>
+    <w:p>
+      <w:pPr>
+        <w:jc w:val="both"/>
+      </w:pPr>
+      <w:r>
+        <w:t xml:space="preserve">Du musst nichts fühlen und nichts verstehen.</w:t>
+      </w:r>
+    </w:p>
+    <w:p>
+      <w:pPr>
+        <w:jc w:val="both"/>
+      </w:pPr>
+      <w:r>
+        <w:t xml:space="preserve">Du sitzt nur da, und diesmal weisst du, warum du es tust.</w:t>
+      </w:r>
+    </w:p>
+    <w:p>
+      <w:pPr>
+        <w:spacing w:after="71"/>
+      </w:pPr>
+    </w:p>
+    <w:p>
+      <w:pPr>
+        <w:jc w:val="both"/>
+      </w:pPr>
+      <w:r>
+        <w:t xml:space="preserve">Das ist der Unterschied zu gestern.</w:t>
+      </w:r>
+    </w:p>
+    <w:p>
+      <w:pPr>
+        <w:spacing w:after="71"/>
+      </w:pPr>
+    </w:p>
+    <w:p>
+      <w:pPr>
+        <w:jc w:val="both"/>
+      </w:pPr>
+      <w:r>
+        <w:rPr>
+          <w:b/>
+        </w:rPr>
+        <w:t xml:space="preserve">Du musst gleich funktionieren und hast nichts mehr.</w:t>
+      </w:r>
+    </w:p>
+    <w:p>
+      <w:pPr>
+        <w:spacing w:after="71"/>
+      </w:pPr>
+    </w:p>
+    <w:p>
+      <w:pPr>
+        <w:jc w:val="both"/>
+      </w:pPr>
+      <w:r>
+        <w:t xml:space="preserve">Trink ein Glas Wasser im Stehen. Ganz.</w:t>
+      </w:r>
+    </w:p>
+    <w:p>
+      <w:pPr>
+        <w:spacing w:after="71"/>
+      </w:pPr>
+    </w:p>
+    <w:p>
+      <w:pPr>
+        <w:jc w:val="both"/>
+      </w:pPr>
+      <w:r>
+        <w:t xml:space="preserve">Dann sag laut, auch wenn niemand da ist:</w:t>
+      </w:r>
+    </w:p>
+    <w:p>
+      <w:pPr>
+        <w:spacing w:after="71"/>
+      </w:pPr>
+    </w:p>
+    <w:p>
+      <w:pPr>
+        <w:jc w:val="both"/>
+      </w:pPr>
+      <w:r>
+        <w:t xml:space="preserve">Ich mache jetzt das Nötigste. Nicht mehr.</w:t>
+      </w:r>
+    </w:p>
+    <w:p>
+      <w:pPr>
+        <w:spacing w:after="71"/>
+      </w:pPr>
+    </w:p>
+    <w:p>
+      <w:pPr>
+        <w:jc w:val="both"/>
+      </w:pPr>
+      <w:r>
+        <w:t xml:space="preserve">Und dann mach wirklich nur das Nötigste.</w:t>
+      </w:r>
+    </w:p>
+    <w:p>
+      <w:pPr>
+        <w:jc w:val="both"/>
+      </w:pPr>
+      <w:r>
+        <w:t xml:space="preserve">Nicht zusätzlich aufräumen. Nicht noch schnell etwas erledigen.</w:t>
+      </w:r>
+    </w:p>
+    <w:p>
+      <w:pPr>
+        <w:spacing w:after="71"/>
+      </w:pPr>
+    </w:p>
+    <w:p>
+      <w:pPr>
+        <w:jc w:val="both"/>
+      </w:pPr>
+      <w:r>
+        <w:t xml:space="preserve">Das Nötigste ist heute genug.</w:t>
+      </w:r>
+    </w:p>
+    <w:p>
+      <w:pPr>
+        <w:spacing w:after="71"/>
+      </w:pPr>
+    </w:p>
+    <w:p>
+      <w:pPr>
+        <w:jc w:val="both"/>
+      </w:pPr>
+      <w:r>
+        <w:rPr>
+          <w:b/>
+        </w:rPr>
+        <w:t xml:space="preserve">Du hast alles gelesen und schaffst trotzdem nichts.</w:t>
+      </w:r>
+    </w:p>
+    <w:p>
+      <w:pPr>
+        <w:spacing w:after="71"/>
+      </w:pPr>
+    </w:p>
+    <w:p>
+      <w:pPr>
+        <w:jc w:val="both"/>
+      </w:pPr>
+      <w:r>
+        <w:t xml:space="preserve">Dann bist du nicht gescheitert. Du bist müde.</w:t>
+      </w:r>
+    </w:p>
+    <w:p>
+      <w:pPr>
+        <w:spacing w:after="71"/>
+      </w:pPr>
+    </w:p>
+    <w:p>
+      <w:pPr>
+        <w:jc w:val="both"/>
+      </w:pPr>
+      <w:r>
+        <w:t xml:space="preserve">Nimm dir für heute eine einzige Sache vor, und zwar die kleinste, die dir einfällt.</w:t>
+      </w:r>
+    </w:p>
+    <w:p>
+      <w:pPr>
+        <w:jc w:val="both"/>
+      </w:pPr>
+      <w:r>
+        <w:t xml:space="preserve">Fenster auf. Zehn Minuten hinlegen. Eine Nachricht nicht beantworten.</w:t>
+      </w:r>
+    </w:p>
+    <w:p>
+      <w:pPr>
+        <w:spacing w:after="71"/>
+      </w:pPr>
+    </w:p>
+    <w:p>
+      <w:pPr>
+        <w:jc w:val="both"/>
+      </w:pPr>
+      <w:r>
+        <w:t xml:space="preserve">Und streich alles andere. Ohne Verhandlung.</w:t>
+      </w:r>
+    </w:p>
+    <w:p>
+      <w:pPr>
+        <w:spacing w:after="71"/>
+      </w:pPr>
+    </w:p>
+    <w:p>
+      <w:pPr>
+        <w:jc w:val="both"/>
+      </w:pPr>
+      <w:r>
+        <w:t xml:space="preserve">Morgen ist auch noch ein Tag. Dieser Satz ist keine Ausrede, wenn du ihn heute wirklich brauchst.</w:t>
+      </w:r>
+    </w:p>
+    <w:p>
+      <w:pPr>
+        <w:spacing w:after="71"/>
+      </w:pPr>
+    </w:p>
+    <w:p>
+      <w:pPr>
+        <w:jc w:val="both"/>
+      </w:pPr>
+      <w:r>
+        <w:t xml:space="preserve">Ein Buch, das nur an guten Tagen funktioniert, nützt dir nichts.</w:t>
+      </w:r>
+    </w:p>
+    <w:p>
+      <w:pPr>
+        <w:jc w:val="both"/>
+      </w:pPr>
+      <w:r>
+        <w:t xml:space="preserve">Deshalb steht diese Seite so weit vorne.</w:t>
+      </w:r>
+    </w:p>
+    <w:p>
+      <w:pPr>
+        <w:spacing w:after="71"/>
+      </w:pPr>
+    </w:p>
+    <w:p>
+      <w:pPr>
+        <w:jc w:val="both"/>
+      </w:pPr>
+      <w:r>
+        <w:t xml:space="preserve">Knick die Ecke um. Du wirst sie wieder suchen.</w:t>
+      </w:r>
+    </w:p>
+    <w:p>
+      <w:pPr>
+        <w:spacing w:after="71"/>
+      </w:pPr>
+    </w:p>
+    <w:p>
       <w:pPr>
         <w:pStyle w:val="berschrift1"/>
         <w:jc w:val="center"/>
@@ -13540,6 +14325,90 @@
         <w:jc w:val="both"/>
       </w:pPr>
       <w:r>
+        <w:rPr>
+          <w:b/>
+        </w:rPr>
+        <w:t xml:space="preserve">Und wenn selbst das zu viel ist?</w:t>
+      </w:r>
+    </w:p>
+    <w:p>
+      <w:pPr>
+        <w:spacing w:after="71"/>
+      </w:pPr>
+    </w:p>
+    <w:p>
+      <w:pPr>
+        <w:jc w:val="both"/>
+      </w:pPr>
+      <w:r>
+        <w:t xml:space="preserve">Dann machst du nur Woche 1. Vier Wochen lang.</w:t>
+      </w:r>
+    </w:p>
+    <w:p>
+      <w:pPr>
+        <w:spacing w:after="71"/>
+      </w:pPr>
+    </w:p>
+    <w:p>
+      <w:pPr>
+        <w:jc w:val="both"/>
+      </w:pPr>
+      <w:r>
+        <w:t xml:space="preserve">Nur zählen. Nichts ändern.</w:t>
+      </w:r>
+    </w:p>
+    <w:p>
+      <w:pPr>
+        <w:spacing w:after="71"/>
+      </w:pPr>
+    </w:p>
+    <w:p>
+      <w:pPr>
+        <w:jc w:val="both"/>
+      </w:pPr>
+      <w:r>
+        <w:t xml:space="preserve">Das ist kein Rückschritt und keine abgespeckte Version.</w:t>
+      </w:r>
+    </w:p>
+    <w:p>
+      <w:pPr>
+        <w:jc w:val="both"/>
+      </w:pPr>
+      <w:r>
+        <w:t xml:space="preserve">Wer zählt, sieht. Und wer sieht, kann irgendwann wählen.</w:t>
+      </w:r>
+    </w:p>
+    <w:p>
+      <w:pPr>
+        <w:spacing w:after="71"/>
+      </w:pPr>
+    </w:p>
+    <w:p>
+      <w:pPr>
+        <w:jc w:val="both"/>
+      </w:pPr>
+      <w:r>
+        <w:t xml:space="preserve">Es gibt Frauen, bei denen hat dieses Zählen ein halbes Jahr gedauert, bevor das erste Nein kam.</w:t>
+      </w:r>
+    </w:p>
+    <w:p>
+      <w:pPr>
+        <w:jc w:val="both"/>
+      </w:pPr>
+      <w:r>
+        <w:t xml:space="preserve">Es kam trotzdem.</w:t>
+      </w:r>
+    </w:p>
+    <w:p>
+      <w:pPr>
+        <w:spacing w:after="71"/>
+      </w:pPr>
+    </w:p>
+    <w:p>
+      <w:pPr>
+        <w:jc w:val="both"/>
+      </w:pPr>
+      <w:r>
         <w:t xml:space="preserve">Was am Ende zählt:</w:t>
       </w:r>
     </w:p>
@@ -15386,6 +16255,497 @@
     <w:p>
       <w:pPr>
         <w:spacing w:after="170"/>
+      </w:pPr>
+    </w:p>
+    <w:p>
+      <w:r>
+        <w:br w:type="page"/>
+      </w:r>
+    </w:p>
+    <w:p>
+      <w:pPr>
+        <w:pStyle w:val="berschrift1"/>
+      </w:pPr>
+      <w:bookmarkStart w:id="0" w:name="_Toc235888462"/>
+      <w:r>
+        <w:rPr>
+          <w:rFonts w:ascii="Times New Roman" w:hAnsi="Times New Roman"/>
+          <w:color w:val="000000"/>
+        </w:rPr>
+        <w:lastRenderedPageBreak/>
+        <w:t xml:space="preserve">Die Sätze</w:t>
+      </w:r>
+      <w:bookmarkEnd w:id="0"/>
+    </w:p>
+    <w:p>
+      <w:pPr>
+        <w:jc w:val="both"/>
+      </w:pPr>
+      <w:r>
+        <w:t xml:space="preserve">Zum Nachschlagen. Ohne dass du nochmal ein Kapitel lesen musst.</w:t>
+      </w:r>
+    </w:p>
+    <w:p>
+      <w:pPr>
+        <w:spacing w:after="71"/>
+      </w:pPr>
+    </w:p>
+    <w:p>
+      <w:pPr>
+        <w:jc w:val="both"/>
+      </w:pPr>
+      <w:r>
+        <w:t xml:space="preserve">Such die Situation. Nimm den Satz. Sag ihn genau so.</w:t>
+      </w:r>
+    </w:p>
+    <w:p>
+      <w:pPr>
+        <w:spacing w:after="71"/>
+      </w:pPr>
+    </w:p>
+    <w:p>
+      <w:pPr>
+        <w:jc w:val="both"/>
+      </w:pPr>
+      <w:r>
+        <w:rPr>
+          <w:b/>
+        </w:rPr>
+        <w:t xml:space="preserve">Wenn du absagen willst</w:t>
+      </w:r>
+    </w:p>
+    <w:p>
+      <w:pPr>
+        <w:spacing w:after="71"/>
+      </w:pPr>
+    </w:p>
+    <w:p>
+      <w:pPr>
+        <w:jc w:val="both"/>
+      </w:pPr>
+      <w:r>
+        <w:t xml:space="preserve">„Das geht für mich gerade nicht."</w:t>
+      </w:r>
+    </w:p>
+    <w:p>
+      <w:pPr>
+        <w:jc w:val="both"/>
+      </w:pPr>
+      <w:r>
+        <w:t xml:space="preserve">„Es geht diesmal einfach nicht."</w:t>
+      </w:r>
+    </w:p>
+    <w:p>
+      <w:pPr>
+        <w:jc w:val="both"/>
+      </w:pPr>
+      <w:r>
+        <w:t xml:space="preserve">„Ich schaffe das nicht dazu."</w:t>
+      </w:r>
+    </w:p>
+    <w:p>
+      <w:pPr>
+        <w:spacing w:after="71"/>
+      </w:pPr>
+    </w:p>
+    <w:p>
+      <w:pPr>
+        <w:jc w:val="both"/>
+      </w:pPr>
+      <w:r>
+        <w:t xml:space="preserve">Kein Grund dahinter. Kein Aber. Punkt und fertig.</w:t>
+      </w:r>
+    </w:p>
+    <w:p>
+      <w:pPr>
+        <w:spacing w:after="71"/>
+      </w:pPr>
+    </w:p>
+    <w:p>
+      <w:pPr>
+        <w:jc w:val="both"/>
+      </w:pPr>
+      <w:r>
+        <w:rPr>
+          <w:b/>
+        </w:rPr>
+        <w:t xml:space="preserve">Wenn nachgefragt wird, warum</w:t>
+      </w:r>
+    </w:p>
+    <w:p>
+      <w:pPr>
+        <w:spacing w:after="71"/>
+      </w:pPr>
+    </w:p>
+    <w:p>
+      <w:pPr>
+        <w:jc w:val="both"/>
+      </w:pPr>
+      <w:r>
+        <w:t xml:space="preserve">„Es geht diesmal einfach nicht."</w:t>
+      </w:r>
+    </w:p>
+    <w:p>
+      <w:pPr>
+        <w:jc w:val="both"/>
+      </w:pPr>
+      <w:r>
+        <w:t xml:space="preserve">„Ich weiss, es kommt ungelegen. Es geht trotzdem nicht."</w:t>
+      </w:r>
+    </w:p>
+    <w:p>
+      <w:pPr>
+        <w:spacing w:after="71"/>
+      </w:pPr>
+    </w:p>
+    <w:p>
+      <w:pPr>
+        <w:jc w:val="both"/>
+      </w:pPr>
+      <w:r>
+        <w:t xml:space="preserve">Immer derselbe Satz. Ruhig, freundlich, unverändert.</w:t>
+      </w:r>
+    </w:p>
+    <w:p>
+      <w:pPr>
+        <w:spacing w:after="71"/>
+      </w:pPr>
+    </w:p>
+    <w:p>
+      <w:pPr>
+        <w:jc w:val="both"/>
+      </w:pPr>
+      <w:r>
+        <w:rPr>
+          <w:b/>
+        </w:rPr>
+        <w:t xml:space="preserve">Wenn jemand dich an seine Verdienste erinnert</w:t>
+      </w:r>
+    </w:p>
+    <w:p>
+      <w:pPr>
+        <w:spacing w:after="71"/>
+      </w:pPr>
+    </w:p>
+    <w:p>
+      <w:pPr>
+        <w:jc w:val="both"/>
+      </w:pPr>
+      <w:r>
+        <w:t xml:space="preserve">„Das stimmt, und ich bin dir dankbar dafür. Diesmal geht es trotzdem nicht."</w:t>
+      </w:r>
+    </w:p>
+    <w:p>
+      <w:pPr>
+        <w:spacing w:after="71"/>
+      </w:pPr>
+    </w:p>
+    <w:p>
+      <w:pPr>
+        <w:jc w:val="both"/>
+      </w:pPr>
+      <w:r>
+        <w:rPr>
+          <w:b/>
+        </w:rPr>
+        <w:t xml:space="preserve">Wenn jemand beleidigt schweigt</w:t>
+      </w:r>
+    </w:p>
+    <w:p>
+      <w:pPr>
+        <w:spacing w:after="71"/>
+      </w:pPr>
+    </w:p>
+    <w:p>
+      <w:pPr>
+        <w:jc w:val="both"/>
+      </w:pPr>
+      <w:r>
+        <w:t xml:space="preserve">Gar nichts sagen.</w:t>
+      </w:r>
+    </w:p>
+    <w:p>
+      <w:pPr>
+        <w:jc w:val="both"/>
+      </w:pPr>
+      <w:r>
+        <w:t xml:space="preserve">Nicht fragen, ob alles in Ordnung ist. Freundlich bleiben, normal weitermachen.</w:t>
+      </w:r>
+    </w:p>
+    <w:p>
+      <w:pPr>
+        <w:spacing w:after="71"/>
+      </w:pPr>
+    </w:p>
+    <w:p>
+      <w:pPr>
+        <w:jc w:val="both"/>
+      </w:pPr>
+      <w:r>
+        <w:rPr>
+          <w:b/>
+        </w:rPr>
+        <w:t xml:space="preserve">Wenn du um etwas bitten willst</w:t>
+      </w:r>
+    </w:p>
+    <w:p>
+      <w:pPr>
+        <w:spacing w:after="71"/>
+      </w:pPr>
+    </w:p>
+    <w:p>
+      <w:pPr>
+        <w:jc w:val="both"/>
+      </w:pPr>
+      <w:r>
+        <w:t xml:space="preserve">„Kannst du das übernehmen?"</w:t>
+      </w:r>
+    </w:p>
+    <w:p>
+      <w:pPr>
+        <w:jc w:val="both"/>
+      </w:pPr>
+      <w:r>
+        <w:t xml:space="preserve">„Ich brauche Samstag für mich. Geht das?"</w:t>
+      </w:r>
+    </w:p>
+    <w:p>
+      <w:pPr>
+        <w:jc w:val="both"/>
+      </w:pPr>
+      <w:r>
+        <w:t xml:space="preserve">„Ich schaffe das nicht alleine. Hilfst du mir?"</w:t>
+      </w:r>
+    </w:p>
+    <w:p>
+      <w:pPr>
+        <w:spacing w:after="71"/>
+      </w:pPr>
+    </w:p>
+    <w:p>
+      <w:pPr>
+        <w:jc w:val="both"/>
+      </w:pPr>
+      <w:r>
+        <w:t xml:space="preserve">Ein Satz. Kein „nur wenn es dir nichts ausmacht".</w:t>
+      </w:r>
+    </w:p>
+    <w:p>
+      <w:pPr>
+        <w:spacing w:after="71"/>
+      </w:pPr>
+    </w:p>
+    <w:p>
+      <w:pPr>
+        <w:jc w:val="both"/>
+      </w:pPr>
+      <w:r>
+        <w:rPr>
+          <w:b/>
+        </w:rPr>
+        <w:t xml:space="preserve">Wenn du Aufgaben abgeben willst</w:t>
+      </w:r>
+    </w:p>
+    <w:p>
+      <w:pPr>
+        <w:spacing w:after="71"/>
+      </w:pPr>
+    </w:p>
+    <w:p>
+      <w:pPr>
+        <w:jc w:val="both"/>
+      </w:pPr>
+      <w:r>
+        <w:t xml:space="preserve">„Ich kann Dienstag und Freitag. Die anderen Tage brauche ich dich."</w:t>
+      </w:r>
+    </w:p>
+    <w:p>
+      <w:pPr>
+        <w:spacing w:after="71"/>
+      </w:pPr>
+    </w:p>
+    <w:p>
+      <w:pPr>
+        <w:jc w:val="both"/>
+      </w:pPr>
+      <w:r>
+        <w:t xml:space="preserve">Sag, was du kannst. Nicht, was du nicht kannst.</w:t>
+      </w:r>
+    </w:p>
+    <w:p>
+      <w:pPr>
+        <w:spacing w:after="71"/>
+      </w:pPr>
+    </w:p>
+    <w:p>
+      <w:pPr>
+        <w:jc w:val="both"/>
+      </w:pPr>
+      <w:r>
+        <w:rPr>
+          <w:b/>
+        </w:rPr>
+        <w:t xml:space="preserve">Wenn du Zeit brauchst, bevor du antwortest</w:t>
+      </w:r>
+    </w:p>
+    <w:p>
+      <w:pPr>
+        <w:spacing w:after="71"/>
+      </w:pPr>
+    </w:p>
+    <w:p>
+      <w:pPr>
+        <w:jc w:val="both"/>
+      </w:pPr>
+      <w:r>
+        <w:t xml:space="preserve">„Ich sage dir morgen Bescheid."</w:t>
+      </w:r>
+    </w:p>
+    <w:p>
+      <w:pPr>
+        <w:spacing w:after="71"/>
+      </w:pPr>
+    </w:p>
+    <w:p>
+      <w:pPr>
+        <w:jc w:val="both"/>
+      </w:pPr>
+      <w:r>
+        <w:t xml:space="preserve">Der nützlichste Satz im ganzen Buch. Er kauft dir die Nacht, in der du merkst, was du wirklich willst.</w:t>
+      </w:r>
+    </w:p>
+    <w:p>
+      <w:pPr>
+        <w:spacing w:after="71"/>
+      </w:pPr>
+    </w:p>
+    <w:p>
+      <w:pPr>
+        <w:jc w:val="both"/>
+      </w:pPr>
+      <w:r>
+        <w:rPr>
+          <w:b/>
+        </w:rPr>
+        <w:t xml:space="preserve">Wenn dich jemand fragt, wie es dir geht</w:t>
+      </w:r>
+    </w:p>
+    <w:p>
+      <w:pPr>
+        <w:spacing w:after="71"/>
+      </w:pPr>
+    </w:p>
+    <w:p>
+      <w:pPr>
+        <w:jc w:val="both"/>
+      </w:pPr>
+      <w:r>
+        <w:t xml:space="preserve">„Ehrlich? Gerade nicht so gut."</w:t>
+      </w:r>
+    </w:p>
+    <w:p>
+      <w:pPr>
+        <w:spacing w:after="71"/>
+      </w:pPr>
+    </w:p>
+    <w:p>
+      <w:pPr>
+        <w:jc w:val="both"/>
+      </w:pPr>
+      <w:r>
+        <w:t xml:space="preserve">Du musst nichts erklären. Der halbe Satz reicht.</w:t>
+      </w:r>
+    </w:p>
+    <w:p>
+      <w:pPr>
+        <w:spacing w:after="71"/>
+      </w:pPr>
+    </w:p>
+    <w:p>
+      <w:pPr>
+        <w:jc w:val="both"/>
+      </w:pPr>
+      <w:r>
+        <w:rPr>
+          <w:b/>
+        </w:rPr>
+        <w:t xml:space="preserve">Wenn du mit dir selbst redest</w:t>
+      </w:r>
+    </w:p>
+    <w:p>
+      <w:pPr>
+        <w:spacing w:after="71"/>
+      </w:pPr>
+    </w:p>
+    <w:p>
+      <w:pPr>
+        <w:jc w:val="both"/>
+      </w:pPr>
+      <w:r>
+        <w:t xml:space="preserve">Ich mache jetzt das Nötigste. Nicht mehr.</w:t>
+      </w:r>
+    </w:p>
+    <w:p>
+      <w:pPr>
+        <w:jc w:val="both"/>
+      </w:pPr>
+      <w:r>
+        <w:t xml:space="preserve">Das schlechte Gewissen ist alt. Es hat heute nichts zu sagen.</w:t>
+      </w:r>
+    </w:p>
+    <w:p>
+      <w:pPr>
+        <w:jc w:val="both"/>
+      </w:pPr>
+      <w:r>
+        <w:t xml:space="preserve">Ich muss nicht gewinnen. Ich bleibe nur bei meinem Satz.</w:t>
+      </w:r>
+    </w:p>
+    <w:p>
+      <w:pPr>
+        <w:jc w:val="both"/>
+      </w:pPr>
+      <w:r>
+        <w:t xml:space="preserve">Ich bin nicht empfindlich. Ich trage seit Jahren zu viel.</w:t>
+      </w:r>
+    </w:p>
+    <w:p>
+      <w:pPr>
+        <w:spacing w:after="71"/>
+      </w:pPr>
+    </w:p>
+    <w:p>
+      <w:pPr>
+        <w:jc w:val="both"/>
+      </w:pPr>
+      <w:r>
+        <w:t xml:space="preserve">Diese Seiten sind zum Wiederkommen.</w:t>
+      </w:r>
+    </w:p>
+    <w:p>
+      <w:pPr>
+        <w:spacing w:after="71"/>
+      </w:pPr>
+    </w:p>
+    <w:p>
+      <w:pPr>
+        <w:jc w:val="both"/>
+      </w:pPr>
+      <w:r>
+        <w:t xml:space="preserve">Du wirst sie an einem Tag brauchen, an dem dir keiner dieser Sätze einfällt.</w:t>
+      </w:r>
+    </w:p>
+    <w:p>
+      <w:pPr>
+        <w:jc w:val="both"/>
+      </w:pPr>
+      <w:r>
+        <w:t xml:space="preserve">Genau dafür stehen sie hier.</w:t>
+      </w:r>
+    </w:p>
+    <w:p>
+      <w:pPr>
+        <w:spacing w:after="71"/>
       </w:pPr>
     </w:p>
     <w:p>

</xml_diff>

<commit_message>
Buch 6: Herz unten rechts, fehlende Seitenumbrueche, typografische Anfuehrungszeichen, keine verwaisten Zeilen
</commit_message>
<xml_diff>
--- a/outputs/buch6/buch6-MANUSKRIPT.docx
+++ b/outputs/buch6/buch6-MANUSKRIPT.docx
@@ -2322,7 +2322,7 @@
         <w:jc w:val="both"/>
       </w:pPr>
       <w:r>
-        <w:t>Du sagst „Macht nichts", obwohl es doch etwas macht.</w:t>
+        <w:t>Du sagst „Macht nichts“, obwohl es doch etwas macht.</w:t>
       </w:r>
     </w:p>
     <w:p>
@@ -2364,7 +2364,7 @@
         <w:jc w:val="both"/>
       </w:pPr>
       <w:r>
-        <w:t>Nicht „Wie lange noch bis zum Urlaub."</w:t>
+        <w:t>Nicht „Wie lange noch bis zum Urlaub.“</w:t>
       </w:r>
     </w:p>
     <w:p>
@@ -3042,7 +3042,7 @@
           <w:b/>
           <w:i/>
         </w:rPr>
-        <w:t>„Es gibt Tage, an denen du nicht mal ein Buch lesen kannst. Diese Seite ist für genau die."</w:t>
+        <w:t>„Es gibt Tage, an denen du nicht mal ein Buch lesen kannst. Diese Seite ist für genau die.“</w:t>
       </w:r>
     </w:p>
     <w:p>
@@ -3445,6 +3445,11 @@
       </w:pPr>
       <w:r>
         <w:t>Knick die Ecke um. Du wirst sie wieder suchen.</w:t>
+      </w:r>
+    </w:p>
+    <w:p>
+      <w:r>
+        <w:br w:type="page"/>
       </w:r>
     </w:p>
     <w:p>
@@ -3586,7 +3591,7 @@
           <w:b/>
           <w:i/>
         </w:rPr>
-        <w:t>„Du funktionierst. Aber du lebst nicht. Das ist kein Burnout. Das ist das Funktions-Ich."</w:t>
+        <w:t>„Du funktionierst. Aber du lebst nicht. Das ist kein Burnout. Das ist das Funktions-Ich.“</w:t>
       </w:r>
     </w:p>
     <w:p>
@@ -3721,23 +3726,23 @@
       </w:pPr>
       <w:r>
         <w:lastRenderedPageBreak/>
-        <w:t>„Du schaffst das."</w:t>
-      </w:r>
-    </w:p>
-    <w:p>
-      <w:pPr>
-        <w:jc w:val="both"/>
-      </w:pPr>
-      <w:r>
-        <w:t>„Du bist so stark."</w:t>
-      </w:r>
-    </w:p>
-    <w:p>
-      <w:pPr>
-        <w:jc w:val="both"/>
-      </w:pPr>
-      <w:r>
-        <w:t>„Wie machst du das bloss?"</w:t>
+        <w:t>„Du schaffst das.“</w:t>
+      </w:r>
+    </w:p>
+    <w:p>
+      <w:pPr>
+        <w:jc w:val="both"/>
+      </w:pPr>
+      <w:r>
+        <w:t>„Du bist so stark.“</w:t>
+      </w:r>
+    </w:p>
+    <w:p>
+      <w:pPr>
+        <w:jc w:val="both"/>
+      </w:pPr>
+      <w:r>
+        <w:t>„Wie machst du das bloss?“</w:t>
       </w:r>
     </w:p>
     <w:p>
@@ -3824,7 +3829,7 @@
         <w:jc w:val="both"/>
       </w:pPr>
       <w:r>
-        <w:t>Sie sass mir gegenüber und sagte: „Mir geht es ja gut. Alle sagen das."</w:t>
+        <w:t>Sie sass mir gegenüber und sagte: „Mir geht es ja gut. Alle sagen das.“</w:t>
       </w:r>
     </w:p>
     <w:p>
@@ -3863,7 +3868,7 @@
         <w:jc w:val="both"/>
       </w:pPr>
       <w:r>
-        <w:t>„Ich glaube, ich bin einfach müde."</w:t>
+        <w:t>„Ich glaube, ich bin einfach müde.“</w:t>
       </w:r>
     </w:p>
     <w:p>
@@ -3890,7 +3895,7 @@
         <w:jc w:val="both"/>
       </w:pPr>
       <w:r>
-        <w:t>„Von allem."</w:t>
+        <w:t>„Von allem.“</w:t>
       </w:r>
     </w:p>
     <w:p>
@@ -4166,7 +4171,7 @@
           <w:i/>
           <w:sz w:val="21"/>
         </w:rPr>
-        <w:t>Auch wenn die Antwort „Weiss ich nicht mehr" ist.</w:t>
+        <w:t>Auch wenn die Antwort „Weiss ich nicht mehr“ ist.</w:t>
       </w:r>
       <w:r>
         <w:br/>
@@ -4224,7 +4229,7 @@
           <w:b/>
           <w:i/>
         </w:rPr>
-        <w:t>„Wer immer stark ist, wird irgendwann unsichtbar."</w:t>
+        <w:t>„Wer immer stark ist, wird irgendwann unsichtbar.“</w:t>
       </w:r>
     </w:p>
     <w:p>
@@ -4461,15 +4466,15 @@
         <w:jc w:val="both"/>
       </w:pPr>
       <w:r>
-        <w:t>„Ich weiss gar nicht ab wann das angefangen hat", sagte sie.</w:t>
-      </w:r>
-    </w:p>
-    <w:p>
-      <w:pPr>
-        <w:jc w:val="both"/>
-      </w:pPr>
-      <w:r>
-        <w:t>„Es gab keinen Anfang. Es war einfach so."</w:t>
+        <w:t>„Ich weiss gar nicht ab wann das angefangen hat“, sagte sie.</w:t>
+      </w:r>
+    </w:p>
+    <w:p>
+      <w:pPr>
+        <w:jc w:val="both"/>
+      </w:pPr>
+      <w:r>
+        <w:t>„Es gab keinen Anfang. Es war einfach so.“</w:t>
       </w:r>
     </w:p>
     <w:p>
@@ -4508,7 +4513,7 @@
         <w:jc w:val="both"/>
       </w:pPr>
       <w:r>
-        <w:t>„Nein. Die haben das gar nicht gemerkt. Ich hab's ja gemacht."</w:t>
+        <w:t>„Nein. Die haben das gar nicht gemerkt. Ich hab’s ja gemacht.“</w:t>
       </w:r>
     </w:p>
     <w:p>
@@ -4717,7 +4722,7 @@
           <w:i/>
           <w:sz w:val="21"/>
         </w:rPr>
-        <w:t>Oder hast du gesagt „Gut, danke"?</w:t>
+        <w:t>Oder hast du gesagt „Gut, danke“?</w:t>
       </w:r>
       <w:r>
         <w:br/>
@@ -4778,7 +4783,7 @@
           <w:b/>
           <w:i/>
         </w:rPr>
-        <w:t>„Wenn Schlaf dich nicht mehr erholt, liegt es nicht an deinem Körper. Es liegt an dem was du trägst."</w:t>
+        <w:t>„Wenn Schlaf dich nicht mehr erholt, liegt es nicht an deinem Körper. Es liegt an dem was du trägst.“</w:t>
       </w:r>
     </w:p>
     <w:p>
@@ -4901,7 +4906,7 @@
         <w:jc w:val="both"/>
       </w:pPr>
       <w:r>
-        <w:t>„Sie sind gesund", sagt er.</w:t>
+        <w:t>„Sie sind gesund“, sagt er.</w:t>
       </w:r>
     </w:p>
     <w:p>
@@ -5090,7 +5095,7 @@
         <w:jc w:val="both"/>
       </w:pPr>
       <w:r>
-        <w:t>„Ich bin doch nicht krank. Ich bin nur müde. Aber ich bin es seit Jahren."</w:t>
+        <w:t>„Ich bin doch nicht krank. Ich bin nur müde. Aber ich bin es seit Jahren.“</w:t>
       </w:r>
     </w:p>
     <w:p>
@@ -5129,7 +5134,7 @@
         <w:jc w:val="both"/>
       </w:pPr>
       <w:r>
-        <w:t>„Zweitausendfünfzehn. Da war ich zwei Wochen alleine in den Bergen."</w:t>
+        <w:t>„Zweitausendfünfzehn. Da war ich zwei Wochen alleine in den Bergen.“</w:t>
       </w:r>
     </w:p>
     <w:p>
@@ -5453,7 +5458,7 @@
           <w:b/>
           <w:i/>
         </w:rPr>
-        <w:t>„Stark sein war nie deine Persönlichkeit. Es war deine Überlebensstrategie."</w:t>
+        <w:t>„Stark sein war nie deine Persönlichkeit. Es war deine Überlebensstrategie.“</w:t>
       </w:r>
     </w:p>
     <w:p>
@@ -5466,7 +5471,7 @@
         <w:jc w:val="both"/>
       </w:pPr>
       <w:r>
-        <w:t>„Ich bin halt so."</w:t>
+        <w:t>„Ich bin halt so.“</w:t>
       </w:r>
     </w:p>
     <w:p>
@@ -6143,7 +6148,7 @@
           <w:b/>
           <w:i/>
         </w:rPr>
-        <w:t>„Jemand fragt, was du willst. Und du stockst. Das ist der Moment, in dem du merkst, dass du weg bist."</w:t>
+        <w:t>„Jemand fragt, was du willst. Und du stockst. Das ist der Moment, in dem du merkst, dass du weg bist.“</w:t>
       </w:r>
     </w:p>
     <w:p>
@@ -6206,7 +6211,7 @@
         <w:jc w:val="both"/>
       </w:pPr>
       <w:r>
-        <w:t>„Keine Ahnung. Was willst du?"</w:t>
+        <w:t>„Keine Ahnung. Was willst du?“</w:t>
       </w:r>
     </w:p>
     <w:p>
@@ -6362,7 +6367,7 @@
         <w:jc w:val="both"/>
       </w:pPr>
       <w:r>
-        <w:t>Ihr Freund hatte gesagt: „Ich weiss nicht wer du bist. Du passt dich immer an."</w:t>
+        <w:t>Ihr Freund hatte gesagt: „Ich weiss nicht wer du bist. Du passt dich immer an.“</w:t>
       </w:r>
     </w:p>
     <w:p>
@@ -6430,7 +6435,7 @@
         <w:jc w:val="both"/>
       </w:pPr>
       <w:r>
-        <w:t>„Früher hat mir Malen gefallen. Aber das mache ich seit Jahren nicht mehr."</w:t>
+        <w:t>„Früher hat mir Malen gefallen. Aber das mache ich seit Jahren nicht mehr.“</w:t>
       </w:r>
     </w:p>
     <w:p>
@@ -6456,7 +6461,7 @@
         <w:jc w:val="both"/>
       </w:pPr>
       <w:r>
-        <w:t>„Es hat sich selfish angefühlt. Stundenlang malen, während andere Dinge warten."</w:t>
+        <w:t>„Es hat sich selfish angefühlt. Stundenlang malen, während andere Dinge warten.“</w:t>
       </w:r>
     </w:p>
     <w:p>
@@ -6690,7 +6695,7 @@
           <w:b/>
           <w:i/>
         </w:rPr>
-        <w:t>„Du weinst im Auto, damit niemand es sieht. Das sagt alles."</w:t>
+        <w:t>„Du weinst im Auto, damit niemand es sieht. Das sagt alles.“</w:t>
       </w:r>
       <w:proofErr w:type="spellStart"/>
       <w:r>
@@ -6853,23 +6858,23 @@
         <w:jc w:val="both"/>
       </w:pPr>
       <w:r>
-        <w:t>„Im Auto kann ich sein wie ich bin."</w:t>
-      </w:r>
-    </w:p>
-    <w:p>
-      <w:pPr>
-        <w:jc w:val="both"/>
-      </w:pPr>
-      <w:r>
-        <w:t>„Ich sitze manchmal noch fünf Minuten da, bevor ich reingehe."</w:t>
-      </w:r>
-    </w:p>
-    <w:p>
-      <w:pPr>
-        <w:jc w:val="both"/>
-      </w:pPr>
-      <w:r>
-        <w:t>„Im Auto weine ich. Damit niemand es sieht."</w:t>
+        <w:t>„Im Auto kann ich sein wie ich bin.“</w:t>
+      </w:r>
+    </w:p>
+    <w:p>
+      <w:pPr>
+        <w:jc w:val="both"/>
+      </w:pPr>
+      <w:r>
+        <w:t>„Ich sitze manchmal noch fünf Minuten da, bevor ich reingehe.“</w:t>
+      </w:r>
+    </w:p>
+    <w:p>
+      <w:pPr>
+        <w:jc w:val="both"/>
+      </w:pPr>
+      <w:r>
+        <w:t>„Im Auto weine ich. Damit niemand es sieht.“</w:t>
       </w:r>
     </w:p>
     <w:p>
@@ -7355,7 +7360,7 @@
           <w:b/>
           <w:i/>
         </w:rPr>
-        <w:t>„Du machst nicht alles alleine, weil du es besser kannst. Sondern weil bitten sich gefährlicher anfühlt als tragen."</w:t>
+        <w:t>„Du machst nicht alles alleine, weil du es besser kannst. Sondern weil bitten sich gefährlicher anfühlt als tragen.“</w:t>
       </w:r>
     </w:p>
     <w:p>
@@ -7368,7 +7373,7 @@
         <w:jc w:val="both"/>
       </w:pPr>
       <w:r>
-        <w:t>„Ich mach das schnell selbst."</w:t>
+        <w:t>„Ich mach das schnell selbst.“</w:t>
       </w:r>
     </w:p>
     <w:p>
@@ -7589,7 +7594,7 @@
         <w:jc w:val="both"/>
       </w:pPr>
       <w:r>
-        <w:t>„Bei uns läuft alles über mich", sagte Bettina. „Aber ich beschwere mich nicht."</w:t>
+        <w:t>„Bei uns läuft alles über mich“, sagte Bettina. „Aber ich beschwere mich nicht.“</w:t>
       </w:r>
     </w:p>
     <w:p>
@@ -7615,7 +7620,7 @@
         <w:jc w:val="both"/>
       </w:pPr>
       <w:r>
-        <w:t>„Nein. Aber sie sehen es ja."</w:t>
+        <w:t>„Nein. Aber sie sehen es ja.“</w:t>
       </w:r>
     </w:p>
     <w:p>
@@ -7655,7 +7660,7 @@
         <w:jc w:val="both"/>
       </w:pPr>
       <w:r>
-        <w:t>„Wahrscheinlich nicht. Ich mache es ja so, dass man es nicht sieht."</w:t>
+        <w:t>„Wahrscheinlich nicht. Ich mache es ja so, dass man es nicht sieht.“</w:t>
       </w:r>
     </w:p>
     <w:p>
@@ -8009,7 +8014,7 @@
           <w:b/>
           <w:i/>
         </w:rPr>
-        <w:t>„Das Nein, das sich falsch anfühlt, ist meistens das richtige. Das Gefühl ist alt, nicht wahr."</w:t>
+        <w:t>„Das Nein, das sich falsch anfühlt, ist meistens das richtige. Das Gefühl ist alt, nicht wahr.“</w:t>
       </w:r>
     </w:p>
     <w:p>
@@ -8337,7 +8342,7 @@
         <w:jc w:val="both"/>
       </w:pPr>
       <w:r>
-        <w:t>„Es fühlt sich an als würde ich gleich bestraft."</w:t>
+        <w:t>„Es fühlt sich an als würde ich gleich bestraft.“</w:t>
       </w:r>
     </w:p>
     <w:p>
@@ -8450,7 +8455,7 @@
         <w:jc w:val="both"/>
       </w:pPr>
       <w:r>
-        <w:t>„Das geht für mich gerade nicht."</w:t>
+        <w:t>„Das geht für mich gerade nicht.“</w:t>
       </w:r>
     </w:p>
     <w:p>
@@ -8696,7 +8701,7 @@
           <w:b/>
           <w:i/>
         </w:rPr>
-        <w:t>„Der mutigste Moment ist nicht der Zusammenbruch. Es ist der Satz danach: So nicht mehr."</w:t>
+        <w:t>„Der mutigste Moment ist nicht der Zusammenbruch. Es ist der Satz danach: So nicht mehr.“</w:t>
       </w:r>
     </w:p>
     <w:p>
@@ -9106,7 +9111,7 @@
         <w:jc w:val="both"/>
       </w:pPr>
       <w:r>
-        <w:t>„Ihr Körper macht das nicht mehr mit."</w:t>
+        <w:t>„Ihr Körper macht das nicht mehr mit.“</w:t>
       </w:r>
     </w:p>
     <w:p>
@@ -9170,7 +9175,7 @@
         <w:jc w:val="both"/>
       </w:pPr>
       <w:r>
-        <w:t>„Mama, bist du eigentlich glücklich?"</w:t>
+        <w:t>„Mama, bist du eigentlich glücklich?“</w:t>
       </w:r>
     </w:p>
     <w:p>
@@ -9246,15 +9251,15 @@
         <w:jc w:val="both"/>
       </w:pPr>
       <w:r>
-        <w:t>Der Moment in dem du aufhörst zu sagen: „Mir geht es gut."</w:t>
-      </w:r>
-    </w:p>
-    <w:p>
-      <w:pPr>
-        <w:jc w:val="both"/>
-      </w:pPr>
-      <w:r>
-        <w:t>Und anfängst zu sagen: „Ich weiss nicht wie es mir geht. Aber ich will es herausfinden."</w:t>
+        <w:t>Der Moment in dem du aufhörst zu sagen: „Mir geht es gut.“</w:t>
+      </w:r>
+    </w:p>
+    <w:p>
+      <w:pPr>
+        <w:jc w:val="both"/>
+      </w:pPr>
+      <w:r>
+        <w:t>Und anfängst zu sagen: „Ich weiss nicht wie es mir geht. Aber ich will es herausfinden.“</w:t>
       </w:r>
     </w:p>
     <w:p>
@@ -9393,7 +9398,7 @@
           <w:b/>
           <w:i/>
         </w:rPr>
-        <w:t>„Dein schlechtes Gewissen zeigt dir nicht, was falsch ist. Es zeigt dir nur, was ungewohnt ist."</w:t>
+        <w:t>„Dein schlechtes Gewissen zeigt dir nicht, was falsch ist. Es zeigt dir nur, was ungewohnt ist.“</w:t>
       </w:r>
     </w:p>
     <w:p>
@@ -9731,7 +9736,7 @@
         <w:jc w:val="both"/>
       </w:pPr>
       <w:r>
-        <w:t>„Ich habe nach zwanzig Minuten bezahlt und bin heim. Ich hielt es nicht aus."</w:t>
+        <w:t>„Ich habe nach zwanzig Minuten bezahlt und bin heim. Ich hielt es nicht aus.“</w:t>
       </w:r>
     </w:p>
     <w:p>
@@ -9757,7 +9762,7 @@
         <w:jc w:val="both"/>
       </w:pPr>
       <w:r>
-        <w:t>„Nein. Gar nichts. Es war alles völlig ruhig."</w:t>
+        <w:t>„Nein. Gar nichts. Es war alles völlig ruhig.“</w:t>
       </w:r>
     </w:p>
     <w:p>
@@ -10119,7 +10124,7 @@
           <w:b/>
           <w:i/>
         </w:rPr>
-        <w:t>„Die Erlaubnis aufzuhören bekommst du von niemandem. Ausser von dir selbst."</w:t>
+        <w:t>„Die Erlaubnis aufzuhören bekommst du von niemandem. Ausser von dir selbst.“</w:t>
       </w:r>
     </w:p>
     <w:p>
@@ -10283,7 +10288,7 @@
         <w:jc w:val="both"/>
       </w:pPr>
       <w:r>
-        <w:t>Was „aufhören" wirklich bedeutet:</w:t>
+        <w:t>Was „aufhören“ wirklich bedeutet:</w:t>
       </w:r>
     </w:p>
     <w:p>
@@ -10378,7 +10383,7 @@
         <w:jc w:val="both"/>
       </w:pPr>
       <w:r>
-        <w:t>„Ich weiss nicht mehr wie ich aufhöre."</w:t>
+        <w:t>„Ich weiss nicht mehr wie ich aufhöre.“</w:t>
       </w:r>
     </w:p>
     <w:p>
@@ -10404,7 +10409,7 @@
         <w:jc w:val="both"/>
       </w:pPr>
       <w:r>
-        <w:t>„Ich weiss, wie man anfängt. Wie man durchhält. Wie man mehr gibt. Aber aufhören. Das hab ich nie gelernt."</w:t>
+        <w:t>„Ich weiss, wie man anfängt. Wie man durchhält. Wie man mehr gibt. Aber aufhören. Das hab ich nie gelernt.“</w:t>
       </w:r>
     </w:p>
     <w:p>
@@ -10848,7 +10853,7 @@
           <w:b/>
           <w:i/>
         </w:rPr>
-        <w:t>„Du weisst, was alle anderen brauchen. Frag dich einmal am Tag, was du brauchst. Nur einmal."</w:t>
+        <w:t>„Du weisst, was alle anderen brauchen. Frag dich einmal am Tag, was du brauchst. Nur einmal.“</w:t>
       </w:r>
     </w:p>
     <w:p>
@@ -10861,7 +10866,7 @@
         <w:jc w:val="both"/>
       </w:pPr>
       <w:r>
-        <w:t>Ich spreche nicht gerne von „Bedürfnissen".</w:t>
+        <w:t>Ich spreche nicht gerne von „Bedürfnissen“.</w:t>
       </w:r>
     </w:p>
     <w:p>
@@ -11136,23 +11141,23 @@
       </w:pPr>
       <w:r>
         <w:lastRenderedPageBreak/>
-        <w:t>„Ich brauche gerade kurz eine Pause."</w:t>
-      </w:r>
-    </w:p>
-    <w:p>
-      <w:pPr>
-        <w:jc w:val="both"/>
-      </w:pPr>
-      <w:r>
-        <w:t>„Ich brauche heute Abend Zeit für mich."</w:t>
-      </w:r>
-    </w:p>
-    <w:p>
-      <w:pPr>
-        <w:jc w:val="both"/>
-      </w:pPr>
-      <w:r>
-        <w:t>„Ich brauche deine Hilfe."</w:t>
+        <w:t>„Ich brauche gerade kurz eine Pause.“</w:t>
+      </w:r>
+    </w:p>
+    <w:p>
+      <w:pPr>
+        <w:jc w:val="both"/>
+      </w:pPr>
+      <w:r>
+        <w:t>„Ich brauche heute Abend Zeit für mich.“</w:t>
+      </w:r>
+    </w:p>
+    <w:p>
+      <w:pPr>
+        <w:jc w:val="both"/>
+      </w:pPr>
+      <w:r>
+        <w:t>„Ich brauche deine Hilfe.“</w:t>
       </w:r>
     </w:p>
     <w:p>
@@ -11398,7 +11403,7 @@
           <w:b/>
           <w:i/>
         </w:rPr>
-        <w:t>„Du brauchst keinen Grund. Kein Aber. Kein Weil. Nein ist ein vollständiger Satz."</w:t>
+        <w:t>„Du brauchst keinen Grund. Kein Aber. Kein Weil. Nein ist ein vollständiger Satz.“</w:t>
       </w:r>
     </w:p>
     <w:p>
@@ -11450,7 +11455,7 @@
         <w:jc w:val="both"/>
       </w:pPr>
       <w:r>
-        <w:t>„Das geht für mich gerade nicht."</w:t>
+        <w:t>„Das geht für mich gerade nicht.“</w:t>
       </w:r>
     </w:p>
     <w:p>
@@ -11476,7 +11481,7 @@
         <w:jc w:val="both"/>
       </w:pPr>
       <w:r>
-        <w:t>Kein „aber ich wünschte ich könnte" hinten dran.</w:t>
+        <w:t>Kein „aber ich wünschte ich könnte“ hinten dran.</w:t>
       </w:r>
     </w:p>
     <w:p>
@@ -11497,7 +11502,7 @@
         <w:jc w:val="both"/>
       </w:pPr>
       <w:r>
-        <w:t>Nur: „Das geht für mich gerade nicht."</w:t>
+        <w:t>Nur: „Das geht für mich gerade nicht.“</w:t>
       </w:r>
     </w:p>
     <w:p>
@@ -11997,7 +12002,7 @@
           <w:b/>
           <w:i/>
         </w:rPr>
-        <w:t>. Das Problem ist der Satz danach."</w:t>
+        <w:t>. Das Problem ist der Satz danach.“</w:t>
       </w:r>
     </w:p>
     <w:p>
@@ -12091,7 +12096,7 @@
         <w:jc w:val="both"/>
       </w:pPr>
       <w:r>
-        <w:t>„Warum denn nicht? Du hast doch sonst immer Zeit."</w:t>
+        <w:t>„Warum denn nicht? Du hast doch sonst immer Zeit.“</w:t>
       </w:r>
     </w:p>
     <w:p>
@@ -12143,7 +12148,7 @@
         <w:jc w:val="both"/>
       </w:pPr>
       <w:r>
-        <w:t>„Es geht diesmal einfach nicht."</w:t>
+        <w:t>„Es geht diesmal einfach nicht.“</w:t>
       </w:r>
     </w:p>
     <w:p>
@@ -12169,7 +12174,7 @@
         <w:jc w:val="both"/>
       </w:pPr>
       <w:r>
-        <w:t>„Ich weiss, es kommt ungelegen. Es geht trotzdem nicht."</w:t>
+        <w:t>„Ich weiss, es kommt ungelegen. Es geht trotzdem nicht.“</w:t>
       </w:r>
     </w:p>
     <w:p>
@@ -12229,7 +12234,7 @@
         <w:jc w:val="both"/>
       </w:pPr>
       <w:r>
-        <w:t>„Ich war auch immer für dich da."</w:t>
+        <w:t>„Ich war auch immer für dich da.“</w:t>
       </w:r>
     </w:p>
     <w:p>
@@ -12282,7 +12287,7 @@
         <w:jc w:val="both"/>
       </w:pPr>
       <w:r>
-        <w:t>„Das stimmt, und ich bin dir dankbar dafür. Diesmal geht es trotzdem nicht."</w:t>
+        <w:t>„Das stimmt, und ich bin dir dankbar dafür. Diesmal geht es trotzdem nicht.“</w:t>
       </w:r>
     </w:p>
     <w:p>
@@ -12534,7 +12539,7 @@
       </w:pPr>
       <w:r>
         <w:lastRenderedPageBreak/>
-        <w:t>„Ich hab es gemerkt, während ich geredet habe", sagte sie. „Und konnte trotzdem nicht aufhören."</w:t>
+        <w:t>„Ich hab es gemerkt, während ich geredet habe“, sagte sie. „Und konnte trotzdem nicht aufhören.“</w:t>
       </w:r>
     </w:p>
     <w:p>
@@ -12560,7 +12565,7 @@
         <w:jc w:val="both"/>
       </w:pPr>
       <w:r>
-        <w:t>„Es geht diesmal einfach nicht."</w:t>
+        <w:t>„Es geht diesmal einfach nicht.“</w:t>
       </w:r>
     </w:p>
     <w:p>
@@ -12740,7 +12745,7 @@
           <w:b/>
           <w:i/>
         </w:rPr>
-        <w:t>„Du hilfst allen und erwartest nie etwas zurück. Warum gilt das nicht auch für dich?"</w:t>
+        <w:t>„Du hilfst allen und erwartest nie etwas zurück. Warum gilt das nicht auch für dich?“</w:t>
       </w:r>
     </w:p>
     <w:p>
@@ -12864,7 +12869,7 @@
         <w:jc w:val="both"/>
       </w:pPr>
       <w:r>
-        <w:t>„Ich habe gerade so viel um die Ohren."</w:t>
+        <w:t>„Ich habe gerade so viel um die Ohren.“</w:t>
       </w:r>
     </w:p>
     <w:p>
@@ -12945,7 +12950,7 @@
         <w:jc w:val="both"/>
       </w:pPr>
       <w:r>
-        <w:t>„Sag, hättest du eventuell, nur wenn es wirklich gar kein Problem ist, vielleicht kurz Zeit? Sonst mache ich es auch selbst, ist überhaupt kein Thema."</w:t>
+        <w:t>„Sag, hättest du eventuell, nur wenn es wirklich gar kein Problem ist, vielleicht kurz Zeit? Sonst mache ich es auch selbst, ist überhaupt kein Thema.“</w:t>
       </w:r>
     </w:p>
     <w:p>
@@ -13019,23 +13024,23 @@
         <w:jc w:val="both"/>
       </w:pPr>
       <w:r>
-        <w:t>„Kannst du morgen die Kinder holen?"</w:t>
-      </w:r>
-    </w:p>
-    <w:p>
-      <w:pPr>
-        <w:jc w:val="both"/>
-      </w:pPr>
-      <w:r>
-        <w:t>„Ich brauche Samstag für mich. Übernimmst du?"</w:t>
-      </w:r>
-    </w:p>
-    <w:p>
-      <w:pPr>
-        <w:jc w:val="both"/>
-      </w:pPr>
-      <w:r>
-        <w:t>„Ich schaffe das nicht alleine. Hilfst du mir?"</w:t>
+        <w:t>„Kannst du morgen die Kinder holen?“</w:t>
+      </w:r>
+    </w:p>
+    <w:p>
+      <w:pPr>
+        <w:jc w:val="both"/>
+      </w:pPr>
+      <w:r>
+        <w:t>„Ich brauche Samstag für mich. Übernimmst du?“</w:t>
+      </w:r>
+    </w:p>
+    <w:p>
+      <w:pPr>
+        <w:jc w:val="both"/>
+      </w:pPr>
+      <w:r>
+        <w:t>„Ich schaffe das nicht alleine. Hilfst du mir?“</w:t>
       </w:r>
     </w:p>
     <w:p>
@@ -13179,7 +13184,7 @@
         <w:jc w:val="both"/>
       </w:pPr>
       <w:r>
-        <w:t>„Wenn mir jemand hilft, kann ich nicht schlafen bis ich es ausgeglichen habe."</w:t>
+        <w:t>„Wenn mir jemand hilft, kann ich nicht schlafen bis ich es ausgeglichen habe.“</w:t>
       </w:r>
     </w:p>
     <w:p>
@@ -13205,7 +13210,7 @@
         <w:jc w:val="both"/>
       </w:pPr>
       <w:r>
-        <w:t>„Natürlich nicht. Nie."</w:t>
+        <w:t>„Natürlich nicht. Nie.“</w:t>
       </w:r>
     </w:p>
     <w:p>
@@ -13435,7 +13440,7 @@
           <w:i/>
           <w:sz w:val="21"/>
         </w:rPr>
-        <w:t>Ohne „nur wenn", ohne „sonst mache ich es selbst".</w:t>
+        <w:t>Ohne „nur wenn“, ohne „sonst mache ich es selbst“.</w:t>
       </w:r>
       <w:r>
         <w:br/>
@@ -13506,7 +13511,7 @@
           <w:b/>
           <w:i/>
         </w:rPr>
-        <w:t>„Wenn jemand geht, weil du Grenzen setzt, hat er nie dich geliebt. Nur was du geleistet hast."</w:t>
+        <w:t>„Wenn jemand geht, weil du Grenzen setzt, hat er nie dich geliebt. Nur was du geleistet hast.“</w:t>
       </w:r>
     </w:p>
     <w:p>
@@ -14013,7 +14018,7 @@
           <w:b/>
           <w:i/>
         </w:rPr>
-        <w:t>„Du brauchst kein neues Leben. Du brauchst vier Wochen und eine einzige Sache pro Woche."</w:t>
+        <w:t>„Du brauchst kein neues Leben. Du brauchst vier Wochen und eine einzige Sache pro Woche.“</w:t>
       </w:r>
     </w:p>
     <w:p>
@@ -14407,7 +14412,7 @@
         <w:jc w:val="both"/>
       </w:pPr>
       <w:r>
-        <w:t>Ein Satz. Kein Vorbau, kein „nur wenn es dir wirklich nichts ausmacht".</w:t>
+        <w:t>Ein Satz. Kein Vorbau, kein „nur wenn es dir wirklich nichts ausmacht“.</w:t>
       </w:r>
     </w:p>
     <w:p>
@@ -14661,7 +14666,7 @@
           <w:sz w:val="21"/>
         </w:rPr>
         <w:br/>
-        <w:t>Nicht „bald". Nicht „wenn es ruhiger wird".</w:t>
+        <w:t>Nicht „bald“. Nicht „wenn es ruhiger wird“.</w:t>
       </w:r>
       <w:r>
         <w:rPr>
@@ -14708,6 +14713,11 @@
         </w:rPr>
         <w:br/>
         <w:t>Du hast schon eins im Kopf.</w:t>
+      </w:r>
+    </w:p>
+    <w:p>
+      <w:r>
+        <w:br w:type="page"/>
       </w:r>
     </w:p>
     <w:p>
@@ -14865,7 +14875,7 @@
           <w:b/>
           <w:i/>
         </w:rPr>
-        <w:t>„Rückfall ist kein Scheitern. Der alte Weg ist nur besser ausgetreten als der neue."</w:t>
+        <w:t>„Rückfall ist kein Scheitern. Der alte Weg ist nur besser ausgetreten als der neue.“</w:t>
       </w:r>
     </w:p>
     <w:p>
@@ -15239,7 +15249,7 @@
         <w:jc w:val="both"/>
       </w:pPr>
       <w:r>
-        <w:t>„Ich bin wieder komplett drin. Alles umsonst."</w:t>
+        <w:t>„Ich bin wieder komplett drin. Alles umsonst.“</w:t>
       </w:r>
     </w:p>
     <w:p>
@@ -15265,7 +15275,7 @@
         <w:jc w:val="both"/>
       </w:pPr>
       <w:r>
-        <w:t>„Ungefähr zehn Tage."</w:t>
+        <w:t>„Ungefähr zehn Tage.“</w:t>
       </w:r>
     </w:p>
     <w:p>
@@ -15304,7 +15314,7 @@
         <w:jc w:val="both"/>
       </w:pPr>
       <w:r>
-        <w:t>„Vor einem Jahr habe ich es überhaupt nicht bemerkt."</w:t>
+        <w:t>„Vor einem Jahr habe ich es überhaupt nicht bemerkt.“</w:t>
       </w:r>
     </w:p>
     <w:p>
@@ -15364,7 +15374,7 @@
         <w:jc w:val="both"/>
       </w:pPr>
       <w:r>
-        <w:t>„Ich bin wieder komplett drin. Ich funktioniere nur noch."</w:t>
+        <w:t>„Ich bin wieder komplett drin. Ich funktioniere nur noch.“</w:t>
       </w:r>
     </w:p>
     <w:p>
@@ -15390,7 +15400,7 @@
         <w:jc w:val="both"/>
       </w:pPr>
       <w:r>
-        <w:t>„Nach neun Tagen. Ich stand im Treppenhaus und wusste plötzlich wieder, wie sich das anfühlt."</w:t>
+        <w:t>„Nach neun Tagen. Ich stand im Treppenhaus und wusste plötzlich wieder, wie sich das anfühlt.“</w:t>
       </w:r>
     </w:p>
     <w:p>
@@ -15416,7 +15426,7 @@
         <w:jc w:val="both"/>
       </w:pPr>
       <w:r>
-        <w:t>„Da hätte ich das gar nicht bemerkt. Da wäre das einfach mein Leben gewesen."</w:t>
+        <w:t>„Da hätte ich das gar nicht bemerkt. Da wäre das einfach mein Leben gewesen.“</w:t>
       </w:r>
     </w:p>
     <w:p>
@@ -15455,7 +15465,7 @@
         <w:jc w:val="both"/>
       </w:pPr>
       <w:r>
-        <w:t>„Ich kann Dienstag und Freitag. Die anderen Tage musst du übernehmen."</w:t>
+        <w:t>„Ich kann Dienstag und Freitag. Die anderen Tage musst du übernehmen.“</w:t>
       </w:r>
     </w:p>
     <w:p>
@@ -15528,7 +15538,7 @@
         <w:jc w:val="both"/>
       </w:pPr>
       <w:r>
-        <w:t>Du sagst wieder „passt schon", obwohl es nicht passt.</w:t>
+        <w:t>Du sagst wieder „passt schon“, obwohl es nicht passt.</w:t>
       </w:r>
     </w:p>
     <w:p>
@@ -15849,7 +15859,7 @@
           <w:b/>
           <w:i/>
         </w:rPr>
-        <w:t>„Wer bist du, wenn niemand etwas von dir braucht? Diese Frage hat dir noch nie jemand gestellt."</w:t>
+        <w:t>„Wer bist du, wenn niemand etwas von dir braucht? Diese Frage hat dir noch nie jemand gestellt.“</w:t>
       </w:r>
     </w:p>
     <w:p>
@@ -16528,23 +16538,23 @@
         <w:jc w:val="both"/>
       </w:pPr>
       <w:r>
-        <w:t>„Das geht für mich gerade nicht."</w:t>
-      </w:r>
-    </w:p>
-    <w:p>
-      <w:pPr>
-        <w:jc w:val="both"/>
-      </w:pPr>
-      <w:r>
-        <w:t>„Es geht diesmal einfach nicht."</w:t>
-      </w:r>
-    </w:p>
-    <w:p>
-      <w:pPr>
-        <w:jc w:val="both"/>
-      </w:pPr>
-      <w:r>
-        <w:t>„Ich schaffe das nicht dazu."</w:t>
+        <w:t>„Das geht für mich gerade nicht.“</w:t>
+      </w:r>
+    </w:p>
+    <w:p>
+      <w:pPr>
+        <w:jc w:val="both"/>
+      </w:pPr>
+      <w:r>
+        <w:t>„Es geht diesmal einfach nicht.“</w:t>
+      </w:r>
+    </w:p>
+    <w:p>
+      <w:pPr>
+        <w:jc w:val="both"/>
+      </w:pPr>
+      <w:r>
+        <w:t>„Ich schaffe das nicht dazu.“</w:t>
       </w:r>
     </w:p>
     <w:p>
@@ -16586,15 +16596,15 @@
         <w:jc w:val="both"/>
       </w:pPr>
       <w:r>
-        <w:t>„Es geht diesmal einfach nicht."</w:t>
-      </w:r>
-    </w:p>
-    <w:p>
-      <w:pPr>
-        <w:jc w:val="both"/>
-      </w:pPr>
-      <w:r>
-        <w:t>„Ich weiss, es kommt ungelegen. Es geht trotzdem nicht."</w:t>
+        <w:t>„Es geht diesmal einfach nicht.“</w:t>
+      </w:r>
+    </w:p>
+    <w:p>
+      <w:pPr>
+        <w:jc w:val="both"/>
+      </w:pPr>
+      <w:r>
+        <w:t>„Ich weiss, es kommt ungelegen. Es geht trotzdem nicht.“</w:t>
       </w:r>
     </w:p>
     <w:p>
@@ -16637,7 +16647,7 @@
       </w:pPr>
       <w:r>
         <w:lastRenderedPageBreak/>
-        <w:t>„Das stimmt, und ich bin dir dankbar dafür. Diesmal geht es trotzdem nicht."</w:t>
+        <w:t>„Das stimmt, und ich bin dir dankbar dafür. Diesmal geht es trotzdem nicht.“</w:t>
       </w:r>
     </w:p>
     <w:p>
@@ -16703,36 +16713,36 @@
         <w:jc w:val="both"/>
       </w:pPr>
       <w:r>
-        <w:t>„Kannst du das übernehmen?"</w:t>
-      </w:r>
-    </w:p>
-    <w:p>
-      <w:pPr>
-        <w:jc w:val="both"/>
-      </w:pPr>
-      <w:r>
-        <w:t>„Ich brauche Samstag für mich. Geht das?"</w:t>
-      </w:r>
-    </w:p>
-    <w:p>
-      <w:pPr>
-        <w:jc w:val="both"/>
-      </w:pPr>
-      <w:r>
-        <w:t>„Ich schaffe das nicht alleine. Hilfst du mir?"</w:t>
-      </w:r>
-    </w:p>
-    <w:p>
-      <w:pPr>
-        <w:spacing w:after="71"/>
-      </w:pPr>
-    </w:p>
-    <w:p>
-      <w:pPr>
-        <w:jc w:val="both"/>
-      </w:pPr>
-      <w:r>
-        <w:t>Ein Satz. Kein „nur wenn es dir nichts ausmacht".</w:t>
+        <w:t>„Kannst du das übernehmen?“</w:t>
+      </w:r>
+    </w:p>
+    <w:p>
+      <w:pPr>
+        <w:jc w:val="both"/>
+      </w:pPr>
+      <w:r>
+        <w:t>„Ich brauche Samstag für mich. Geht das?“</w:t>
+      </w:r>
+    </w:p>
+    <w:p>
+      <w:pPr>
+        <w:jc w:val="both"/>
+      </w:pPr>
+      <w:r>
+        <w:t>„Ich schaffe das nicht alleine. Hilfst du mir?“</w:t>
+      </w:r>
+    </w:p>
+    <w:p>
+      <w:pPr>
+        <w:spacing w:after="71"/>
+      </w:pPr>
+    </w:p>
+    <w:p>
+      <w:pPr>
+        <w:jc w:val="both"/>
+      </w:pPr>
+      <w:r>
+        <w:t>Ein Satz. Kein „nur wenn es dir nichts ausmacht“.</w:t>
       </w:r>
     </w:p>
     <w:p>
@@ -16761,7 +16771,7 @@
         <w:jc w:val="both"/>
       </w:pPr>
       <w:r>
-        <w:t>„Ich kann Dienstag und Freitag. Die anderen Tage brauche ich dich."</w:t>
+        <w:t>„Ich kann Dienstag und Freitag. Die anderen Tage brauche ich dich.“</w:t>
       </w:r>
     </w:p>
     <w:p>
@@ -16803,7 +16813,7 @@
         <w:jc w:val="both"/>
       </w:pPr>
       <w:r>
-        <w:t>„Ich sage dir morgen Bescheid."</w:t>
+        <w:t>„Ich sage dir morgen Bescheid.“</w:t>
       </w:r>
     </w:p>
     <w:p>
@@ -16845,7 +16855,7 @@
         <w:jc w:val="both"/>
       </w:pPr>
       <w:r>
-        <w:t>„Ehrlich? Gerade nicht so gut."</w:t>
+        <w:t>„Ehrlich? Gerade nicht so gut.“</w:t>
       </w:r>
     </w:p>
     <w:p>
@@ -16946,6 +16956,11 @@
       </w:pPr>
       <w:r>
         <w:t>Genau dafür stehen sie hier.</w:t>
+      </w:r>
+    </w:p>
+    <w:p>
+      <w:r>
+        <w:br w:type="page"/>
       </w:r>
     </w:p>
     <w:p>
@@ -17844,7 +17859,7 @@
         <w:rPr>
           <w:sz w:val="18"/>
         </w:rPr>
-        <w:t>Alle Inhalte dieses Buches, also Texte, Konzepte, Zitate, Strukturen und Begriffe wie „Das Funktions-Ich", sind urheberrechtlich geschützt. Die unerlaubte Vervielfältigung, Verbreitung, Übersetzung oder anderweitige Nutzung, auch auszugsweise, ist ohne ausdrückliche schriftliche Genehmigung der Autorin untersagt.</w:t>
+        <w:t>Alle Inhalte dieses Buches, also Texte, Konzepte, Zitate, Strukturen und Begriffe wie „Das Funktions-Ich“, sind urheberrechtlich geschützt. Die unerlaubte Vervielfältigung, Verbreitung, Übersetzung oder anderweitige Nutzung, auch auszugsweise, ist ohne ausdrückliche schriftliche Genehmigung der Autorin untersagt.</w:t>
       </w:r>
     </w:p>
     <w:p>
@@ -17872,7 +17887,7 @@
         <w:rPr>
           <w:sz w:val="18"/>
         </w:rPr>
-        <w:t>Die Bezeichnungen „Safe to Thrive" und „Das Funktions-Ich" sind Bezeichnungen der Autorin. Die kommerzielle Nutzung ohne schriftliche Genehmigung ist nicht gestattet.</w:t>
+        <w:t>Die Bezeichnungen „Safe to Thrive“ und „Das Funktions-Ich“ sind Bezeichnungen der Autorin. Die kommerzielle Nutzung ohne schriftliche Genehmigung ist nicht gestattet.</w:t>
       </w:r>
     </w:p>
     <w:p>

</xml_diff>

<commit_message>
Buch 6: Word-Fusszeile mit Seitenzahl und Herz, letzte 8 Kommafehler behoben
</commit_message>
<xml_diff>
--- a/outputs/buch6/buch6-MANUSKRIPT.docx
+++ b/outputs/buch6/buch6-MANUSKRIPT.docx
@@ -2199,6 +2199,17 @@
       </w:hyperlink>
     </w:p>
     <w:p>
+      <w:pPr>
+        <w:sectPr>
+          <w:footerReference w:type="default" r:id="rId9"/>
+          <w:pgSz w:w="8391" w:h="11906"/>
+          <w:pgMar w:top="1247" w:right="1077" w:bottom="1247" w:left="1077" w:header="720" w:footer="720" w:gutter="0"/>
+          <w:cols w:space="720"/>
+          <w:docGrid w:linePitch="360"/>
+        </w:sectPr>
+      </w:pPr>
+    </w:p>
+    <w:p>
       <w:r>
         <w:fldChar w:fldCharType="end"/>
       </w:r>
@@ -2322,7 +2333,15 @@
         <w:jc w:val="both"/>
       </w:pPr>
       <w:r>
-        <w:t>Du sagst „Macht nichts“, obwohl es doch etwas macht.</w:t>
+        <w:t xml:space="preserve">Du sagst „Macht </w:t>
+      </w:r>
+      <w:proofErr w:type="gramStart"/>
+      <w:r>
+        <w:t>nichts“</w:t>
+      </w:r>
+      <w:proofErr w:type="gramEnd"/>
+      <w:r>
+        <w:t>, obwohl es doch etwas macht.</w:t>
       </w:r>
     </w:p>
     <w:p>
@@ -2364,8 +2383,13 @@
         <w:jc w:val="both"/>
       </w:pPr>
       <w:r>
-        <w:t>Nicht „Wie lange noch bis zum Urlaub.“</w:t>
-      </w:r>
+        <w:t xml:space="preserve">Nicht „Wie lange noch bis zum </w:t>
+      </w:r>
+      <w:proofErr w:type="gramStart"/>
+      <w:r>
+        <w:t>Urlaub.“</w:t>
+      </w:r>
+      <w:proofErr w:type="gramEnd"/>
     </w:p>
     <w:p>
       <w:pPr>
@@ -2397,7 +2421,7 @@
         <w:jc w:val="both"/>
       </w:pPr>
       <w:r>
-        <w:t>Ich habe einen Namen für das was du gerade lebst.</w:t>
+        <w:t>Ich habe einen Namen für das, was du gerade lebst.</w:t>
       </w:r>
     </w:p>
     <w:p>
@@ -2450,7 +2474,15 @@
         <w:jc w:val="both"/>
       </w:pPr>
       <w:r>
-        <w:t>Der immer weiss, was die anderen brauchen.</w:t>
+        <w:t xml:space="preserve">Der immer weiss, </w:t>
+      </w:r>
+      <w:proofErr w:type="gramStart"/>
+      <w:r>
+        <w:t>was die</w:t>
+      </w:r>
+      <w:proofErr w:type="gramEnd"/>
+      <w:r>
+        <w:t xml:space="preserve"> anderen brauchen.</w:t>
       </w:r>
     </w:p>
     <w:p>
@@ -2816,7 +2848,15 @@
         <w:jc w:val="both"/>
       </w:pPr>
       <w:r>
-        <w:t>6. Ich weine an Orten, an denen mich niemand sieht.</w:t>
+        <w:t xml:space="preserve">6. Ich weine an Orten, </w:t>
+      </w:r>
+      <w:proofErr w:type="gramStart"/>
+      <w:r>
+        <w:t>an</w:t>
+      </w:r>
+      <w:proofErr w:type="gramEnd"/>
+      <w:r>
+        <w:t xml:space="preserve"> denen mich niemand sieht.</w:t>
       </w:r>
     </w:p>
     <w:p>
@@ -3042,8 +3082,33 @@
           <w:b/>
           <w:i/>
         </w:rPr>
-        <w:t>„Es gibt Tage, an denen du nicht mal ein Buch lesen kannst. Diese Seite ist für genau die.“</w:t>
-      </w:r>
+        <w:t xml:space="preserve">„Es gibt Tage, </w:t>
+      </w:r>
+      <w:proofErr w:type="gramStart"/>
+      <w:r>
+        <w:rPr>
+          <w:b/>
+          <w:i/>
+        </w:rPr>
+        <w:t>an</w:t>
+      </w:r>
+      <w:proofErr w:type="gramEnd"/>
+      <w:r>
+        <w:rPr>
+          <w:b/>
+          <w:i/>
+        </w:rPr>
+        <w:t xml:space="preserve"> denen du nicht mal ein Buch lesen kannst. Diese Seite ist für genau </w:t>
+      </w:r>
+      <w:proofErr w:type="gramStart"/>
+      <w:r>
+        <w:rPr>
+          <w:b/>
+          <w:i/>
+        </w:rPr>
+        <w:t>die.“</w:t>
+      </w:r>
+      <w:proofErr w:type="gramEnd"/>
     </w:p>
     <w:p>
       <w:pPr>
@@ -3071,7 +3136,15 @@
         <w:jc w:val="both"/>
       </w:pPr>
       <w:r>
-        <w:t>Es gibt Tage, an denen du davon nichts kannst.</w:t>
+        <w:t xml:space="preserve">Es gibt Tage, </w:t>
+      </w:r>
+      <w:proofErr w:type="gramStart"/>
+      <w:r>
+        <w:t>an</w:t>
+      </w:r>
+      <w:proofErr w:type="gramEnd"/>
+      <w:r>
+        <w:t xml:space="preserve"> denen du davon nichts kannst.</w:t>
       </w:r>
     </w:p>
     <w:p>
@@ -3160,7 +3233,15 @@
         <w:jc w:val="both"/>
       </w:pPr>
       <w:r>
-        <w:t>Das löst nichts. Es holt dich nur aus dem Kopf zurück in den Körper.</w:t>
+        <w:t xml:space="preserve">Das löst nichts. Es </w:t>
+      </w:r>
+      <w:proofErr w:type="gramStart"/>
+      <w:r>
+        <w:t>holt</w:t>
+      </w:r>
+      <w:proofErr w:type="gramEnd"/>
+      <w:r>
+        <w:t xml:space="preserve"> dich nur aus dem Kopf zurück in den Körper.</w:t>
       </w:r>
     </w:p>
     <w:p>
@@ -3483,7 +3564,23 @@
           <w:i/>
           <w:sz w:val="22"/>
         </w:rPr>
-        <w:t>Du siehst dich. Vielleicht zum ersten Mal.</w:t>
+        <w:t xml:space="preserve">Du siehst </w:t>
+      </w:r>
+      <w:proofErr w:type="gramStart"/>
+      <w:r>
+        <w:rPr>
+          <w:i/>
+          <w:sz w:val="22"/>
+        </w:rPr>
+        <w:t>dich</w:t>
+      </w:r>
+      <w:proofErr w:type="gramEnd"/>
+      <w:r>
+        <w:rPr>
+          <w:i/>
+          <w:sz w:val="22"/>
+        </w:rPr>
+        <w:t>. Vielleicht zum ersten Mal.</w:t>
       </w:r>
     </w:p>
     <w:p>
@@ -3591,8 +3688,17 @@
           <w:b/>
           <w:i/>
         </w:rPr>
-        <w:t>„Du funktionierst. Aber du lebst nicht. Das ist kein Burnout. Das ist das Funktions-Ich.“</w:t>
-      </w:r>
+        <w:t>„Du funktionierst. Aber du lebst nicht. Das ist kein Burnout. Das ist das Funktions-</w:t>
+      </w:r>
+      <w:proofErr w:type="gramStart"/>
+      <w:r>
+        <w:rPr>
+          <w:b/>
+          <w:i/>
+        </w:rPr>
+        <w:t>Ich.“</w:t>
+      </w:r>
+      <w:proofErr w:type="gramEnd"/>
     </w:p>
     <w:p>
       <w:pPr>
@@ -3726,24 +3832,39 @@
       </w:pPr>
       <w:r>
         <w:lastRenderedPageBreak/>
-        <w:t>„Du schaffst das.“</w:t>
-      </w:r>
-    </w:p>
-    <w:p>
-      <w:pPr>
-        <w:jc w:val="both"/>
-      </w:pPr>
-      <w:r>
-        <w:t>„Du bist so stark.“</w:t>
-      </w:r>
-    </w:p>
-    <w:p>
-      <w:pPr>
-        <w:jc w:val="both"/>
-      </w:pPr>
-      <w:r>
-        <w:t>„Wie machst du das bloss?“</w:t>
-      </w:r>
+        <w:t xml:space="preserve">„Du schaffst </w:t>
+      </w:r>
+      <w:proofErr w:type="gramStart"/>
+      <w:r>
+        <w:t>das.“</w:t>
+      </w:r>
+      <w:proofErr w:type="gramEnd"/>
+    </w:p>
+    <w:p>
+      <w:pPr>
+        <w:jc w:val="both"/>
+      </w:pPr>
+      <w:r>
+        <w:t xml:space="preserve">„Du bist so </w:t>
+      </w:r>
+      <w:proofErr w:type="gramStart"/>
+      <w:r>
+        <w:t>stark.“</w:t>
+      </w:r>
+      <w:proofErr w:type="gramEnd"/>
+    </w:p>
+    <w:p>
+      <w:pPr>
+        <w:jc w:val="both"/>
+      </w:pPr>
+      <w:r>
+        <w:t xml:space="preserve">„Wie machst du das </w:t>
+      </w:r>
+      <w:proofErr w:type="gramStart"/>
+      <w:r>
+        <w:t>bloss?“</w:t>
+      </w:r>
+      <w:proofErr w:type="gramEnd"/>
     </w:p>
     <w:p>
       <w:pPr>
@@ -3829,8 +3950,13 @@
         <w:jc w:val="both"/>
       </w:pPr>
       <w:r>
-        <w:t>Sie sass mir gegenüber und sagte: „Mir geht es ja gut. Alle sagen das.“</w:t>
-      </w:r>
+        <w:t xml:space="preserve">Sie sass mir gegenüber und sagte: „Mir geht es ja gut. Alle sagen </w:t>
+      </w:r>
+      <w:proofErr w:type="gramStart"/>
+      <w:r>
+        <w:t>das.“</w:t>
+      </w:r>
+      <w:proofErr w:type="gramEnd"/>
     </w:p>
     <w:p>
       <w:pPr>
@@ -3868,8 +3994,13 @@
         <w:jc w:val="both"/>
       </w:pPr>
       <w:r>
-        <w:t>„Ich glaube, ich bin einfach müde.“</w:t>
-      </w:r>
+        <w:t xml:space="preserve">„Ich glaube, ich bin einfach </w:t>
+      </w:r>
+      <w:proofErr w:type="gramStart"/>
+      <w:r>
+        <w:t>müde.“</w:t>
+      </w:r>
+      <w:proofErr w:type="gramEnd"/>
     </w:p>
     <w:p>
       <w:pPr>
@@ -3895,8 +4026,13 @@
         <w:jc w:val="both"/>
       </w:pPr>
       <w:r>
-        <w:t>„Von allem.“</w:t>
-      </w:r>
+        <w:t xml:space="preserve">„Von </w:t>
+      </w:r>
+      <w:proofErr w:type="gramStart"/>
+      <w:r>
+        <w:t>allem.“</w:t>
+      </w:r>
+      <w:proofErr w:type="gramEnd"/>
     </w:p>
     <w:p>
       <w:pPr>
@@ -4086,7 +4222,15 @@
         <w:jc w:val="both"/>
       </w:pPr>
       <w:r>
-        <w:t>Stark zu sein hat dich lange beschützt.</w:t>
+        <w:t xml:space="preserve">Stark zu sein hat </w:t>
+      </w:r>
+      <w:proofErr w:type="gramStart"/>
+      <w:r>
+        <w:t>dich</w:t>
+      </w:r>
+      <w:proofErr w:type="gramEnd"/>
+      <w:r>
+        <w:t xml:space="preserve"> lange beschützt.</w:t>
       </w:r>
     </w:p>
     <w:p>
@@ -4171,7 +4315,23 @@
           <w:i/>
           <w:sz w:val="21"/>
         </w:rPr>
-        <w:t>Auch wenn die Antwort „Weiss ich nicht mehr“ ist.</w:t>
+        <w:t xml:space="preserve">Auch wenn die Antwort „Weiss ich nicht </w:t>
+      </w:r>
+      <w:proofErr w:type="gramStart"/>
+      <w:r>
+        <w:rPr>
+          <w:i/>
+          <w:sz w:val="21"/>
+        </w:rPr>
+        <w:t>mehr“ ist</w:t>
+      </w:r>
+      <w:proofErr w:type="gramEnd"/>
+      <w:r>
+        <w:rPr>
+          <w:i/>
+          <w:sz w:val="21"/>
+        </w:rPr>
+        <w:t>.</w:t>
       </w:r>
       <w:r>
         <w:br/>
@@ -4229,8 +4389,17 @@
           <w:b/>
           <w:i/>
         </w:rPr>
-        <w:t>„Wer immer stark ist, wird irgendwann unsichtbar.“</w:t>
-      </w:r>
+        <w:t xml:space="preserve">„Wer immer stark ist, wird irgendwann </w:t>
+      </w:r>
+      <w:proofErr w:type="gramStart"/>
+      <w:r>
+        <w:rPr>
+          <w:b/>
+          <w:i/>
+        </w:rPr>
+        <w:t>unsichtbar.“</w:t>
+      </w:r>
+      <w:proofErr w:type="gramEnd"/>
     </w:p>
     <w:p>
       <w:pPr>
@@ -4466,16 +4635,29 @@
         <w:jc w:val="both"/>
       </w:pPr>
       <w:r>
-        <w:t>„Ich weiss gar nicht ab wann das angefangen hat“, sagte sie.</w:t>
-      </w:r>
-    </w:p>
-    <w:p>
-      <w:pPr>
-        <w:jc w:val="both"/>
-      </w:pPr>
-      <w:r>
-        <w:t>„Es gab keinen Anfang. Es war einfach so.“</w:t>
-      </w:r>
+        <w:t xml:space="preserve">„Ich weiss gar nicht ab wann das angefangen </w:t>
+      </w:r>
+      <w:proofErr w:type="gramStart"/>
+      <w:r>
+        <w:t>hat“</w:t>
+      </w:r>
+      <w:proofErr w:type="gramEnd"/>
+      <w:r>
+        <w:t>, sagte sie.</w:t>
+      </w:r>
+    </w:p>
+    <w:p>
+      <w:pPr>
+        <w:jc w:val="both"/>
+      </w:pPr>
+      <w:r>
+        <w:t xml:space="preserve">„Es gab keinen Anfang. Es war einfach </w:t>
+      </w:r>
+      <w:proofErr w:type="gramStart"/>
+      <w:r>
+        <w:t>so.“</w:t>
+      </w:r>
+      <w:proofErr w:type="gramEnd"/>
     </w:p>
     <w:p>
       <w:pPr>
@@ -4513,8 +4695,13 @@
         <w:jc w:val="both"/>
       </w:pPr>
       <w:r>
-        <w:t>„Nein. Die haben das gar nicht gemerkt. Ich hab’s ja gemacht.“</w:t>
-      </w:r>
+        <w:t xml:space="preserve">„Nein. Die haben das gar nicht gemerkt. Ich hab’s ja </w:t>
+      </w:r>
+      <w:proofErr w:type="gramStart"/>
+      <w:r>
+        <w:t>gemacht.“</w:t>
+      </w:r>
+      <w:proofErr w:type="gramEnd"/>
     </w:p>
     <w:p>
       <w:pPr>
@@ -4662,12 +4849,23 @@
     </w:p>
     <w:p>
       <w:pPr>
+        <w:spacing w:after="85"/>
+      </w:pPr>
+    </w:p>
+    <w:p>
+      <w:pPr>
+        <w:spacing w:after="85"/>
+      </w:pPr>
+    </w:p>
+    <w:p>
+      <w:pPr>
         <w:jc w:val="both"/>
       </w:pPr>
       <w:r>
         <w:rPr>
           <w:b/>
         </w:rPr>
+        <w:lastRenderedPageBreak/>
         <w:t>Reflexion</w:t>
       </w:r>
     </w:p>
@@ -4681,28 +4879,23 @@
           <w:i/>
           <w:sz w:val="21"/>
         </w:rPr>
-        <w:t>Denk an die letzte Woche.</w:t>
-      </w:r>
-      <w:r>
-        <w:br/>
-      </w:r>
+        <w:t xml:space="preserve">Denk </w:t>
+      </w:r>
+      <w:proofErr w:type="gramStart"/>
       <w:r>
         <w:rPr>
           <w:i/>
           <w:sz w:val="21"/>
         </w:rPr>
-        <w:t xml:space="preserve">Wer hat dich gefragt, wie es dir geht? Und wirklich auf die </w:t>
-      </w:r>
+        <w:t>an</w:t>
+      </w:r>
+      <w:proofErr w:type="gramEnd"/>
       <w:r>
         <w:rPr>
           <w:i/>
           <w:sz w:val="21"/>
         </w:rPr>
-        <w:lastRenderedPageBreak/>
-        <w:t>Antwort gewartet?</w:t>
-      </w:r>
-      <w:r>
-        <w:br/>
+        <w:t xml:space="preserve"> die letzte Woche.</w:t>
       </w:r>
       <w:r>
         <w:br/>
@@ -4712,17 +4905,62 @@
           <w:i/>
           <w:sz w:val="21"/>
         </w:rPr>
-        <w:t>Hast du die Frage ehrlich beantwortet?</w:t>
-      </w:r>
-      <w:r>
-        <w:br/>
-      </w:r>
+        <w:t xml:space="preserve">Wer hat </w:t>
+      </w:r>
+      <w:proofErr w:type="gramStart"/>
       <w:r>
         <w:rPr>
           <w:i/>
           <w:sz w:val="21"/>
         </w:rPr>
-        <w:t>Oder hast du gesagt „Gut, danke“?</w:t>
+        <w:t>dich</w:t>
+      </w:r>
+      <w:proofErr w:type="gramEnd"/>
+      <w:r>
+        <w:rPr>
+          <w:i/>
+          <w:sz w:val="21"/>
+        </w:rPr>
+        <w:t xml:space="preserve"> gefragt, wie es dir geht? Und wirklich auf die Antwort gewartet?</w:t>
+      </w:r>
+      <w:r>
+        <w:br/>
+      </w:r>
+      <w:r>
+        <w:br/>
+      </w:r>
+      <w:r>
+        <w:rPr>
+          <w:i/>
+          <w:sz w:val="21"/>
+        </w:rPr>
+        <w:t>Hast du die Frage ehrlich beantwortet?</w:t>
+      </w:r>
+      <w:r>
+        <w:br/>
+      </w:r>
+      <w:r>
+        <w:rPr>
+          <w:i/>
+          <w:sz w:val="21"/>
+        </w:rPr>
+        <w:t xml:space="preserve">Oder hast du gesagt „Gut, </w:t>
+      </w:r>
+      <w:proofErr w:type="gramStart"/>
+      <w:r>
+        <w:rPr>
+          <w:i/>
+          <w:sz w:val="21"/>
+        </w:rPr>
+        <w:t>danke“</w:t>
+      </w:r>
+      <w:proofErr w:type="gramEnd"/>
+      <w:r>
+        <w:rPr>
+          <w:i/>
+          <w:sz w:val="21"/>
+        </w:rPr>
+        <w:t>?</w:t>
       </w:r>
       <w:r>
         <w:br/>
@@ -4783,8 +5021,16 @@
           <w:b/>
           <w:i/>
         </w:rPr>
-        <w:t>„Wenn Schlaf dich nicht mehr erholt, liegt es nicht an deinem Körper. Es liegt an dem was du trägst.“</w:t>
-      </w:r>
+        <w:t>„Wenn Schlaf dich nicht mehr erholt, liegt es nicht an deinem Körper. Es liegt an dem, was du trägst.“</w:t>
+      </w:r>
+      <w:proofErr w:type="gramStart"/>
+      <w:r>
+        <w:rPr>
+          <w:b/>
+          <w:i/>
+        </w:rPr>
+      </w:r>
+      <w:proofErr w:type="gramEnd"/>
     </w:p>
     <w:p>
       <w:pPr>
@@ -4871,8 +5117,13 @@
       <w:pPr>
         <w:jc w:val="both"/>
       </w:pPr>
-      <w:r>
-        <w:t>Also gehst du zum Arzt.</w:t>
+      <w:proofErr w:type="gramStart"/>
+      <w:r>
+        <w:t>Also</w:t>
+      </w:r>
+      <w:proofErr w:type="gramEnd"/>
+      <w:r>
+        <w:t xml:space="preserve"> gehst du zum Arzt.</w:t>
       </w:r>
     </w:p>
     <w:p>
@@ -4906,8 +5157,29 @@
         <w:jc w:val="both"/>
       </w:pPr>
       <w:r>
-        <w:t>„Sie sind gesund“, sagt er.</w:t>
-      </w:r>
+        <w:t xml:space="preserve">„Sie sind </w:t>
+      </w:r>
+      <w:proofErr w:type="gramStart"/>
+      <w:r>
+        <w:t>gesund“</w:t>
+      </w:r>
+      <w:proofErr w:type="gramEnd"/>
+      <w:r>
+        <w:t xml:space="preserve">, </w:t>
+      </w:r>
+      <w:proofErr w:type="gramStart"/>
+      <w:r>
+        <w:t>sagt</w:t>
+      </w:r>
+      <w:proofErr w:type="gramEnd"/>
+      <w:r>
+        <w:t xml:space="preserve"> er</w:t>
+      </w:r>
+      <w:proofErr w:type="gramStart"/>
+      <w:r>
+        <w:t>.</w:t>
+      </w:r>
+      <w:proofErr w:type="gramEnd"/>
     </w:p>
     <w:p>
       <w:pPr>
@@ -5095,8 +5367,13 @@
         <w:jc w:val="both"/>
       </w:pPr>
       <w:r>
-        <w:t>„Ich bin doch nicht krank. Ich bin nur müde. Aber ich bin es seit Jahren.“</w:t>
-      </w:r>
+        <w:t xml:space="preserve">„Ich bin doch nicht krank. Ich bin nur müde. Aber ich bin es seit </w:t>
+      </w:r>
+      <w:proofErr w:type="gramStart"/>
+      <w:r>
+        <w:t>Jahren.“</w:t>
+      </w:r>
+      <w:proofErr w:type="gramEnd"/>
     </w:p>
     <w:p>
       <w:pPr>
@@ -5134,8 +5411,13 @@
         <w:jc w:val="both"/>
       </w:pPr>
       <w:r>
-        <w:t>„Zweitausendfünfzehn. Da war ich zwei Wochen alleine in den Bergen.“</w:t>
-      </w:r>
+        <w:t xml:space="preserve">„Zweitausendfünfzehn. Da war ich zwei Wochen alleine in den </w:t>
+      </w:r>
+      <w:proofErr w:type="gramStart"/>
+      <w:r>
+        <w:t>Bergen.“</w:t>
+      </w:r>
+      <w:proofErr w:type="gramEnd"/>
     </w:p>
     <w:p>
       <w:pPr>
@@ -5334,24 +5616,65 @@
     </w:p>
     <w:p>
       <w:pPr>
-        <w:spacing w:after="142"/>
-      </w:pPr>
-    </w:p>
-    <w:p>
-      <w:pPr>
-        <w:spacing w:after="85"/>
-      </w:pPr>
-    </w:p>
-    <w:p>
-      <w:pPr>
-        <w:jc w:val="both"/>
-      </w:pPr>
-      <w:r>
+        <w:jc w:val="both"/>
         <w:rPr>
           <w:b/>
         </w:rPr>
+      </w:pPr>
+    </w:p>
+    <w:p>
+      <w:pPr>
+        <w:jc w:val="both"/>
+        <w:rPr>
+          <w:b/>
+        </w:rPr>
+      </w:pPr>
+    </w:p>
+    <w:p>
+      <w:pPr>
+        <w:jc w:val="both"/>
+        <w:rPr>
+          <w:b/>
+        </w:rPr>
+      </w:pPr>
+    </w:p>
+    <w:p>
+      <w:pPr>
+        <w:jc w:val="both"/>
+        <w:rPr>
+          <w:b/>
+        </w:rPr>
+      </w:pPr>
+    </w:p>
+    <w:p>
+      <w:pPr>
+        <w:jc w:val="both"/>
+        <w:rPr>
+          <w:b/>
+        </w:rPr>
+      </w:pPr>
+    </w:p>
+    <w:p>
+      <w:pPr>
+        <w:jc w:val="both"/>
+        <w:rPr>
+          <w:b/>
+        </w:rPr>
+      </w:pPr>
+    </w:p>
+    <w:p>
+      <w:pPr>
+        <w:jc w:val="both"/>
+      </w:pPr>
+      <w:proofErr w:type="spellStart"/>
+      <w:r>
+        <w:rPr>
+          <w:b/>
+        </w:rPr>
+        <w:lastRenderedPageBreak/>
         <w:t>Reflexion</w:t>
       </w:r>
+      <w:proofErr w:type="spellEnd"/>
     </w:p>
     <w:p>
       <w:pPr>
@@ -5386,8 +5709,23 @@
           <w:i/>
           <w:sz w:val="21"/>
         </w:rPr>
-        <w:lastRenderedPageBreak/>
-        <w:t>Schreib drei Dinge auf, an die nur du denkst.</w:t>
+        <w:t xml:space="preserve">Schreib drei Dinge auf, </w:t>
+      </w:r>
+      <w:proofErr w:type="gramStart"/>
+      <w:r>
+        <w:rPr>
+          <w:i/>
+          <w:sz w:val="21"/>
+        </w:rPr>
+        <w:t>an</w:t>
+      </w:r>
+      <w:proofErr w:type="gramEnd"/>
+      <w:r>
+        <w:rPr>
+          <w:i/>
+          <w:sz w:val="21"/>
+        </w:rPr>
+        <w:t xml:space="preserve"> die nur du denkst.</w:t>
       </w:r>
       <w:r>
         <w:br/>
@@ -5458,8 +5796,17 @@
           <w:b/>
           <w:i/>
         </w:rPr>
-        <w:t>„Stark sein war nie deine Persönlichkeit. Es war deine Überlebensstrategie.“</w:t>
-      </w:r>
+        <w:t xml:space="preserve">„Stark sein war nie deine Persönlichkeit. Es war deine </w:t>
+      </w:r>
+      <w:proofErr w:type="gramStart"/>
+      <w:r>
+        <w:rPr>
+          <w:b/>
+          <w:i/>
+        </w:rPr>
+        <w:t>Überlebensstrategie.“</w:t>
+      </w:r>
+      <w:proofErr w:type="gramEnd"/>
     </w:p>
     <w:p>
       <w:pPr>
@@ -5471,8 +5818,13 @@
         <w:jc w:val="both"/>
       </w:pPr>
       <w:r>
-        <w:t>„Ich bin halt so.“</w:t>
-      </w:r>
+        <w:t xml:space="preserve">„Ich bin halt </w:t>
+      </w:r>
+      <w:proofErr w:type="gramStart"/>
+      <w:r>
+        <w:t>so.“</w:t>
+      </w:r>
+      <w:proofErr w:type="gramEnd"/>
     </w:p>
     <w:p>
       <w:pPr>
@@ -5789,7 +6141,15 @@
         <w:jc w:val="both"/>
       </w:pPr>
       <w:r>
-        <w:t>Warum sie sich schuldig fühlt, wenn sie an sich denkt.</w:t>
+        <w:t xml:space="preserve">Warum sie sich schuldig fühlt, wenn sie </w:t>
+      </w:r>
+      <w:proofErr w:type="gramStart"/>
+      <w:r>
+        <w:t>an</w:t>
+      </w:r>
+      <w:proofErr w:type="gramEnd"/>
+      <w:r>
+        <w:t xml:space="preserve"> sich denkt.</w:t>
       </w:r>
     </w:p>
     <w:p>
@@ -5989,7 +6349,7 @@
           <w:i/>
           <w:sz w:val="21"/>
         </w:rPr>
-        <w:t>Glaubst du noch heute dass du stark sein MUSST?</w:t>
+        <w:t>Glaubst du noch heute, dass du stark sein MUSST?</w:t>
       </w:r>
       <w:r>
         <w:br/>
@@ -6148,8 +6508,17 @@
           <w:b/>
           <w:i/>
         </w:rPr>
-        <w:t>„Jemand fragt, was du willst. Und du stockst. Das ist der Moment, in dem du merkst, dass du weg bist.“</w:t>
-      </w:r>
+        <w:t xml:space="preserve">„Jemand fragt, was du willst. Und du stockst. Das ist der Moment, in dem du merkst, dass du weg </w:t>
+      </w:r>
+      <w:proofErr w:type="gramStart"/>
+      <w:r>
+        <w:rPr>
+          <w:b/>
+          <w:i/>
+        </w:rPr>
+        <w:t>bist.“</w:t>
+      </w:r>
+      <w:proofErr w:type="gramEnd"/>
     </w:p>
     <w:p>
       <w:pPr>
@@ -6211,8 +6580,13 @@
         <w:jc w:val="both"/>
       </w:pPr>
       <w:r>
-        <w:t>„Keine Ahnung. Was willst du?“</w:t>
-      </w:r>
+        <w:t xml:space="preserve">„Keine Ahnung. Was willst </w:t>
+      </w:r>
+      <w:proofErr w:type="gramStart"/>
+      <w:r>
+        <w:t>du?“</w:t>
+      </w:r>
+      <w:proofErr w:type="gramEnd"/>
     </w:p>
     <w:p>
       <w:pPr>
@@ -6367,8 +6741,21 @@
         <w:jc w:val="both"/>
       </w:pPr>
       <w:r>
-        <w:t>Ihr Freund hatte gesagt: „Ich weiss nicht wer du bist. Du passt dich immer an.“</w:t>
-      </w:r>
+        <w:t xml:space="preserve">Ihr Freund hatte </w:t>
+      </w:r>
+      <w:proofErr w:type="gramStart"/>
+      <w:r>
+        <w:t>gesagt: „</w:t>
+      </w:r>
+      <w:proofErr w:type="gramEnd"/>
+      <w:r>
+        <w:t xml:space="preserve">Ich weiss nicht wer du bist. Du passt dich immer </w:t>
+      </w:r>
+      <w:proofErr w:type="gramStart"/>
+      <w:r>
+        <w:t>an.“</w:t>
+      </w:r>
+      <w:proofErr w:type="gramEnd"/>
     </w:p>
     <w:p>
       <w:pPr>
@@ -6435,8 +6822,13 @@
         <w:jc w:val="both"/>
       </w:pPr>
       <w:r>
-        <w:t>„Früher hat mir Malen gefallen. Aber das mache ich seit Jahren nicht mehr.“</w:t>
-      </w:r>
+        <w:t xml:space="preserve">„Früher hat mir Malen gefallen. Aber das mache ich seit Jahren nicht </w:t>
+      </w:r>
+      <w:proofErr w:type="gramStart"/>
+      <w:r>
+        <w:t>mehr.“</w:t>
+      </w:r>
+      <w:proofErr w:type="gramEnd"/>
     </w:p>
     <w:p>
       <w:pPr>
@@ -6461,8 +6853,13 @@
         <w:jc w:val="both"/>
       </w:pPr>
       <w:r>
-        <w:t>„Es hat sich selfish angefühlt. Stundenlang malen, während andere Dinge warten.“</w:t>
-      </w:r>
+        <w:t xml:space="preserve">„Es hat sich selfish angefühlt. Stundenlang malen, während andere Dinge </w:t>
+      </w:r>
+      <w:proofErr w:type="gramStart"/>
+      <w:r>
+        <w:t>warten.“</w:t>
+      </w:r>
+      <w:proofErr w:type="gramEnd"/>
     </w:p>
     <w:p>
       <w:pPr>
@@ -6487,7 +6884,15 @@
         <w:jc w:val="both"/>
       </w:pPr>
       <w:r>
-        <w:t>Das Wort, das starke Frauen benutzen, wenn sie an sich denken.</w:t>
+        <w:t xml:space="preserve">Das Wort, das starke Frauen benutzen, wenn sie </w:t>
+      </w:r>
+      <w:proofErr w:type="gramStart"/>
+      <w:r>
+        <w:t>an</w:t>
+      </w:r>
+      <w:proofErr w:type="gramEnd"/>
+      <w:r>
+        <w:t xml:space="preserve"> sich denken.</w:t>
       </w:r>
     </w:p>
     <w:p>
@@ -6695,7 +7100,7 @@
           <w:b/>
           <w:i/>
         </w:rPr>
-        <w:t>„Du weinst im Auto, damit niemand es sieht. Das sagt alles.“</w:t>
+        <w:t xml:space="preserve">„Du weinst im Auto, damit niemand es sieht. Das </w:t>
       </w:r>
       <w:proofErr w:type="spellStart"/>
       <w:r>
@@ -6703,6 +7108,7 @@
           <w:b/>
           <w:i/>
         </w:rPr>
+        <w:t>sagt</w:t>
       </w:r>
       <w:proofErr w:type="spellEnd"/>
       <w:r>
@@ -6710,13 +7116,16 @@
           <w:b/>
           <w:i/>
         </w:rPr>
+        <w:t xml:space="preserve"> </w:t>
       </w:r>
       <w:proofErr w:type="spellStart"/>
+      <w:proofErr w:type="gramStart"/>
       <w:r>
         <w:rPr>
           <w:b/>
           <w:i/>
         </w:rPr>
+        <w:t>alles</w:t>
       </w:r>
       <w:proofErr w:type="spellEnd"/>
       <w:r>
@@ -6724,95 +7133,9 @@
           <w:b/>
           <w:i/>
         </w:rPr>
-      </w:r>
-      <w:r>
-        <w:rPr>
-          <w:b/>
-          <w:i/>
-        </w:rPr>
-      </w:r>
-      <w:proofErr w:type="spellStart"/>
-      <w:r>
-        <w:rPr>
-          <w:b/>
-          <w:i/>
-        </w:rPr>
-      </w:r>
-      <w:proofErr w:type="spellEnd"/>
-      <w:r>
-        <w:rPr>
-          <w:b/>
-          <w:i/>
-        </w:rPr>
-      </w:r>
-      <w:proofErr w:type="spellStart"/>
-      <w:r>
-        <w:rPr>
-          <w:b/>
-          <w:i/>
-        </w:rPr>
-      </w:r>
-      <w:proofErr w:type="spellEnd"/>
-      <w:r>
-        <w:rPr>
-          <w:b/>
-          <w:i/>
-        </w:rPr>
-      </w:r>
-      <w:proofErr w:type="spellStart"/>
-      <w:r>
-        <w:rPr>
-          <w:b/>
-          <w:i/>
-        </w:rPr>
-      </w:r>
-      <w:proofErr w:type="spellEnd"/>
-      <w:r>
-        <w:rPr>
-          <w:b/>
-          <w:i/>
-        </w:rPr>
-      </w:r>
-      <w:r>
-        <w:rPr>
-          <w:b/>
-          <w:i/>
-        </w:rPr>
-      </w:r>
-      <w:r>
-        <w:rPr>
-          <w:b/>
-          <w:i/>
-        </w:rPr>
-      </w:r>
-      <w:proofErr w:type="spellStart"/>
-      <w:r>
-        <w:rPr>
-          <w:b/>
-          <w:i/>
-        </w:rPr>
-      </w:r>
-      <w:proofErr w:type="spellEnd"/>
-      <w:r>
-        <w:rPr>
-          <w:b/>
-          <w:i/>
-        </w:rPr>
-      </w:r>
-      <w:proofErr w:type="spellStart"/>
-      <w:r>
-        <w:rPr>
-          <w:b/>
-          <w:i/>
-        </w:rPr>
-      </w:r>
-      <w:proofErr w:type="spellEnd"/>
-      <w:r>
-        <w:rPr>
-          <w:b/>
-          <w:i/>
-        </w:rPr>
-      </w:r>
+        <w:t>.“</w:t>
+      </w:r>
+      <w:proofErr w:type="gramEnd"/>
     </w:p>
     <w:p>
       <w:pPr>
@@ -6858,24 +7181,39 @@
         <w:jc w:val="both"/>
       </w:pPr>
       <w:r>
-        <w:t>„Im Auto kann ich sein wie ich bin.“</w:t>
-      </w:r>
-    </w:p>
-    <w:p>
-      <w:pPr>
-        <w:jc w:val="both"/>
-      </w:pPr>
-      <w:r>
-        <w:t>„Ich sitze manchmal noch fünf Minuten da, bevor ich reingehe.“</w:t>
-      </w:r>
-    </w:p>
-    <w:p>
-      <w:pPr>
-        <w:jc w:val="both"/>
-      </w:pPr>
-      <w:r>
-        <w:t>„Im Auto weine ich. Damit niemand es sieht.“</w:t>
-      </w:r>
+        <w:t xml:space="preserve">„Im Auto kann ich sein wie ich </w:t>
+      </w:r>
+      <w:proofErr w:type="gramStart"/>
+      <w:r>
+        <w:t>bin.“</w:t>
+      </w:r>
+      <w:proofErr w:type="gramEnd"/>
+    </w:p>
+    <w:p>
+      <w:pPr>
+        <w:jc w:val="both"/>
+      </w:pPr>
+      <w:r>
+        <w:t xml:space="preserve">„Ich sitze manchmal noch fünf Minuten da, bevor ich </w:t>
+      </w:r>
+      <w:proofErr w:type="gramStart"/>
+      <w:r>
+        <w:t>reingehe.“</w:t>
+      </w:r>
+      <w:proofErr w:type="gramEnd"/>
+    </w:p>
+    <w:p>
+      <w:pPr>
+        <w:jc w:val="both"/>
+      </w:pPr>
+      <w:r>
+        <w:t xml:space="preserve">„Im Auto weine ich. Damit niemand es </w:t>
+      </w:r>
+      <w:proofErr w:type="gramStart"/>
+      <w:r>
+        <w:t>sieht.“</w:t>
+      </w:r>
+      <w:proofErr w:type="gramEnd"/>
     </w:p>
     <w:p>
       <w:pPr>
@@ -6916,7 +7254,15 @@
         <w:jc w:val="both"/>
       </w:pPr>
       <w:r>
-        <w:t>Keinen Ort in deinem eigenen Leben an dem du sein darfst wie du bist.</w:t>
+        <w:t xml:space="preserve">Keinen Ort in deinem eigenen Leben </w:t>
+      </w:r>
+      <w:proofErr w:type="gramStart"/>
+      <w:r>
+        <w:t>an</w:t>
+      </w:r>
+      <w:proofErr w:type="gramEnd"/>
+      <w:r>
+        <w:t xml:space="preserve"> dem du sein darfst wie du bist.</w:t>
       </w:r>
     </w:p>
     <w:p>
@@ -7299,7 +7645,7 @@
           <w:i/>
           <w:sz w:val="21"/>
         </w:rPr>
-        <w:t>Was kommt wenn niemand schaut?</w:t>
+        <w:t>Was kommt, wenn niemand schaut?</w:t>
       </w:r>
       <w:r>
         <w:br/>
@@ -7360,8 +7706,17 @@
           <w:b/>
           <w:i/>
         </w:rPr>
-        <w:t>„Du machst nicht alles alleine, weil du es besser kannst. Sondern weil bitten sich gefährlicher anfühlt als tragen.“</w:t>
-      </w:r>
+        <w:t xml:space="preserve">„Du machst nicht alles alleine, weil du es besser kannst. Sondern weil bitten sich gefährlicher anfühlt als </w:t>
+      </w:r>
+      <w:proofErr w:type="gramStart"/>
+      <w:r>
+        <w:rPr>
+          <w:b/>
+          <w:i/>
+        </w:rPr>
+        <w:t>tragen.“</w:t>
+      </w:r>
+      <w:proofErr w:type="gramEnd"/>
     </w:p>
     <w:p>
       <w:pPr>
@@ -7373,8 +7728,13 @@
         <w:jc w:val="both"/>
       </w:pPr>
       <w:r>
-        <w:t>„Ich mach das schnell selbst.“</w:t>
-      </w:r>
+        <w:t xml:space="preserve">„Ich mach das schnell </w:t>
+      </w:r>
+      <w:proofErr w:type="gramStart"/>
+      <w:r>
+        <w:t>selbst.“</w:t>
+      </w:r>
+      <w:proofErr w:type="gramEnd"/>
     </w:p>
     <w:p>
       <w:pPr>
@@ -7594,8 +7954,21 @@
         <w:jc w:val="both"/>
       </w:pPr>
       <w:r>
-        <w:t>„Bei uns läuft alles über mich“, sagte Bettina. „Aber ich beschwere mich nicht.“</w:t>
-      </w:r>
+        <w:t xml:space="preserve">„Bei uns läuft alles über </w:t>
+      </w:r>
+      <w:proofErr w:type="gramStart"/>
+      <w:r>
+        <w:t>mich“</w:t>
+      </w:r>
+      <w:proofErr w:type="gramEnd"/>
+      <w:r>
+        <w:t xml:space="preserve">, sagte Bettina. „Aber ich beschwere mich </w:t>
+      </w:r>
+      <w:proofErr w:type="gramStart"/>
+      <w:r>
+        <w:t>nicht.“</w:t>
+      </w:r>
+      <w:proofErr w:type="gramEnd"/>
     </w:p>
     <w:p>
       <w:pPr>
@@ -7620,8 +7993,13 @@
         <w:jc w:val="both"/>
       </w:pPr>
       <w:r>
-        <w:t>„Nein. Aber sie sehen es ja.“</w:t>
-      </w:r>
+        <w:t xml:space="preserve">„Nein. Aber sie sehen es </w:t>
+      </w:r>
+      <w:proofErr w:type="gramStart"/>
+      <w:r>
+        <w:t>ja.“</w:t>
+      </w:r>
+      <w:proofErr w:type="gramEnd"/>
     </w:p>
     <w:p>
       <w:pPr>
@@ -7660,8 +8038,13 @@
         <w:jc w:val="both"/>
       </w:pPr>
       <w:r>
-        <w:t>„Wahrscheinlich nicht. Ich mache es ja so, dass man es nicht sieht.“</w:t>
-      </w:r>
+        <w:t xml:space="preserve">„Wahrscheinlich nicht. Ich mache es ja so, dass man es nicht </w:t>
+      </w:r>
+      <w:proofErr w:type="gramStart"/>
+      <w:r>
+        <w:t>sieht.“</w:t>
+      </w:r>
+      <w:proofErr w:type="gramEnd"/>
     </w:p>
     <w:p>
       <w:pPr>
@@ -7843,8 +8226,13 @@
       <w:pPr>
         <w:jc w:val="both"/>
       </w:pPr>
-      <w:r>
-        <w:t>Also probier es klein.</w:t>
+      <w:proofErr w:type="gramStart"/>
+      <w:r>
+        <w:t>Also</w:t>
+      </w:r>
+      <w:proofErr w:type="gramEnd"/>
+      <w:r>
+        <w:t xml:space="preserve"> probier es klein.</w:t>
       </w:r>
     </w:p>
     <w:p>
@@ -8014,8 +8402,17 @@
           <w:b/>
           <w:i/>
         </w:rPr>
-        <w:t>„Das Nein, das sich falsch anfühlt, ist meistens das richtige. Das Gefühl ist alt, nicht wahr.“</w:t>
-      </w:r>
+        <w:t xml:space="preserve">„Das Nein, das sich falsch anfühlt, ist meistens das richtige. Das Gefühl ist alt, nicht </w:t>
+      </w:r>
+      <w:proofErr w:type="gramStart"/>
+      <w:r>
+        <w:rPr>
+          <w:b/>
+          <w:i/>
+        </w:rPr>
+        <w:t>wahr.“</w:t>
+      </w:r>
+      <w:proofErr w:type="gramEnd"/>
     </w:p>
     <w:p>
       <w:pPr>
@@ -8082,7 +8479,15 @@
         <w:jc w:val="both"/>
       </w:pPr>
       <w:r>
-        <w:t>Noch bevor die andere Person reagiert hat.</w:t>
+        <w:t xml:space="preserve">Noch </w:t>
+      </w:r>
+      <w:proofErr w:type="gramStart"/>
+      <w:r>
+        <w:t>bevor</w:t>
+      </w:r>
+      <w:proofErr w:type="gramEnd"/>
+      <w:r>
+        <w:t xml:space="preserve"> die andere Person reagiert hat.</w:t>
       </w:r>
     </w:p>
     <w:p>
@@ -8182,8 +8587,13 @@
       <w:pPr>
         <w:jc w:val="both"/>
       </w:pPr>
-      <w:r>
-        <w:t>Also schluckt es das Nein.</w:t>
+      <w:proofErr w:type="gramStart"/>
+      <w:r>
+        <w:t>Also</w:t>
+      </w:r>
+      <w:proofErr w:type="gramEnd"/>
+      <w:r>
+        <w:t xml:space="preserve"> schluckt es das Nein.</w:t>
       </w:r>
     </w:p>
     <w:p>
@@ -8342,8 +8752,13 @@
         <w:jc w:val="both"/>
       </w:pPr>
       <w:r>
-        <w:t>„Es fühlt sich an als würde ich gleich bestraft.“</w:t>
-      </w:r>
+        <w:t xml:space="preserve">„Es fühlt sich an als würde ich gleich </w:t>
+      </w:r>
+      <w:proofErr w:type="gramStart"/>
+      <w:r>
+        <w:t>bestraft.“</w:t>
+      </w:r>
+      <w:proofErr w:type="gramEnd"/>
     </w:p>
     <w:p>
       <w:pPr>
@@ -8455,8 +8870,13 @@
         <w:jc w:val="both"/>
       </w:pPr>
       <w:r>
-        <w:t>„Das geht für mich gerade nicht.“</w:t>
-      </w:r>
+        <w:t xml:space="preserve">„Das geht für mich gerade </w:t>
+      </w:r>
+      <w:proofErr w:type="gramStart"/>
+      <w:r>
+        <w:t>nicht.“</w:t>
+      </w:r>
+      <w:proofErr w:type="gramEnd"/>
     </w:p>
     <w:p>
       <w:pPr>
@@ -8564,7 +8984,7 @@
           <w:i/>
           <w:sz w:val="21"/>
         </w:rPr>
-        <w:t>Nur sehen dass es da ist.</w:t>
+        <w:t>Nur sehen, dass es da ist.</w:t>
       </w:r>
     </w:p>
     <w:p>
@@ -8622,7 +9042,21 @@
         <w:rPr>
           <w:sz w:val="22"/>
         </w:rPr>
-        <w:t>Der Tag an dem ich aufgehört habe, stark zu sein</w:t>
+        <w:t xml:space="preserve">Der Tag </w:t>
+      </w:r>
+      <w:proofErr w:type="gramStart"/>
+      <w:r>
+        <w:rPr>
+          <w:sz w:val="22"/>
+        </w:rPr>
+        <w:t>an</w:t>
+      </w:r>
+      <w:proofErr w:type="gramEnd"/>
+      <w:r>
+        <w:rPr>
+          <w:sz w:val="22"/>
+        </w:rPr>
+        <w:t xml:space="preserve"> dem ich aufgehört habe, stark zu sein</w:t>
       </w:r>
     </w:p>
     <w:p>
@@ -8673,7 +9107,25 @@
           <w:sz w:val="28"/>
         </w:rPr>
         <w:lastRenderedPageBreak/>
-        <w:t>Kapitel 9: Der Tag an dem ich aufgehört habe, stark zu sein</w:t>
+        <w:t xml:space="preserve">Kapitel 9: Der Tag </w:t>
+      </w:r>
+      <w:proofErr w:type="gramStart"/>
+      <w:r>
+        <w:rPr>
+          <w:rFonts w:ascii="Times New Roman" w:hAnsi="Times New Roman"/>
+          <w:color w:val="000000"/>
+          <w:sz w:val="28"/>
+        </w:rPr>
+        <w:t>an</w:t>
+      </w:r>
+      <w:proofErr w:type="gramEnd"/>
+      <w:r>
+        <w:rPr>
+          <w:rFonts w:ascii="Times New Roman" w:hAnsi="Times New Roman"/>
+          <w:color w:val="000000"/>
+          <w:sz w:val="28"/>
+        </w:rPr>
+        <w:t xml:space="preserve"> dem ich aufgehört habe, stark zu sein</w:t>
       </w:r>
       <w:bookmarkEnd w:id="11"/>
     </w:p>
@@ -8701,8 +9153,17 @@
           <w:b/>
           <w:i/>
         </w:rPr>
-        <w:t>„Der mutigste Moment ist nicht der Zusammenbruch. Es ist der Satz danach: So nicht mehr.“</w:t>
-      </w:r>
+        <w:t xml:space="preserve">„Der mutigste Moment ist nicht der Zusammenbruch. Es ist der Satz danach: So nicht </w:t>
+      </w:r>
+      <w:proofErr w:type="gramStart"/>
+      <w:r>
+        <w:rPr>
+          <w:b/>
+          <w:i/>
+        </w:rPr>
+        <w:t>mehr.“</w:t>
+      </w:r>
+      <w:proofErr w:type="gramEnd"/>
     </w:p>
     <w:p>
       <w:pPr>
@@ -8840,7 +9301,15 @@
         <w:jc w:val="both"/>
       </w:pPr>
       <w:r>
-        <w:t>Sechs Termine an dem Tag. Sechs Menschen. Sechs Geschichten.</w:t>
+        <w:t xml:space="preserve">Sechs Termine </w:t>
+      </w:r>
+      <w:proofErr w:type="gramStart"/>
+      <w:r>
+        <w:t>an</w:t>
+      </w:r>
+      <w:proofErr w:type="gramEnd"/>
+      <w:r>
+        <w:t xml:space="preserve"> dem Tag. Sechs Menschen. Sechs Geschichten.</w:t>
       </w:r>
     </w:p>
     <w:p>
@@ -8903,7 +9372,15 @@
         <w:jc w:val="both"/>
       </w:pPr>
       <w:r>
-        <w:t>Ich stand einfach da.</w:t>
+        <w:t xml:space="preserve">Ich stand einfach </w:t>
+      </w:r>
+      <w:proofErr w:type="gramStart"/>
+      <w:r>
+        <w:t>da</w:t>
+      </w:r>
+      <w:proofErr w:type="gramEnd"/>
+      <w:r>
+        <w:t>.</w:t>
       </w:r>
     </w:p>
     <w:p>
@@ -9082,15 +9559,15 @@
         <w:jc w:val="both"/>
       </w:pPr>
       <w:r>
-        <w:t>Nicht der Moment wo alles zusammenbricht.</w:t>
-      </w:r>
-    </w:p>
-    <w:p>
-      <w:pPr>
-        <w:jc w:val="both"/>
-      </w:pPr>
-      <w:r>
-        <w:t>Der Moment wo du aufhörst so zu tun als wäre alles in Ordnung.</w:t>
+        <w:t>Nicht der Moment, wo alles zusammenbricht.</w:t>
+      </w:r>
+    </w:p>
+    <w:p>
+      <w:pPr>
+        <w:jc w:val="both"/>
+      </w:pPr>
+      <w:r>
+        <w:t>Der Moment, wo du aufhörst, so zu tun, als wäre alles in Ordnung.</w:t>
       </w:r>
     </w:p>
     <w:p>
@@ -9111,8 +9588,13 @@
         <w:jc w:val="both"/>
       </w:pPr>
       <w:r>
-        <w:t>„Ihr Körper macht das nicht mehr mit.“</w:t>
-      </w:r>
+        <w:t xml:space="preserve">„Ihr Körper macht das nicht mehr </w:t>
+      </w:r>
+      <w:proofErr w:type="gramStart"/>
+      <w:r>
+        <w:t>mit.“</w:t>
+      </w:r>
+      <w:proofErr w:type="gramEnd"/>
     </w:p>
     <w:p>
       <w:pPr>
@@ -9175,8 +9657,13 @@
         <w:jc w:val="both"/>
       </w:pPr>
       <w:r>
-        <w:t>„Mama, bist du eigentlich glücklich?“</w:t>
-      </w:r>
+        <w:t xml:space="preserve">„Mama, bist du eigentlich </w:t>
+      </w:r>
+      <w:proofErr w:type="gramStart"/>
+      <w:r>
+        <w:t>glücklich?“</w:t>
+      </w:r>
+      <w:proofErr w:type="gramEnd"/>
     </w:p>
     <w:p>
       <w:pPr>
@@ -9204,7 +9691,15 @@
         <w:jc w:val="both"/>
       </w:pPr>
       <w:r>
-        <w:t>Weil sie nicht wusste, was die Frage mit ihr machte.</w:t>
+        <w:t xml:space="preserve">Weil sie nicht wusste, </w:t>
+      </w:r>
+      <w:proofErr w:type="gramStart"/>
+      <w:r>
+        <w:t>was die</w:t>
+      </w:r>
+      <w:proofErr w:type="gramEnd"/>
+      <w:r>
+        <w:t xml:space="preserve"> Frage mit ihr machte.</w:t>
       </w:r>
     </w:p>
     <w:p>
@@ -9251,16 +9746,26 @@
         <w:jc w:val="both"/>
       </w:pPr>
       <w:r>
-        <w:t>Der Moment in dem du aufhörst zu sagen: „Mir geht es gut.“</w:t>
-      </w:r>
-    </w:p>
-    <w:p>
-      <w:pPr>
-        <w:jc w:val="both"/>
-      </w:pPr>
-      <w:r>
-        <w:t>Und anfängst zu sagen: „Ich weiss nicht wie es mir geht. Aber ich will es herausfinden.“</w:t>
-      </w:r>
+        <w:t xml:space="preserve">Der Moment in dem du aufhörst zu sagen: „Mir geht es </w:t>
+      </w:r>
+      <w:proofErr w:type="gramStart"/>
+      <w:r>
+        <w:t>gut.“</w:t>
+      </w:r>
+      <w:proofErr w:type="gramEnd"/>
+    </w:p>
+    <w:p>
+      <w:pPr>
+        <w:jc w:val="both"/>
+      </w:pPr>
+      <w:r>
+        <w:t xml:space="preserve">Und anfängst zu sagen: „Ich weiss nicht wie es mir geht. Aber ich will es </w:t>
+      </w:r>
+      <w:proofErr w:type="gramStart"/>
+      <w:r>
+        <w:t>herausfinden.“</w:t>
+      </w:r>
+      <w:proofErr w:type="gramEnd"/>
     </w:p>
     <w:p>
       <w:pPr>
@@ -9398,8 +9903,17 @@
           <w:b/>
           <w:i/>
         </w:rPr>
-        <w:t>„Dein schlechtes Gewissen zeigt dir nicht, was falsch ist. Es zeigt dir nur, was ungewohnt ist.“</w:t>
-      </w:r>
+        <w:t xml:space="preserve">„Dein schlechtes Gewissen zeigt dir nicht, was falsch ist. Es zeigt dir nur, was ungewohnt </w:t>
+      </w:r>
+      <w:proofErr w:type="gramStart"/>
+      <w:r>
+        <w:rPr>
+          <w:b/>
+          <w:i/>
+        </w:rPr>
+        <w:t>ist.“</w:t>
+      </w:r>
+      <w:proofErr w:type="gramEnd"/>
     </w:p>
     <w:p>
       <w:pPr>
@@ -9736,8 +10250,13 @@
         <w:jc w:val="both"/>
       </w:pPr>
       <w:r>
-        <w:t>„Ich habe nach zwanzig Minuten bezahlt und bin heim. Ich hielt es nicht aus.“</w:t>
-      </w:r>
+        <w:t xml:space="preserve">„Ich habe nach zwanzig Minuten bezahlt und bin heim. Ich hielt es nicht </w:t>
+      </w:r>
+      <w:proofErr w:type="gramStart"/>
+      <w:r>
+        <w:t>aus.“</w:t>
+      </w:r>
+      <w:proofErr w:type="gramEnd"/>
     </w:p>
     <w:p>
       <w:pPr>
@@ -9762,8 +10281,13 @@
         <w:jc w:val="both"/>
       </w:pPr>
       <w:r>
-        <w:t>„Nein. Gar nichts. Es war alles völlig ruhig.“</w:t>
-      </w:r>
+        <w:t xml:space="preserve">„Nein. Gar nichts. Es war alles völlig </w:t>
+      </w:r>
+      <w:proofErr w:type="gramStart"/>
+      <w:r>
+        <w:t>ruhig.“</w:t>
+      </w:r>
+      <w:proofErr w:type="gramEnd"/>
     </w:p>
     <w:p>
       <w:pPr>
@@ -10124,8 +10648,17 @@
           <w:b/>
           <w:i/>
         </w:rPr>
-        <w:t>„Die Erlaubnis aufzuhören bekommst du von niemandem. Ausser von dir selbst.“</w:t>
-      </w:r>
+        <w:t xml:space="preserve">„Die Erlaubnis aufzuhören bekommst du von niemandem. Ausser von dir </w:t>
+      </w:r>
+      <w:proofErr w:type="gramStart"/>
+      <w:r>
+        <w:rPr>
+          <w:b/>
+          <w:i/>
+        </w:rPr>
+        <w:t>selbst.“</w:t>
+      </w:r>
+      <w:proofErr w:type="gramEnd"/>
     </w:p>
     <w:p>
       <w:pPr>
@@ -10288,7 +10821,15 @@
         <w:jc w:val="both"/>
       </w:pPr>
       <w:r>
-        <w:t>Was „aufhören“ wirklich bedeutet:</w:t>
+        <w:t>Was „</w:t>
+      </w:r>
+      <w:proofErr w:type="gramStart"/>
+      <w:r>
+        <w:t>aufhören“ wirklich</w:t>
+      </w:r>
+      <w:proofErr w:type="gramEnd"/>
+      <w:r>
+        <w:t xml:space="preserve"> bedeutet:</w:t>
       </w:r>
     </w:p>
     <w:p>
@@ -10383,8 +10924,13 @@
         <w:jc w:val="both"/>
       </w:pPr>
       <w:r>
-        <w:t>„Ich weiss nicht mehr wie ich aufhöre.“</w:t>
-      </w:r>
+        <w:t xml:space="preserve">„Ich weiss nicht mehr wie ich </w:t>
+      </w:r>
+      <w:proofErr w:type="gramStart"/>
+      <w:r>
+        <w:t>aufhöre.“</w:t>
+      </w:r>
+      <w:proofErr w:type="gramEnd"/>
     </w:p>
     <w:p>
       <w:pPr>
@@ -10409,8 +10955,13 @@
         <w:jc w:val="both"/>
       </w:pPr>
       <w:r>
-        <w:t>„Ich weiss, wie man anfängt. Wie man durchhält. Wie man mehr gibt. Aber aufhören. Das hab ich nie gelernt.“</w:t>
-      </w:r>
+        <w:t xml:space="preserve">„Ich weiss, wie man anfängt. Wie man durchhält. Wie man mehr gibt. Aber aufhören. Das hab ich nie </w:t>
+      </w:r>
+      <w:proofErr w:type="gramStart"/>
+      <w:r>
+        <w:t>gelernt.“</w:t>
+      </w:r>
+      <w:proofErr w:type="gramEnd"/>
     </w:p>
     <w:p>
       <w:pPr>
@@ -10429,8 +10980,13 @@
       <w:pPr>
         <w:jc w:val="both"/>
       </w:pPr>
-      <w:r>
-        <w:t>Man kann sie lernen. Auch mit fünfzig noch.</w:t>
+      <w:proofErr w:type="gramStart"/>
+      <w:r>
+        <w:t>Man</w:t>
+      </w:r>
+      <w:proofErr w:type="gramEnd"/>
+      <w:r>
+        <w:t xml:space="preserve"> kann sie lernen. Auch mit fünfzig noch.</w:t>
       </w:r>
     </w:p>
     <w:p>
@@ -10853,8 +11409,17 @@
           <w:b/>
           <w:i/>
         </w:rPr>
-        <w:t>„Du weisst, was alle anderen brauchen. Frag dich einmal am Tag, was du brauchst. Nur einmal.“</w:t>
-      </w:r>
+        <w:t xml:space="preserve">„Du weisst, was alle anderen brauchen. Frag dich einmal am Tag, was du brauchst. Nur </w:t>
+      </w:r>
+      <w:proofErr w:type="gramStart"/>
+      <w:r>
+        <w:rPr>
+          <w:b/>
+          <w:i/>
+        </w:rPr>
+        <w:t>einmal.“</w:t>
+      </w:r>
+      <w:proofErr w:type="gramEnd"/>
     </w:p>
     <w:p>
       <w:pPr>
@@ -10866,7 +11431,15 @@
         <w:jc w:val="both"/>
       </w:pPr>
       <w:r>
-        <w:t>Ich spreche nicht gerne von „Bedürfnissen“.</w:t>
+        <w:t>Ich spreche nicht gerne von „</w:t>
+      </w:r>
+      <w:proofErr w:type="gramStart"/>
+      <w:r>
+        <w:t>Bedürfnissen“</w:t>
+      </w:r>
+      <w:proofErr w:type="gramEnd"/>
+      <w:r>
+        <w:t>.</w:t>
       </w:r>
     </w:p>
     <w:p>
@@ -11141,24 +11714,39 @@
       </w:pPr>
       <w:r>
         <w:lastRenderedPageBreak/>
-        <w:t>„Ich brauche gerade kurz eine Pause.“</w:t>
-      </w:r>
-    </w:p>
-    <w:p>
-      <w:pPr>
-        <w:jc w:val="both"/>
-      </w:pPr>
-      <w:r>
-        <w:t>„Ich brauche heute Abend Zeit für mich.“</w:t>
-      </w:r>
-    </w:p>
-    <w:p>
-      <w:pPr>
-        <w:jc w:val="both"/>
-      </w:pPr>
-      <w:r>
-        <w:t>„Ich brauche deine Hilfe.“</w:t>
-      </w:r>
+        <w:t xml:space="preserve">„Ich brauche gerade kurz eine </w:t>
+      </w:r>
+      <w:proofErr w:type="gramStart"/>
+      <w:r>
+        <w:t>Pause.“</w:t>
+      </w:r>
+      <w:proofErr w:type="gramEnd"/>
+    </w:p>
+    <w:p>
+      <w:pPr>
+        <w:jc w:val="both"/>
+      </w:pPr>
+      <w:r>
+        <w:t xml:space="preserve">„Ich brauche heute Abend Zeit für </w:t>
+      </w:r>
+      <w:proofErr w:type="gramStart"/>
+      <w:r>
+        <w:t>mich.“</w:t>
+      </w:r>
+      <w:proofErr w:type="gramEnd"/>
+    </w:p>
+    <w:p>
+      <w:pPr>
+        <w:jc w:val="both"/>
+      </w:pPr>
+      <w:r>
+        <w:t xml:space="preserve">„Ich brauche deine </w:t>
+      </w:r>
+      <w:proofErr w:type="gramStart"/>
+      <w:r>
+        <w:t>Hilfe.“</w:t>
+      </w:r>
+      <w:proofErr w:type="gramEnd"/>
     </w:p>
     <w:p>
       <w:pPr>
@@ -11403,8 +11991,17 @@
           <w:b/>
           <w:i/>
         </w:rPr>
-        <w:t>„Du brauchst keinen Grund. Kein Aber. Kein Weil. Nein ist ein vollständiger Satz.“</w:t>
-      </w:r>
+        <w:t xml:space="preserve">„Du brauchst keinen Grund. Kein Aber. Kein Weil. Nein ist ein vollständiger </w:t>
+      </w:r>
+      <w:proofErr w:type="gramStart"/>
+      <w:r>
+        <w:rPr>
+          <w:b/>
+          <w:i/>
+        </w:rPr>
+        <w:t>Satz.“</w:t>
+      </w:r>
+      <w:proofErr w:type="gramEnd"/>
     </w:p>
     <w:p>
       <w:pPr>
@@ -11455,8 +12052,13 @@
         <w:jc w:val="both"/>
       </w:pPr>
       <w:r>
-        <w:t>„Das geht für mich gerade nicht.“</w:t>
-      </w:r>
+        <w:t xml:space="preserve">„Das geht für mich gerade </w:t>
+      </w:r>
+      <w:proofErr w:type="gramStart"/>
+      <w:r>
+        <w:t>nicht.“</w:t>
+      </w:r>
+      <w:proofErr w:type="gramEnd"/>
     </w:p>
     <w:p>
       <w:pPr>
@@ -11481,7 +12083,15 @@
         <w:jc w:val="both"/>
       </w:pPr>
       <w:r>
-        <w:t>Kein „aber ich wünschte ich könnte“ hinten dran.</w:t>
+        <w:t xml:space="preserve">Kein „aber ich wünschte ich </w:t>
+      </w:r>
+      <w:proofErr w:type="gramStart"/>
+      <w:r>
+        <w:t>könnte“ hinten</w:t>
+      </w:r>
+      <w:proofErr w:type="gramEnd"/>
+      <w:r>
+        <w:t xml:space="preserve"> dran.</w:t>
       </w:r>
     </w:p>
     <w:p>
@@ -11502,8 +12112,13 @@
         <w:jc w:val="both"/>
       </w:pPr>
       <w:r>
-        <w:t>Nur: „Das geht für mich gerade nicht.“</w:t>
-      </w:r>
+        <w:t xml:space="preserve">Nur: „Das geht für mich gerade </w:t>
+      </w:r>
+      <w:proofErr w:type="gramStart"/>
+      <w:r>
+        <w:t>nicht.“</w:t>
+      </w:r>
+      <w:proofErr w:type="gramEnd"/>
     </w:p>
     <w:p>
       <w:pPr>
@@ -11693,7 +12308,15 @@
       </w:pPr>
       <w:r>
         <w:lastRenderedPageBreak/>
-        <w:t>Fang dort an wo es sicher ist.</w:t>
+        <w:t xml:space="preserve">Fang dort </w:t>
+      </w:r>
+      <w:proofErr w:type="gramStart"/>
+      <w:r>
+        <w:t>an</w:t>
+      </w:r>
+      <w:proofErr w:type="gramEnd"/>
+      <w:r>
+        <w:t xml:space="preserve"> wo es sicher ist.</w:t>
       </w:r>
     </w:p>
     <w:p>
@@ -11900,7 +12523,7 @@
           <w:i/>
           <w:sz w:val="21"/>
         </w:rPr>
-        <w:t>Was wäre der schlimmste Fall wenn du es sagst?</w:t>
+        <w:t>Was wäre der schlimmste Fall, wenn du es sagst?</w:t>
       </w:r>
       <w:r>
         <w:br/>
@@ -12002,8 +12625,17 @@
           <w:b/>
           <w:i/>
         </w:rPr>
-        <w:t>. Das Problem ist der Satz danach.“</w:t>
-      </w:r>
+        <w:t xml:space="preserve">. Das Problem ist der Satz </w:t>
+      </w:r>
+      <w:proofErr w:type="gramStart"/>
+      <w:r>
+        <w:rPr>
+          <w:b/>
+          <w:i/>
+        </w:rPr>
+        <w:t>danach.“</w:t>
+      </w:r>
+      <w:proofErr w:type="gramEnd"/>
     </w:p>
     <w:p>
       <w:pPr>
@@ -12096,8 +12728,13 @@
         <w:jc w:val="both"/>
       </w:pPr>
       <w:r>
-        <w:t>„Warum denn nicht? Du hast doch sonst immer Zeit.“</w:t>
-      </w:r>
+        <w:t xml:space="preserve">„Warum denn nicht? Du hast doch sonst immer </w:t>
+      </w:r>
+      <w:proofErr w:type="gramStart"/>
+      <w:r>
+        <w:t>Zeit.“</w:t>
+      </w:r>
+      <w:proofErr w:type="gramEnd"/>
     </w:p>
     <w:p>
       <w:pPr>
@@ -12134,22 +12771,32 @@
       <w:pPr>
         <w:jc w:val="both"/>
       </w:pPr>
-      <w:r>
-        <w:t>Also gib keinen Grund. Wiederhol deinen Satz.</w:t>
-      </w:r>
-    </w:p>
-    <w:p>
-      <w:pPr>
-        <w:spacing w:after="71"/>
-      </w:pPr>
-    </w:p>
-    <w:p>
-      <w:pPr>
-        <w:jc w:val="both"/>
-      </w:pPr>
-      <w:r>
-        <w:t>„Es geht diesmal einfach nicht.“</w:t>
-      </w:r>
+      <w:proofErr w:type="gramStart"/>
+      <w:r>
+        <w:t>Also</w:t>
+      </w:r>
+      <w:proofErr w:type="gramEnd"/>
+      <w:r>
+        <w:t xml:space="preserve"> gib keinen Grund. Wiederhol deinen Satz.</w:t>
+      </w:r>
+    </w:p>
+    <w:p>
+      <w:pPr>
+        <w:spacing w:after="71"/>
+      </w:pPr>
+    </w:p>
+    <w:p>
+      <w:pPr>
+        <w:jc w:val="both"/>
+      </w:pPr>
+      <w:r>
+        <w:t xml:space="preserve">„Es geht diesmal einfach </w:t>
+      </w:r>
+      <w:proofErr w:type="gramStart"/>
+      <w:r>
+        <w:t>nicht.“</w:t>
+      </w:r>
+      <w:proofErr w:type="gramEnd"/>
     </w:p>
     <w:p>
       <w:pPr>
@@ -12174,8 +12821,13 @@
         <w:jc w:val="both"/>
       </w:pPr>
       <w:r>
-        <w:t>„Ich weiss, es kommt ungelegen. Es geht trotzdem nicht.“</w:t>
-      </w:r>
+        <w:t xml:space="preserve">„Ich weiss, es kommt ungelegen. Es geht trotzdem </w:t>
+      </w:r>
+      <w:proofErr w:type="gramStart"/>
+      <w:r>
+        <w:t>nicht.“</w:t>
+      </w:r>
+      <w:proofErr w:type="gramEnd"/>
     </w:p>
     <w:p>
       <w:pPr>
@@ -12234,8 +12886,13 @@
         <w:jc w:val="both"/>
       </w:pPr>
       <w:r>
-        <w:t>„Ich war auch immer für dich da.“</w:t>
-      </w:r>
+        <w:t xml:space="preserve">„Ich war auch immer für dich </w:t>
+      </w:r>
+      <w:proofErr w:type="gramStart"/>
+      <w:r>
+        <w:t>da.“</w:t>
+      </w:r>
+      <w:proofErr w:type="gramEnd"/>
     </w:p>
     <w:p>
       <w:pPr>
@@ -12287,8 +12944,13 @@
         <w:jc w:val="both"/>
       </w:pPr>
       <w:r>
-        <w:t>„Das stimmt, und ich bin dir dankbar dafür. Diesmal geht es trotzdem nicht.“</w:t>
-      </w:r>
+        <w:t xml:space="preserve">„Das stimmt, und ich bin dir dankbar dafür. Diesmal geht es trotzdem </w:t>
+      </w:r>
+      <w:proofErr w:type="gramStart"/>
+      <w:r>
+        <w:t>nicht.“</w:t>
+      </w:r>
+      <w:proofErr w:type="gramEnd"/>
     </w:p>
     <w:p>
       <w:pPr>
@@ -12539,8 +13201,21 @@
       </w:pPr>
       <w:r>
         <w:lastRenderedPageBreak/>
-        <w:t>„Ich hab es gemerkt, während ich geredet habe“, sagte sie. „Und konnte trotzdem nicht aufhören.“</w:t>
-      </w:r>
+        <w:t xml:space="preserve">„Ich hab es gemerkt, während ich geredet </w:t>
+      </w:r>
+      <w:proofErr w:type="gramStart"/>
+      <w:r>
+        <w:t>habe“</w:t>
+      </w:r>
+      <w:proofErr w:type="gramEnd"/>
+      <w:r>
+        <w:t xml:space="preserve">, sagte sie. „Und konnte trotzdem nicht </w:t>
+      </w:r>
+      <w:proofErr w:type="gramStart"/>
+      <w:r>
+        <w:t>aufhören.“</w:t>
+      </w:r>
+      <w:proofErr w:type="gramEnd"/>
     </w:p>
     <w:p>
       <w:pPr>
@@ -12565,8 +13240,13 @@
         <w:jc w:val="both"/>
       </w:pPr>
       <w:r>
-        <w:t>„Es geht diesmal einfach nicht.“</w:t>
-      </w:r>
+        <w:t xml:space="preserve">„Es geht diesmal einfach </w:t>
+      </w:r>
+      <w:proofErr w:type="gramStart"/>
+      <w:r>
+        <w:t>nicht.“</w:t>
+      </w:r>
+      <w:proofErr w:type="gramEnd"/>
     </w:p>
     <w:p>
       <w:pPr>
@@ -12665,7 +13345,23 @@
           <w:sz w:val="21"/>
         </w:rPr>
         <w:br/>
-        <w:t>Und schreib darunter, was die andere Person vermutlich antwortet.</w:t>
+        <w:t xml:space="preserve">Und schreib darunter, </w:t>
+      </w:r>
+      <w:proofErr w:type="gramStart"/>
+      <w:r>
+        <w:rPr>
+          <w:i/>
+          <w:sz w:val="21"/>
+        </w:rPr>
+        <w:t>was die</w:t>
+      </w:r>
+      <w:proofErr w:type="gramEnd"/>
+      <w:r>
+        <w:rPr>
+          <w:i/>
+          <w:sz w:val="21"/>
+        </w:rPr>
+        <w:t xml:space="preserve"> andere Person vermutlich antwortet.</w:t>
       </w:r>
       <w:r>
         <w:rPr>
@@ -12745,8 +13441,17 @@
           <w:b/>
           <w:i/>
         </w:rPr>
-        <w:t>„Du hilfst allen und erwartest nie etwas zurück. Warum gilt das nicht auch für dich?“</w:t>
-      </w:r>
+        <w:t xml:space="preserve">„Du hilfst allen und erwartest nie etwas zurück. Warum gilt das nicht auch für </w:t>
+      </w:r>
+      <w:proofErr w:type="gramStart"/>
+      <w:r>
+        <w:rPr>
+          <w:b/>
+          <w:i/>
+        </w:rPr>
+        <w:t>dich?“</w:t>
+      </w:r>
+      <w:proofErr w:type="gramEnd"/>
     </w:p>
     <w:p>
       <w:pPr>
@@ -12834,7 +13539,15 @@
         <w:jc w:val="both"/>
       </w:pPr>
       <w:r>
-        <w:t>Das war die ganze Zeit dein Schutz.</w:t>
+        <w:t xml:space="preserve">Das war </w:t>
+      </w:r>
+      <w:proofErr w:type="gramStart"/>
+      <w:r>
+        <w:t>die</w:t>
+      </w:r>
+      <w:proofErr w:type="gramEnd"/>
+      <w:r>
+        <w:t xml:space="preserve"> ganze Zeit dein Schutz.</w:t>
       </w:r>
     </w:p>
     <w:p>
@@ -12846,8 +13559,13 @@
       <w:pPr>
         <w:jc w:val="both"/>
       </w:pPr>
-      <w:r>
-        <w:t>Also machst du es anders.</w:t>
+      <w:proofErr w:type="gramStart"/>
+      <w:r>
+        <w:t>Also</w:t>
+      </w:r>
+      <w:proofErr w:type="gramEnd"/>
+      <w:r>
+        <w:t xml:space="preserve"> machst du es anders.</w:t>
       </w:r>
     </w:p>
     <w:p>
@@ -12869,8 +13587,21 @@
         <w:jc w:val="both"/>
       </w:pPr>
       <w:r>
-        <w:t>„Ich habe gerade so viel um die Ohren.“</w:t>
-      </w:r>
+        <w:t xml:space="preserve">„Ich habe gerade so viel um </w:t>
+      </w:r>
+      <w:proofErr w:type="gramStart"/>
+      <w:r>
+        <w:t>die</w:t>
+      </w:r>
+      <w:proofErr w:type="gramEnd"/>
+      <w:r>
+        <w:t xml:space="preserve"> </w:t>
+      </w:r>
+      <w:proofErr w:type="gramStart"/>
+      <w:r>
+        <w:t>Ohren.“</w:t>
+      </w:r>
+      <w:proofErr w:type="gramEnd"/>
     </w:p>
     <w:p>
       <w:pPr>
@@ -12950,8 +13681,13 @@
         <w:jc w:val="both"/>
       </w:pPr>
       <w:r>
-        <w:t>„Sag, hättest du eventuell, nur wenn es wirklich gar kein Problem ist, vielleicht kurz Zeit? Sonst mache ich es auch selbst, ist überhaupt kein Thema.“</w:t>
-      </w:r>
+        <w:t xml:space="preserve">„Sag, hättest du eventuell, nur wenn es wirklich gar kein Problem ist, vielleicht kurz Zeit? Sonst mache ich es auch selbst, ist überhaupt kein </w:t>
+      </w:r>
+      <w:proofErr w:type="gramStart"/>
+      <w:r>
+        <w:t>Thema.“</w:t>
+      </w:r>
+      <w:proofErr w:type="gramEnd"/>
     </w:p>
     <w:p>
       <w:pPr>
@@ -13024,24 +13760,47 @@
         <w:jc w:val="both"/>
       </w:pPr>
       <w:r>
-        <w:t>„Kannst du morgen die Kinder holen?“</w:t>
-      </w:r>
-    </w:p>
-    <w:p>
-      <w:pPr>
-        <w:jc w:val="both"/>
-      </w:pPr>
-      <w:r>
-        <w:t>„Ich brauche Samstag für mich. Übernimmst du?“</w:t>
-      </w:r>
-    </w:p>
-    <w:p>
-      <w:pPr>
-        <w:jc w:val="both"/>
-      </w:pPr>
-      <w:r>
-        <w:t>„Ich schaffe das nicht alleine. Hilfst du mir?“</w:t>
-      </w:r>
+        <w:t xml:space="preserve">„Kannst du morgen </w:t>
+      </w:r>
+      <w:proofErr w:type="gramStart"/>
+      <w:r>
+        <w:t>die</w:t>
+      </w:r>
+      <w:proofErr w:type="gramEnd"/>
+      <w:r>
+        <w:t xml:space="preserve"> Kinder </w:t>
+      </w:r>
+      <w:proofErr w:type="gramStart"/>
+      <w:r>
+        <w:t>holen?“</w:t>
+      </w:r>
+      <w:proofErr w:type="gramEnd"/>
+    </w:p>
+    <w:p>
+      <w:pPr>
+        <w:jc w:val="both"/>
+      </w:pPr>
+      <w:r>
+        <w:t xml:space="preserve">„Ich brauche Samstag für mich. Übernimmst </w:t>
+      </w:r>
+      <w:proofErr w:type="gramStart"/>
+      <w:r>
+        <w:t>du?“</w:t>
+      </w:r>
+      <w:proofErr w:type="gramEnd"/>
+    </w:p>
+    <w:p>
+      <w:pPr>
+        <w:jc w:val="both"/>
+      </w:pPr>
+      <w:r>
+        <w:t xml:space="preserve">„Ich schaffe das nicht alleine. Hilfst du </w:t>
+      </w:r>
+      <w:proofErr w:type="gramStart"/>
+      <w:r>
+        <w:t>mir?“</w:t>
+      </w:r>
+      <w:proofErr w:type="gramEnd"/>
     </w:p>
     <w:p>
       <w:pPr>
@@ -13184,8 +13943,13 @@
         <w:jc w:val="both"/>
       </w:pPr>
       <w:r>
-        <w:t>„Wenn mir jemand hilft, kann ich nicht schlafen bis ich es ausgeglichen habe.“</w:t>
-      </w:r>
+        <w:t xml:space="preserve">„Wenn mir jemand hilft, kann ich nicht schlafen bis ich es ausgeglichen </w:t>
+      </w:r>
+      <w:proofErr w:type="gramStart"/>
+      <w:r>
+        <w:t>habe.“</w:t>
+      </w:r>
+      <w:proofErr w:type="gramEnd"/>
     </w:p>
     <w:p>
       <w:pPr>
@@ -13210,8 +13974,13 @@
         <w:jc w:val="both"/>
       </w:pPr>
       <w:r>
-        <w:t>„Natürlich nicht. Nie.“</w:t>
-      </w:r>
+        <w:t xml:space="preserve">„Natürlich nicht. </w:t>
+      </w:r>
+      <w:proofErr w:type="gramStart"/>
+      <w:r>
+        <w:t>Nie.“</w:t>
+      </w:r>
+      <w:proofErr w:type="gramEnd"/>
     </w:p>
     <w:p>
       <w:pPr>
@@ -13283,7 +14052,15 @@
         <w:jc w:val="both"/>
       </w:pPr>
       <w:r>
-        <w:t>Hat es dich belastet? Oder hat es dir gefallen, gefragt worden zu sein?</w:t>
+        <w:t xml:space="preserve">Hat </w:t>
+      </w:r>
+      <w:proofErr w:type="gramStart"/>
+      <w:r>
+        <w:t>es</w:t>
+      </w:r>
+      <w:proofErr w:type="gramEnd"/>
+      <w:r>
+        <w:t xml:space="preserve"> dich belastet? Oder hat es dir gefallen, gefragt worden zu sein?</w:t>
       </w:r>
     </w:p>
     <w:p>
@@ -13440,7 +14217,39 @@
           <w:i/>
           <w:sz w:val="21"/>
         </w:rPr>
-        <w:t>Ohne „nur wenn“, ohne „sonst mache ich es selbst“.</w:t>
+        <w:t xml:space="preserve">Ohne „nur </w:t>
+      </w:r>
+      <w:proofErr w:type="gramStart"/>
+      <w:r>
+        <w:rPr>
+          <w:i/>
+          <w:sz w:val="21"/>
+        </w:rPr>
+        <w:t>wenn“</w:t>
+      </w:r>
+      <w:proofErr w:type="gramEnd"/>
+      <w:r>
+        <w:rPr>
+          <w:i/>
+          <w:sz w:val="21"/>
+        </w:rPr>
+        <w:t xml:space="preserve">, ohne „sonst mache ich es </w:t>
+      </w:r>
+      <w:proofErr w:type="gramStart"/>
+      <w:r>
+        <w:rPr>
+          <w:i/>
+          <w:sz w:val="21"/>
+        </w:rPr>
+        <w:t>selbst“</w:t>
+      </w:r>
+      <w:proofErr w:type="gramEnd"/>
+      <w:r>
+        <w:rPr>
+          <w:i/>
+          <w:sz w:val="21"/>
+        </w:rPr>
+        <w:t>.</w:t>
       </w:r>
       <w:r>
         <w:br/>
@@ -13511,8 +14320,17 @@
           <w:b/>
           <w:i/>
         </w:rPr>
-        <w:t>„Wenn jemand geht, weil du Grenzen setzt, hat er nie dich geliebt. Nur was du geleistet hast.“</w:t>
-      </w:r>
+        <w:t xml:space="preserve">„Wenn jemand geht, weil du Grenzen setzt, hat er nie dich geliebt. Nur was du geleistet </w:t>
+      </w:r>
+      <w:proofErr w:type="gramStart"/>
+      <w:r>
+        <w:rPr>
+          <w:b/>
+          <w:i/>
+        </w:rPr>
+        <w:t>hast.“</w:t>
+      </w:r>
+      <w:proofErr w:type="gramEnd"/>
     </w:p>
     <w:p>
       <w:pPr>
@@ -13713,7 +14531,15 @@
         <w:jc w:val="both"/>
       </w:pPr>
       <w:r>
-        <w:t>Sie war an dem interessiert was du geleistet hast.</w:t>
+        <w:t xml:space="preserve">Sie war </w:t>
+      </w:r>
+      <w:proofErr w:type="gramStart"/>
+      <w:r>
+        <w:t>an</w:t>
+      </w:r>
+      <w:proofErr w:type="gramEnd"/>
+      <w:r>
+        <w:t xml:space="preserve"> dem interessiert was du geleistet hast.</w:t>
       </w:r>
     </w:p>
     <w:p>
@@ -14018,8 +14844,17 @@
           <w:b/>
           <w:i/>
         </w:rPr>
-        <w:t>„Du brauchst kein neues Leben. Du brauchst vier Wochen und eine einzige Sache pro Woche.“</w:t>
-      </w:r>
+        <w:t xml:space="preserve">„Du brauchst kein neues Leben. Du brauchst vier Wochen und eine einzige Sache pro </w:t>
+      </w:r>
+      <w:proofErr w:type="gramStart"/>
+      <w:r>
+        <w:rPr>
+          <w:b/>
+          <w:i/>
+        </w:rPr>
+        <w:t>Woche.“</w:t>
+      </w:r>
+      <w:proofErr w:type="gramEnd"/>
     </w:p>
     <w:p>
       <w:pPr>
@@ -14034,7 +14869,15 @@
         <w:jc w:val="both"/>
       </w:pPr>
       <w:r>
-        <w:t>Und die Gefahr an diesem Punkt ist immer dieselbe.</w:t>
+        <w:t xml:space="preserve">Und die Gefahr </w:t>
+      </w:r>
+      <w:proofErr w:type="gramStart"/>
+      <w:r>
+        <w:t>an</w:t>
+      </w:r>
+      <w:proofErr w:type="gramEnd"/>
+      <w:r>
+        <w:t xml:space="preserve"> diesem Punkt ist immer dieselbe.</w:t>
       </w:r>
     </w:p>
     <w:p>
@@ -14295,7 +15138,15 @@
         <w:jc w:val="both"/>
       </w:pPr>
       <w:r>
-        <w:t>Such dir die leichteste Stelle. Nicht deine Mutter. Nicht deinen Chef.</w:t>
+        <w:t xml:space="preserve">Such dir </w:t>
+      </w:r>
+      <w:proofErr w:type="gramStart"/>
+      <w:r>
+        <w:t>die</w:t>
+      </w:r>
+      <w:proofErr w:type="gramEnd"/>
+      <w:r>
+        <w:t xml:space="preserve"> leichteste Stelle. Nicht deine Mutter. Nicht deinen Chef.</w:t>
       </w:r>
     </w:p>
     <w:p>
@@ -14412,7 +15263,15 @@
         <w:jc w:val="both"/>
       </w:pPr>
       <w:r>
-        <w:t>Ein Satz. Kein Vorbau, kein „nur wenn es dir wirklich nichts ausmacht“.</w:t>
+        <w:t xml:space="preserve">Ein Satz. Kein Vorbau, kein „nur wenn es dir wirklich nichts </w:t>
+      </w:r>
+      <w:proofErr w:type="gramStart"/>
+      <w:r>
+        <w:t>ausmacht“</w:t>
+      </w:r>
+      <w:proofErr w:type="gramEnd"/>
+      <w:r>
+        <w:t>.</w:t>
       </w:r>
     </w:p>
     <w:p>
@@ -14542,8 +15401,13 @@
       <w:pPr>
         <w:jc w:val="both"/>
       </w:pPr>
-      <w:r>
-        <w:t>Was am Ende zählt:</w:t>
+      <w:proofErr w:type="gramStart"/>
+      <w:r>
+        <w:t>Was am</w:t>
+      </w:r>
+      <w:proofErr w:type="gramEnd"/>
+      <w:r>
+        <w:t xml:space="preserve"> Ende zählt:</w:t>
       </w:r>
     </w:p>
     <w:p>
@@ -14666,7 +15530,39 @@
           <w:sz w:val="21"/>
         </w:rPr>
         <w:br/>
-        <w:t>Nicht „bald“. Nicht „wenn es ruhiger wird“.</w:t>
+        <w:t>Nicht „</w:t>
+      </w:r>
+      <w:proofErr w:type="gramStart"/>
+      <w:r>
+        <w:rPr>
+          <w:i/>
+          <w:sz w:val="21"/>
+        </w:rPr>
+        <w:t>bald“</w:t>
+      </w:r>
+      <w:proofErr w:type="gramEnd"/>
+      <w:r>
+        <w:rPr>
+          <w:i/>
+          <w:sz w:val="21"/>
+        </w:rPr>
+        <w:t xml:space="preserve">. Nicht „wenn es ruhiger </w:t>
+      </w:r>
+      <w:proofErr w:type="gramStart"/>
+      <w:r>
+        <w:rPr>
+          <w:i/>
+          <w:sz w:val="21"/>
+        </w:rPr>
+        <w:t>wird“</w:t>
+      </w:r>
+      <w:proofErr w:type="gramEnd"/>
+      <w:r>
+        <w:rPr>
+          <w:i/>
+          <w:sz w:val="21"/>
+        </w:rPr>
+        <w:t>.</w:t>
       </w:r>
       <w:r>
         <w:rPr>
@@ -14732,6 +15628,7 @@
           <w:color w:val="000000"/>
           <w:sz w:val="32"/>
         </w:rPr>
+        <w:lastRenderedPageBreak/>
         <w:t>SCHRITT 5: WERDEN</w:t>
       </w:r>
       <w:bookmarkEnd w:id="20"/>
@@ -14746,7 +15643,23 @@
           <w:i/>
           <w:sz w:val="22"/>
         </w:rPr>
-        <w:t>Du wirst wieder du. Nicht die alte du. Besser.</w:t>
+        <w:t xml:space="preserve">Du wirst wieder du. Nicht </w:t>
+      </w:r>
+      <w:proofErr w:type="gramStart"/>
+      <w:r>
+        <w:rPr>
+          <w:i/>
+          <w:sz w:val="22"/>
+        </w:rPr>
+        <w:t>die</w:t>
+      </w:r>
+      <w:proofErr w:type="gramEnd"/>
+      <w:r>
+        <w:rPr>
+          <w:i/>
+          <w:sz w:val="22"/>
+        </w:rPr>
+        <w:t xml:space="preserve"> alte du. Besser.</w:t>
       </w:r>
     </w:p>
     <w:p>
@@ -14875,8 +15788,17 @@
           <w:b/>
           <w:i/>
         </w:rPr>
-        <w:t>„Rückfall ist kein Scheitern. Der alte Weg ist nur besser ausgetreten als der neue.“</w:t>
-      </w:r>
+        <w:t xml:space="preserve">„Rückfall ist kein Scheitern. Der alte Weg ist nur besser ausgetreten als der </w:t>
+      </w:r>
+      <w:proofErr w:type="gramStart"/>
+      <w:r>
+        <w:rPr>
+          <w:b/>
+          <w:i/>
+        </w:rPr>
+        <w:t>neue.“</w:t>
+      </w:r>
+      <w:proofErr w:type="gramEnd"/>
     </w:p>
     <w:p>
       <w:pPr>
@@ -15110,7 +16032,15 @@
         <w:jc w:val="both"/>
       </w:pPr>
       <w:r>
-        <w:t>Unter Druck nimmt dein System immer die Autobahn.</w:t>
+        <w:t xml:space="preserve">Unter Druck nimmt dein System immer </w:t>
+      </w:r>
+      <w:proofErr w:type="gramStart"/>
+      <w:r>
+        <w:t>die</w:t>
+      </w:r>
+      <w:proofErr w:type="gramEnd"/>
+      <w:r>
+        <w:t xml:space="preserve"> Autobahn.</w:t>
       </w:r>
     </w:p>
     <w:p>
@@ -15249,8 +16179,13 @@
         <w:jc w:val="both"/>
       </w:pPr>
       <w:r>
-        <w:t>„Ich bin wieder komplett drin. Alles umsonst.“</w:t>
-      </w:r>
+        <w:t xml:space="preserve">„Ich bin wieder komplett drin. Alles </w:t>
+      </w:r>
+      <w:proofErr w:type="gramStart"/>
+      <w:r>
+        <w:t>umsonst.“</w:t>
+      </w:r>
+      <w:proofErr w:type="gramEnd"/>
     </w:p>
     <w:p>
       <w:pPr>
@@ -15275,8 +16210,13 @@
         <w:jc w:val="both"/>
       </w:pPr>
       <w:r>
-        <w:t>„Ungefähr zehn Tage.“</w:t>
-      </w:r>
+        <w:t xml:space="preserve">„Ungefähr zehn </w:t>
+      </w:r>
+      <w:proofErr w:type="gramStart"/>
+      <w:r>
+        <w:t>Tage.“</w:t>
+      </w:r>
+      <w:proofErr w:type="gramEnd"/>
     </w:p>
     <w:p>
       <w:pPr>
@@ -15314,8 +16254,13 @@
         <w:jc w:val="both"/>
       </w:pPr>
       <w:r>
-        <w:t>„Vor einem Jahr habe ich es überhaupt nicht bemerkt.“</w:t>
-      </w:r>
+        <w:t xml:space="preserve">„Vor einem Jahr habe ich es überhaupt nicht </w:t>
+      </w:r>
+      <w:proofErr w:type="gramStart"/>
+      <w:r>
+        <w:t>bemerkt.“</w:t>
+      </w:r>
+      <w:proofErr w:type="gramEnd"/>
     </w:p>
     <w:p>
       <w:pPr>
@@ -15374,8 +16319,13 @@
         <w:jc w:val="both"/>
       </w:pPr>
       <w:r>
-        <w:t>„Ich bin wieder komplett drin. Ich funktioniere nur noch.“</w:t>
-      </w:r>
+        <w:t xml:space="preserve">„Ich bin wieder komplett drin. Ich funktioniere nur </w:t>
+      </w:r>
+      <w:proofErr w:type="gramStart"/>
+      <w:r>
+        <w:t>noch.“</w:t>
+      </w:r>
+      <w:proofErr w:type="gramEnd"/>
     </w:p>
     <w:p>
       <w:pPr>
@@ -15400,8 +16350,13 @@
         <w:jc w:val="both"/>
       </w:pPr>
       <w:r>
-        <w:t>„Nach neun Tagen. Ich stand im Treppenhaus und wusste plötzlich wieder, wie sich das anfühlt.“</w:t>
-      </w:r>
+        <w:t xml:space="preserve">„Nach neun Tagen. Ich stand im Treppenhaus und wusste plötzlich wieder, wie sich das </w:t>
+      </w:r>
+      <w:proofErr w:type="gramStart"/>
+      <w:r>
+        <w:t>anfühlt.“</w:t>
+      </w:r>
+      <w:proofErr w:type="gramEnd"/>
     </w:p>
     <w:p>
       <w:pPr>
@@ -15426,8 +16381,13 @@
         <w:jc w:val="both"/>
       </w:pPr>
       <w:r>
-        <w:t>„Da hätte ich das gar nicht bemerkt. Da wäre das einfach mein Leben gewesen.“</w:t>
-      </w:r>
+        <w:t xml:space="preserve">„Da hätte ich das gar nicht bemerkt. Da wäre das einfach mein Leben </w:t>
+      </w:r>
+      <w:proofErr w:type="gramStart"/>
+      <w:r>
+        <w:t>gewesen.“</w:t>
+      </w:r>
+      <w:proofErr w:type="gramEnd"/>
     </w:p>
     <w:p>
       <w:pPr>
@@ -15465,8 +16425,13 @@
         <w:jc w:val="both"/>
       </w:pPr>
       <w:r>
-        <w:t>„Ich kann Dienstag und Freitag. Die anderen Tage musst du übernehmen.“</w:t>
-      </w:r>
+        <w:t xml:space="preserve">„Ich kann Dienstag und Freitag. Die anderen Tage musst du </w:t>
+      </w:r>
+      <w:proofErr w:type="gramStart"/>
+      <w:r>
+        <w:t>übernehmen.“</w:t>
+      </w:r>
+      <w:proofErr w:type="gramEnd"/>
     </w:p>
     <w:p>
       <w:pPr>
@@ -15538,7 +16503,15 @@
         <w:jc w:val="both"/>
       </w:pPr>
       <w:r>
-        <w:t>Du sagst wieder „passt schon“, obwohl es nicht passt.</w:t>
+        <w:t xml:space="preserve">Du sagst wieder „passt </w:t>
+      </w:r>
+      <w:proofErr w:type="gramStart"/>
+      <w:r>
+        <w:t>schon“</w:t>
+      </w:r>
+      <w:proofErr w:type="gramEnd"/>
+      <w:r>
+        <w:t>, obwohl es nicht passt.</w:t>
       </w:r>
     </w:p>
     <w:p>
@@ -15732,12 +16705,33 @@
     </w:p>
     <w:p>
       <w:pPr>
+        <w:spacing w:after="85"/>
+      </w:pPr>
+    </w:p>
+    <w:p>
+      <w:pPr>
+        <w:spacing w:after="85"/>
+      </w:pPr>
+    </w:p>
+    <w:p>
+      <w:pPr>
+        <w:spacing w:after="85"/>
+      </w:pPr>
+    </w:p>
+    <w:p>
+      <w:pPr>
+        <w:spacing w:after="85"/>
+      </w:pPr>
+    </w:p>
+    <w:p>
+      <w:pPr>
         <w:jc w:val="both"/>
       </w:pPr>
       <w:r>
         <w:rPr>
           <w:b/>
         </w:rPr>
+        <w:lastRenderedPageBreak/>
         <w:t>Reflexion</w:t>
       </w:r>
     </w:p>
@@ -15780,7 +16774,6 @@
         <w:br/>
       </w:r>
       <w:r>
-        <w:lastRenderedPageBreak/>
         <w:br/>
       </w:r>
       <w:r>
@@ -15859,8 +16852,17 @@
           <w:b/>
           <w:i/>
         </w:rPr>
-        <w:t>„Wer bist du, wenn niemand etwas von dir braucht? Diese Frage hat dir noch nie jemand gestellt.“</w:t>
-      </w:r>
+        <w:t xml:space="preserve">„Wer bist du, wenn niemand etwas von dir braucht? Diese Frage hat dir noch nie jemand </w:t>
+      </w:r>
+      <w:proofErr w:type="gramStart"/>
+      <w:r>
+        <w:rPr>
+          <w:b/>
+          <w:i/>
+        </w:rPr>
+        <w:t>gestellt.“</w:t>
+      </w:r>
+      <w:proofErr w:type="gramEnd"/>
     </w:p>
     <w:p>
       <w:pPr>
@@ -15940,23 +16942,47 @@
         <w:jc w:val="both"/>
       </w:pPr>
       <w:r>
-        <w:t>Das Funktions-Ich hat dich lange begleitet.</w:t>
-      </w:r>
-    </w:p>
-    <w:p>
-      <w:pPr>
-        <w:jc w:val="both"/>
-      </w:pPr>
-      <w:r>
-        <w:t>Es hat dich beschützt.</w:t>
-      </w:r>
-    </w:p>
-    <w:p>
-      <w:pPr>
-        <w:jc w:val="both"/>
-      </w:pPr>
-      <w:r>
-        <w:t>Es hat dich funktionieren lassen als alles andere zusammenbrach.</w:t>
+        <w:t xml:space="preserve">Das Funktions-Ich hat </w:t>
+      </w:r>
+      <w:proofErr w:type="gramStart"/>
+      <w:r>
+        <w:t>dich</w:t>
+      </w:r>
+      <w:proofErr w:type="gramEnd"/>
+      <w:r>
+        <w:t xml:space="preserve"> lange begleitet.</w:t>
+      </w:r>
+    </w:p>
+    <w:p>
+      <w:pPr>
+        <w:jc w:val="both"/>
+      </w:pPr>
+      <w:r>
+        <w:t xml:space="preserve">Es </w:t>
+      </w:r>
+      <w:proofErr w:type="gramStart"/>
+      <w:r>
+        <w:t>hat</w:t>
+      </w:r>
+      <w:proofErr w:type="gramEnd"/>
+      <w:r>
+        <w:t xml:space="preserve"> dich beschützt.</w:t>
+      </w:r>
+    </w:p>
+    <w:p>
+      <w:pPr>
+        <w:jc w:val="both"/>
+      </w:pPr>
+      <w:r>
+        <w:t xml:space="preserve">Es </w:t>
+      </w:r>
+      <w:proofErr w:type="gramStart"/>
+      <w:r>
+        <w:t>hat</w:t>
+      </w:r>
+      <w:proofErr w:type="gramEnd"/>
+      <w:r>
+        <w:t xml:space="preserve"> dich funktionieren lassen als alles andere zusammenbrach.</w:t>
       </w:r>
     </w:p>
     <w:p>
@@ -16538,24 +17564,39 @@
         <w:jc w:val="both"/>
       </w:pPr>
       <w:r>
-        <w:t>„Das geht für mich gerade nicht.“</w:t>
-      </w:r>
-    </w:p>
-    <w:p>
-      <w:pPr>
-        <w:jc w:val="both"/>
-      </w:pPr>
-      <w:r>
-        <w:t>„Es geht diesmal einfach nicht.“</w:t>
-      </w:r>
-    </w:p>
-    <w:p>
-      <w:pPr>
-        <w:jc w:val="both"/>
-      </w:pPr>
-      <w:r>
-        <w:t>„Ich schaffe das nicht dazu.“</w:t>
-      </w:r>
+        <w:t xml:space="preserve">„Das geht für mich gerade </w:t>
+      </w:r>
+      <w:proofErr w:type="gramStart"/>
+      <w:r>
+        <w:t>nicht.“</w:t>
+      </w:r>
+      <w:proofErr w:type="gramEnd"/>
+    </w:p>
+    <w:p>
+      <w:pPr>
+        <w:jc w:val="both"/>
+      </w:pPr>
+      <w:r>
+        <w:t xml:space="preserve">„Es geht diesmal einfach </w:t>
+      </w:r>
+      <w:proofErr w:type="gramStart"/>
+      <w:r>
+        <w:t>nicht.“</w:t>
+      </w:r>
+      <w:proofErr w:type="gramEnd"/>
+    </w:p>
+    <w:p>
+      <w:pPr>
+        <w:jc w:val="both"/>
+      </w:pPr>
+      <w:r>
+        <w:t xml:space="preserve">„Ich schaffe das nicht </w:t>
+      </w:r>
+      <w:proofErr w:type="gramStart"/>
+      <w:r>
+        <w:t>dazu.“</w:t>
+      </w:r>
+      <w:proofErr w:type="gramEnd"/>
     </w:p>
     <w:p>
       <w:pPr>
@@ -16596,16 +17637,26 @@
         <w:jc w:val="both"/>
       </w:pPr>
       <w:r>
-        <w:t>„Es geht diesmal einfach nicht.“</w:t>
-      </w:r>
-    </w:p>
-    <w:p>
-      <w:pPr>
-        <w:jc w:val="both"/>
-      </w:pPr>
-      <w:r>
-        <w:t>„Ich weiss, es kommt ungelegen. Es geht trotzdem nicht.“</w:t>
-      </w:r>
+        <w:t xml:space="preserve">„Es geht diesmal einfach </w:t>
+      </w:r>
+      <w:proofErr w:type="gramStart"/>
+      <w:r>
+        <w:t>nicht.“</w:t>
+      </w:r>
+      <w:proofErr w:type="gramEnd"/>
+    </w:p>
+    <w:p>
+      <w:pPr>
+        <w:jc w:val="both"/>
+      </w:pPr>
+      <w:r>
+        <w:t xml:space="preserve">„Ich weiss, es kommt ungelegen. Es geht trotzdem </w:t>
+      </w:r>
+      <w:proofErr w:type="gramStart"/>
+      <w:r>
+        <w:t>nicht.“</w:t>
+      </w:r>
+      <w:proofErr w:type="gramEnd"/>
     </w:p>
     <w:p>
       <w:pPr>
@@ -16633,7 +17684,21 @@
         <w:rPr>
           <w:b/>
         </w:rPr>
-        <w:t>Wenn jemand dich an seine Verdienste erinnert</w:t>
+        <w:t xml:space="preserve">Wenn jemand dich </w:t>
+      </w:r>
+      <w:proofErr w:type="gramStart"/>
+      <w:r>
+        <w:rPr>
+          <w:b/>
+        </w:rPr>
+        <w:t>an</w:t>
+      </w:r>
+      <w:proofErr w:type="gramEnd"/>
+      <w:r>
+        <w:rPr>
+          <w:b/>
+        </w:rPr>
+        <w:t xml:space="preserve"> seine Verdienste erinnert</w:t>
       </w:r>
     </w:p>
     <w:p>
@@ -16647,8 +17712,13 @@
       </w:pPr>
       <w:r>
         <w:lastRenderedPageBreak/>
-        <w:t>„Das stimmt, und ich bin dir dankbar dafür. Diesmal geht es trotzdem nicht.“</w:t>
-      </w:r>
+        <w:t xml:space="preserve">„Das stimmt, und ich bin dir dankbar dafür. Diesmal geht es trotzdem </w:t>
+      </w:r>
+      <w:proofErr w:type="gramStart"/>
+      <w:r>
+        <w:t>nicht.“</w:t>
+      </w:r>
+      <w:proofErr w:type="gramEnd"/>
     </w:p>
     <w:p>
       <w:pPr>
@@ -16713,36 +17783,59 @@
         <w:jc w:val="both"/>
       </w:pPr>
       <w:r>
-        <w:t>„Kannst du das übernehmen?“</w:t>
-      </w:r>
-    </w:p>
-    <w:p>
-      <w:pPr>
-        <w:jc w:val="both"/>
-      </w:pPr>
-      <w:r>
-        <w:t>„Ich brauche Samstag für mich. Geht das?“</w:t>
-      </w:r>
-    </w:p>
-    <w:p>
-      <w:pPr>
-        <w:jc w:val="both"/>
-      </w:pPr>
-      <w:r>
-        <w:t>„Ich schaffe das nicht alleine. Hilfst du mir?“</w:t>
-      </w:r>
-    </w:p>
-    <w:p>
-      <w:pPr>
-        <w:spacing w:after="71"/>
-      </w:pPr>
-    </w:p>
-    <w:p>
-      <w:pPr>
-        <w:jc w:val="both"/>
-      </w:pPr>
-      <w:r>
-        <w:t>Ein Satz. Kein „nur wenn es dir nichts ausmacht“.</w:t>
+        <w:t xml:space="preserve">„Kannst du das </w:t>
+      </w:r>
+      <w:proofErr w:type="gramStart"/>
+      <w:r>
+        <w:t>übernehmen?“</w:t>
+      </w:r>
+      <w:proofErr w:type="gramEnd"/>
+    </w:p>
+    <w:p>
+      <w:pPr>
+        <w:jc w:val="both"/>
+      </w:pPr>
+      <w:r>
+        <w:t xml:space="preserve">„Ich brauche Samstag für mich. Geht </w:t>
+      </w:r>
+      <w:proofErr w:type="gramStart"/>
+      <w:r>
+        <w:t>das?“</w:t>
+      </w:r>
+      <w:proofErr w:type="gramEnd"/>
+    </w:p>
+    <w:p>
+      <w:pPr>
+        <w:jc w:val="both"/>
+      </w:pPr>
+      <w:r>
+        <w:t xml:space="preserve">„Ich schaffe das nicht alleine. Hilfst du </w:t>
+      </w:r>
+      <w:proofErr w:type="gramStart"/>
+      <w:r>
+        <w:t>mir?“</w:t>
+      </w:r>
+      <w:proofErr w:type="gramEnd"/>
+    </w:p>
+    <w:p>
+      <w:pPr>
+        <w:spacing w:after="71"/>
+      </w:pPr>
+    </w:p>
+    <w:p>
+      <w:pPr>
+        <w:jc w:val="both"/>
+      </w:pPr>
+      <w:r>
+        <w:t xml:space="preserve">Ein Satz. Kein „nur wenn es dir nichts </w:t>
+      </w:r>
+      <w:proofErr w:type="gramStart"/>
+      <w:r>
+        <w:t>ausmacht“</w:t>
+      </w:r>
+      <w:proofErr w:type="gramEnd"/>
+      <w:r>
+        <w:t>.</w:t>
       </w:r>
     </w:p>
     <w:p>
@@ -16771,20 +17864,30 @@
         <w:jc w:val="both"/>
       </w:pPr>
       <w:r>
-        <w:t>„Ich kann Dienstag und Freitag. Die anderen Tage brauche ich dich.“</w:t>
-      </w:r>
-    </w:p>
-    <w:p>
-      <w:pPr>
-        <w:spacing w:after="71"/>
-      </w:pPr>
-    </w:p>
-    <w:p>
-      <w:pPr>
-        <w:jc w:val="both"/>
-      </w:pPr>
-      <w:r>
-        <w:t>Sag, was du kannst. Nicht, was du nicht kannst.</w:t>
+        <w:t xml:space="preserve">„Ich kann Dienstag und Freitag. Die anderen Tage brauche ich </w:t>
+      </w:r>
+      <w:proofErr w:type="gramStart"/>
+      <w:r>
+        <w:t>dich.“</w:t>
+      </w:r>
+      <w:proofErr w:type="gramEnd"/>
+    </w:p>
+    <w:p>
+      <w:pPr>
+        <w:spacing w:after="71"/>
+      </w:pPr>
+    </w:p>
+    <w:p>
+      <w:pPr>
+        <w:jc w:val="both"/>
+      </w:pPr>
+      <w:proofErr w:type="gramStart"/>
+      <w:r>
+        <w:t>Sag,</w:t>
+      </w:r>
+      <w:proofErr w:type="gramEnd"/>
+      <w:r>
+        <w:t xml:space="preserve"> was du kannst. Nicht, was du nicht kannst.</w:t>
       </w:r>
     </w:p>
     <w:p>
@@ -16813,20 +17916,33 @@
         <w:jc w:val="both"/>
       </w:pPr>
       <w:r>
-        <w:t>„Ich sage dir morgen Bescheid.“</w:t>
-      </w:r>
-    </w:p>
-    <w:p>
-      <w:pPr>
-        <w:spacing w:after="71"/>
-      </w:pPr>
-    </w:p>
-    <w:p>
-      <w:pPr>
-        <w:jc w:val="both"/>
-      </w:pPr>
-      <w:r>
-        <w:t>Der nützlichste Satz im ganzen Buch. Er kauft dir die Nacht, in der du merkst, was du wirklich willst.</w:t>
+        <w:t xml:space="preserve">„Ich sage dir morgen </w:t>
+      </w:r>
+      <w:proofErr w:type="gramStart"/>
+      <w:r>
+        <w:t>Bescheid.“</w:t>
+      </w:r>
+      <w:proofErr w:type="gramEnd"/>
+    </w:p>
+    <w:p>
+      <w:pPr>
+        <w:spacing w:after="71"/>
+      </w:pPr>
+    </w:p>
+    <w:p>
+      <w:pPr>
+        <w:jc w:val="both"/>
+      </w:pPr>
+      <w:r>
+        <w:t xml:space="preserve">Der nützlichste Satz im ganzen Buch. Er kauft dir </w:t>
+      </w:r>
+      <w:proofErr w:type="gramStart"/>
+      <w:r>
+        <w:t>die</w:t>
+      </w:r>
+      <w:proofErr w:type="gramEnd"/>
+      <w:r>
+        <w:t xml:space="preserve"> Nacht, in der du merkst, was du wirklich willst.</w:t>
       </w:r>
     </w:p>
     <w:p>
@@ -16855,8 +17971,13 @@
         <w:jc w:val="both"/>
       </w:pPr>
       <w:r>
-        <w:t>„Ehrlich? Gerade nicht so gut.“</w:t>
-      </w:r>
+        <w:t xml:space="preserve">„Ehrlich? Gerade nicht so </w:t>
+      </w:r>
+      <w:proofErr w:type="gramStart"/>
+      <w:r>
+        <w:t>gut.“</w:t>
+      </w:r>
+      <w:proofErr w:type="gramEnd"/>
     </w:p>
     <w:p>
       <w:pPr>
@@ -16947,18 +18068,59 @@
         <w:jc w:val="both"/>
       </w:pPr>
       <w:r>
-        <w:t>Du wirst sie an einem Tag brauchen, an dem dir keiner dieser Sätze einfällt.</w:t>
-      </w:r>
-    </w:p>
-    <w:p>
-      <w:pPr>
-        <w:jc w:val="both"/>
-      </w:pPr>
-      <w:r>
-        <w:t>Genau dafür stehen sie hier.</w:t>
-      </w:r>
-    </w:p>
-    <w:p>
+        <w:t xml:space="preserve">Du wirst sie an einem Tag brauchen, </w:t>
+      </w:r>
+      <w:proofErr w:type="gramStart"/>
+      <w:r>
+        <w:t>an</w:t>
+      </w:r>
+      <w:proofErr w:type="gramEnd"/>
+      <w:r>
+        <w:t xml:space="preserve"> dem dir keiner dieser Sätze einfällt.</w:t>
+      </w:r>
+    </w:p>
+    <w:p>
+      <w:pPr>
+        <w:jc w:val="both"/>
+      </w:pPr>
+      <w:r>
+        <w:t xml:space="preserve">Genau </w:t>
+      </w:r>
+      <w:proofErr w:type="spellStart"/>
+      <w:r>
+        <w:t>dafür</w:t>
+      </w:r>
+      <w:proofErr w:type="spellEnd"/>
+      <w:r>
+        <w:t xml:space="preserve"> </w:t>
+      </w:r>
+      <w:proofErr w:type="spellStart"/>
+      <w:r>
+        <w:t>stehen</w:t>
+      </w:r>
+      <w:proofErr w:type="spellEnd"/>
+      <w:r>
+        <w:t xml:space="preserve"> </w:t>
+      </w:r>
+      <w:proofErr w:type="spellStart"/>
+      <w:r>
+        <w:t>sie</w:t>
+      </w:r>
+      <w:proofErr w:type="spellEnd"/>
+      <w:r>
+        <w:t xml:space="preserve"> </w:t>
+      </w:r>
+      <w:proofErr w:type="spellStart"/>
+      <w:r>
+        <w:t>hier</w:t>
+      </w:r>
+      <w:proofErr w:type="spellEnd"/>
+      <w:r>
+        <w:t>.</w:t>
+      </w:r>
+      <w:r>
+        <w:t xml:space="preserve"> </w:t>
+      </w:r>
       <w:r>
         <w:br w:type="page"/>
       </w:r>
@@ -17367,7 +18529,15 @@
         <w:jc w:val="both"/>
       </w:pPr>
       <w:r>
-        <w:t>Auch die Therapeutin hat ein Funktions-Ich.</w:t>
+        <w:t xml:space="preserve">Auch </w:t>
+      </w:r>
+      <w:proofErr w:type="gramStart"/>
+      <w:r>
+        <w:t>die</w:t>
+      </w:r>
+      <w:proofErr w:type="gramEnd"/>
+      <w:r>
+        <w:t xml:space="preserve"> Therapeutin hat ein Funktions-Ich.</w:t>
       </w:r>
     </w:p>
     <w:p>
@@ -17859,7 +19029,21 @@
         <w:rPr>
           <w:sz w:val="18"/>
         </w:rPr>
-        <w:t>Alle Inhalte dieses Buches, also Texte, Konzepte, Zitate, Strukturen und Begriffe wie „Das Funktions-Ich“, sind urheberrechtlich geschützt. Die unerlaubte Vervielfältigung, Verbreitung, Übersetzung oder anderweitige Nutzung, auch auszugsweise, ist ohne ausdrückliche schriftliche Genehmigung der Autorin untersagt.</w:t>
+        <w:t>Alle Inhalte dieses Buches, also Texte, Konzepte, Zitate, Strukturen und Begriffe wie „Das Funktions-</w:t>
+      </w:r>
+      <w:proofErr w:type="gramStart"/>
+      <w:r>
+        <w:rPr>
+          <w:sz w:val="18"/>
+        </w:rPr>
+        <w:t>Ich“</w:t>
+      </w:r>
+      <w:proofErr w:type="gramEnd"/>
+      <w:r>
+        <w:rPr>
+          <w:sz w:val="18"/>
+        </w:rPr>
+        <w:t>, sind urheberrechtlich geschützt. Die unerlaubte Vervielfältigung, Verbreitung, Übersetzung oder anderweitige Nutzung, auch auszugsweise, ist ohne ausdrückliche schriftliche Genehmigung der Autorin untersagt.</w:t>
       </w:r>
     </w:p>
     <w:p>
@@ -17887,7 +19071,35 @@
         <w:rPr>
           <w:sz w:val="18"/>
         </w:rPr>
-        <w:t>Die Bezeichnungen „Safe to Thrive“ und „Das Funktions-Ich“ sind Bezeichnungen der Autorin. Die kommerzielle Nutzung ohne schriftliche Genehmigung ist nicht gestattet.</w:t>
+        <w:t xml:space="preserve">Die Bezeichnungen „Safe to </w:t>
+      </w:r>
+      <w:proofErr w:type="gramStart"/>
+      <w:r>
+        <w:rPr>
+          <w:sz w:val="18"/>
+        </w:rPr>
+        <w:t>Thrive“ und</w:t>
+      </w:r>
+      <w:proofErr w:type="gramEnd"/>
+      <w:r>
+        <w:rPr>
+          <w:sz w:val="18"/>
+        </w:rPr>
+        <w:t xml:space="preserve"> „Das Funktions-</w:t>
+      </w:r>
+      <w:proofErr w:type="gramStart"/>
+      <w:r>
+        <w:rPr>
+          <w:sz w:val="18"/>
+        </w:rPr>
+        <w:t>Ich“ sind</w:t>
+      </w:r>
+      <w:proofErr w:type="gramEnd"/>
+      <w:r>
+        <w:rPr>
+          <w:sz w:val="18"/>
+        </w:rPr>
+        <w:t xml:space="preserve"> Bezeichnungen der Autorin. Die kommerzielle Nutzung ohne schriftliche Genehmigung ist nicht gestattet.</w:t>
       </w:r>
     </w:p>
     <w:p>
@@ -18051,6 +19263,7 @@
       </w:r>
     </w:p>
     <w:sectPr>
+      <w:footerReference w:type="default" r:id="rId8"/>
       <w:pgSz w:w="8391" w:h="11906"/>
       <w:pgMar w:top="1247" w:right="1077" w:bottom="1247" w:left="1077" w:header="720" w:footer="720" w:gutter="0"/>
       <w:cols w:space="720"/>
@@ -18058,6 +19271,70 @@
     </w:sectPr>
   </w:body>
 </w:document>
+</file>
+
+<file path=word/footer1.xml><?xml version="1.0" encoding="utf-8"?>
+<w:ftr xmlns:m="http://schemas.openxmlformats.org/officeDocument/2006/math" xmlns:mc="http://schemas.openxmlformats.org/markup-compatibility/2006" xmlns:mo="http://schemas.microsoft.com/office/mac/office/2008/main" xmlns:mv="urn:schemas-microsoft-com:mac:vml" xmlns:o="urn:schemas-microsoft-com:office:office" xmlns:r="http://schemas.openxmlformats.org/officeDocument/2006/relationships" xmlns:v="urn:schemas-microsoft-com:vml" xmlns:w10="urn:schemas-microsoft-com:office:word" xmlns:w14="http://schemas.microsoft.com/office/word/2010/wordml" xmlns:w="http://schemas.openxmlformats.org/wordprocessingml/2006/main" xmlns:wne="http://schemas.microsoft.com/office/word/2006/wordml" xmlns:wp14="http://schemas.microsoft.com/office/word/2010/wordprocessingDrawing" xmlns:wp="http://schemas.openxmlformats.org/drawingml/2006/wordprocessingDrawing" xmlns:wpc="http://schemas.microsoft.com/office/word/2010/wordprocessingCanvas" xmlns:wpg="http://schemas.microsoft.com/office/word/2010/wordprocessingGroup" xmlns:wpi="http://schemas.microsoft.com/office/word/2010/wordprocessingInk" xmlns:wps="http://schemas.microsoft.com/office/word/2010/wordprocessingShape" mc:Ignorable="w14 wp14">
+  <w:p>
+    <w:pPr>
+      <w:pStyle w:val="Footer"/>
+      <w:tabs>
+        <w:tab w:pos="3118" w:val="center"/>
+        <w:tab w:pos="6236" w:val="right"/>
+      </w:tabs>
+      <w:spacing w:before="0" w:after="0"/>
+      <w:jc w:val="left"/>
+    </w:pPr>
+    <w:r/>
+    <w:r>
+      <w:rPr>
+        <w:rFonts w:ascii="Times New Roman" w:hAnsi="Times New Roman"/>
+        <w:color w:val="555555"/>
+        <w:sz w:val="18"/>
+      </w:rPr>
+      <w:tab/>
+    </w:r>
+    <w:r>
+      <w:rPr>
+        <w:rFonts w:ascii="Times New Roman" w:hAnsi="Times New Roman"/>
+        <w:color w:val="555555"/>
+        <w:sz w:val="18"/>
+      </w:rPr>
+      <w:fldChar w:fldCharType="begin"/>
+      <w:instrText xml:space="preserve"> PAGE </w:instrText>
+      <w:fldChar w:fldCharType="separate"/>
+      <w:t>1</w:t>
+      <w:fldChar w:fldCharType="end"/>
+    </w:r>
+    <w:r>
+      <w:rPr>
+        <w:rFonts w:ascii="Times New Roman" w:hAnsi="Times New Roman"/>
+        <w:color w:val="555555"/>
+        <w:sz w:val="18"/>
+      </w:rPr>
+      <w:tab/>
+    </w:r>
+    <w:r>
+      <w:rPr>
+        <w:rFonts w:ascii="Times New Roman" w:hAnsi="Times New Roman"/>
+        <w:color w:val="9A8F8A"/>
+        <w:sz w:val="16"/>
+      </w:rPr>
+      <w:t>♥</w:t>
+    </w:r>
+  </w:p>
+</w:ftr>
+</file>
+
+<file path=word/footer2.xml><?xml version="1.0" encoding="utf-8"?>
+<w:ftr xmlns:m="http://schemas.openxmlformats.org/officeDocument/2006/math" xmlns:mc="http://schemas.openxmlformats.org/markup-compatibility/2006" xmlns:mo="http://schemas.microsoft.com/office/mac/office/2008/main" xmlns:mv="urn:schemas-microsoft-com:mac:vml" xmlns:o="urn:schemas-microsoft-com:office:office" xmlns:r="http://schemas.openxmlformats.org/officeDocument/2006/relationships" xmlns:v="urn:schemas-microsoft-com:vml" xmlns:w10="urn:schemas-microsoft-com:office:word" xmlns:w14="http://schemas.microsoft.com/office/word/2010/wordml" xmlns:w="http://schemas.openxmlformats.org/wordprocessingml/2006/main" xmlns:wne="http://schemas.microsoft.com/office/word/2006/wordml" xmlns:wp14="http://schemas.microsoft.com/office/word/2010/wordprocessingDrawing" xmlns:wp="http://schemas.openxmlformats.org/drawingml/2006/wordprocessingDrawing" xmlns:wpc="http://schemas.microsoft.com/office/word/2010/wordprocessingCanvas" xmlns:wpg="http://schemas.microsoft.com/office/word/2010/wordprocessingGroup" xmlns:wpi="http://schemas.microsoft.com/office/word/2010/wordprocessingInk" xmlns:wps="http://schemas.microsoft.com/office/word/2010/wordprocessingShape" mc:Ignorable="w14 wp14">
+  <w:p>
+    <w:pPr>
+      <w:pStyle w:val="Footer"/>
+    </w:pPr>
+    <w:r/>
+  </w:p>
+</w:ftr>
 </file>
 
 <file path=word/numbering.xml><?xml version="1.0" encoding="utf-8"?>

</xml_diff>

<commit_message>
Buch 6: 26 Jahre Praxis als Autoritaet, Hashtag-Einladung, Claudia zweimal mehr
</commit_message>
<xml_diff>
--- a/outputs/buch6/buch6-MANUSKRIPT.docx
+++ b/outputs/buch6/buch6-MANUSKRIPT.docx
@@ -2421,6 +2421,100 @@
         <w:jc w:val="both"/>
       </w:pPr>
       <w:r>
+        <w:t xml:space="preserve">Ich arbeite seit sechsundzwanzig Jahren mit Menschen in meiner Praxis.</w:t>
+      </w:r>
+    </w:p>
+    <w:p>
+      <w:pPr>
+        <w:spacing w:after="71"/>
+      </w:pPr>
+    </w:p>
+    <w:p>
+      <w:pPr>
+        <w:jc w:val="both"/>
+      </w:pPr>
+      <w:r>
+        <w:t xml:space="preserve">In dieser Zeit habe ich einen Satz öfter gehört als jeden anderen.</w:t>
+      </w:r>
+    </w:p>
+    <w:p>
+      <w:pPr>
+        <w:spacing w:after="71"/>
+      </w:pPr>
+    </w:p>
+    <w:p>
+      <w:pPr>
+        <w:jc w:val="both"/>
+      </w:pPr>
+      <w:r>
+        <w:t xml:space="preserve">Nicht: Ich bin depressiv.</w:t>
+      </w:r>
+    </w:p>
+    <w:p>
+      <w:pPr>
+        <w:jc w:val="both"/>
+      </w:pPr>
+      <w:r>
+        <w:t xml:space="preserve">Nicht: Ich habe Angst.</w:t>
+      </w:r>
+    </w:p>
+    <w:p>
+      <w:pPr>
+        <w:spacing w:after="71"/>
+      </w:pPr>
+    </w:p>
+    <w:p>
+      <w:pPr>
+        <w:jc w:val="both"/>
+      </w:pPr>
+      <w:r>
+        <w:t xml:space="preserve">Sondern: Ich kann nicht mehr. Aber ich muss ja.</w:t>
+      </w:r>
+    </w:p>
+    <w:p>
+      <w:pPr>
+        <w:spacing w:after="71"/>
+      </w:pPr>
+    </w:p>
+    <w:p>
+      <w:pPr>
+        <w:jc w:val="both"/>
+      </w:pPr>
+      <w:r>
+        <w:t xml:space="preserve">Fast immer sagen ihn Frauen.</w:t>
+      </w:r>
+    </w:p>
+    <w:p>
+      <w:pPr>
+        <w:spacing w:after="71"/>
+      </w:pPr>
+    </w:p>
+    <w:p>
+      <w:pPr>
+        <w:jc w:val="both"/>
+      </w:pPr>
+      <w:r>
+        <w:t xml:space="preserve">Deshalb ist dieses Buch für Frauen geschrieben.</w:t>
+      </w:r>
+    </w:p>
+    <w:p>
+      <w:pPr>
+        <w:jc w:val="both"/>
+      </w:pPr>
+      <w:r>
+        <w:t xml:space="preserve">Wenn du ein Mann bist und dich hier wiederfindest: Es gilt für dich genauso.</w:t>
+      </w:r>
+    </w:p>
+    <w:p>
+      <w:pPr>
+        <w:spacing w:after="71"/>
+      </w:pPr>
+    </w:p>
+    <w:p>
+      <w:pPr>
+        <w:jc w:val="both"/>
+      </w:pPr>
+      <w:r>
         <w:t>Ich habe einen Namen für das, was du gerade lebst.</w:t>
       </w:r>
     </w:p>
@@ -11863,6 +11957,84 @@
         <w:jc w:val="both"/>
       </w:pPr>
       <w:r>
+        <w:t xml:space="preserve">Claudia hat mit etwas angefangen, das lächerlich klein klingt.</w:t>
+      </w:r>
+    </w:p>
+    <w:p>
+      <w:pPr>
+        <w:spacing w:after="71"/>
+      </w:pPr>
+    </w:p>
+    <w:p>
+      <w:pPr>
+        <w:jc w:val="both"/>
+      </w:pPr>
+      <w:r>
+        <w:t xml:space="preserve">Sie hat ihren Kaffee im Sitzen getrunken.</w:t>
+      </w:r>
+    </w:p>
+    <w:p>
+      <w:pPr>
+        <w:spacing w:after="71"/>
+      </w:pPr>
+    </w:p>
+    <w:p>
+      <w:pPr>
+        <w:jc w:val="both"/>
+      </w:pPr>
+      <w:r>
+        <w:t xml:space="preserve">Vorher stand sie dabei. Immer. An der Küchenzeile, während sie schon die Brote machte.</w:t>
+      </w:r>
+    </w:p>
+    <w:p>
+      <w:pPr>
+        <w:spacing w:after="71"/>
+      </w:pPr>
+    </w:p>
+    <w:p>
+      <w:pPr>
+        <w:jc w:val="both"/>
+      </w:pPr>
+      <w:r>
+        <w:t xml:space="preserve">„Beim ersten Mal habe ich nach zwei Minuten aufgehört", sagte sie. „Ich hielt es nicht aus."</w:t>
+      </w:r>
+    </w:p>
+    <w:p>
+      <w:pPr>
+        <w:spacing w:after="71"/>
+      </w:pPr>
+    </w:p>
+    <w:p>
+      <w:pPr>
+        <w:jc w:val="both"/>
+      </w:pPr>
+      <w:r>
+        <w:t xml:space="preserve">Nach drei Wochen sass sie die ganze Tasse lang.</w:t>
+      </w:r>
+    </w:p>
+    <w:p>
+      <w:pPr>
+        <w:spacing w:after="71"/>
+      </w:pPr>
+    </w:p>
+    <w:p>
+      <w:pPr>
+        <w:jc w:val="both"/>
+      </w:pPr>
+      <w:r>
+        <w:t xml:space="preserve">Das ist keine grosse Geschichte. Aber es war das Erste seit Jahren, das nur ihr gehörte.</w:t>
+      </w:r>
+    </w:p>
+    <w:p>
+      <w:pPr>
+        <w:spacing w:after="71"/>
+      </w:pPr>
+    </w:p>
+    <w:p>
+      <w:pPr>
+        <w:jc w:val="both"/>
+      </w:pPr>
+      <w:r>
         <w:t>Du bist keine Dienstleistung.</w:t>
       </w:r>
     </w:p>
@@ -15401,6 +15573,84 @@
       <w:pPr>
         <w:jc w:val="both"/>
       </w:pPr>
+      <w:r>
+        <w:t xml:space="preserve">Claudia hat in Woche 1 einunddreissig Striche gezählt.</w:t>
+      </w:r>
+    </w:p>
+    <w:p>
+      <w:pPr>
+        <w:spacing w:after="71"/>
+      </w:pPr>
+    </w:p>
+    <w:p>
+      <w:pPr>
+        <w:jc w:val="both"/>
+      </w:pPr>
+      <w:r>
+        <w:t xml:space="preserve">In sieben Tagen.</w:t>
+      </w:r>
+    </w:p>
+    <w:p>
+      <w:pPr>
+        <w:spacing w:after="71"/>
+      </w:pPr>
+    </w:p>
+    <w:p>
+      <w:pPr>
+        <w:jc w:val="both"/>
+      </w:pPr>
+      <w:r>
+        <w:t xml:space="preserve">„Ich habe die Liste dreimal nachgezählt", sagte sie. „Ich dachte, ich hätte mich verzählt."</w:t>
+      </w:r>
+    </w:p>
+    <w:p>
+      <w:pPr>
+        <w:spacing w:after="71"/>
+      </w:pPr>
+    </w:p>
+    <w:p>
+      <w:pPr>
+        <w:jc w:val="both"/>
+      </w:pPr>
+      <w:r>
+        <w:t xml:space="preserve">Hatte sie nicht.</w:t>
+      </w:r>
+    </w:p>
+    <w:p>
+      <w:pPr>
+        <w:spacing w:after="71"/>
+      </w:pPr>
+    </w:p>
+    <w:p>
+      <w:pPr>
+        <w:jc w:val="both"/>
+      </w:pPr>
+      <w:r>
+        <w:t xml:space="preserve">Sie hat in den vier Wochen nichts Grosses geändert. Kaffee im Sitzen, ein Nein zur Kollegin, eine Bitte an ihren Mann.</w:t>
+      </w:r>
+    </w:p>
+    <w:p>
+      <w:pPr>
+        <w:spacing w:after="71"/>
+      </w:pPr>
+    </w:p>
+    <w:p>
+      <w:pPr>
+        <w:jc w:val="both"/>
+      </w:pPr>
+      <w:r>
+        <w:t xml:space="preserve">Aber sie kann seitdem nicht mehr so tun, als wäre nichts.</w:t>
+      </w:r>
+    </w:p>
+    <w:p>
+      <w:pPr>
+        <w:spacing w:after="71"/>
+      </w:pPr>
+    </w:p>
+    <w:p>
+      <w:pPr>
+        <w:jc w:val="both"/>
+      </w:pPr>
       <w:proofErr w:type="gramStart"/>
       <w:r>
         <w:t>Was am</w:t>
@@ -18404,6 +18654,93 @@
     </w:p>
     <w:p>
       <w:pPr>
+        <w:spacing w:after="71"/>
+      </w:pPr>
+    </w:p>
+    <w:p>
+      <w:pPr>
+        <w:jc w:val="both"/>
+      </w:pPr>
+      <w:r>
+        <w:t xml:space="preserve">Und noch etwas.</w:t>
+      </w:r>
+    </w:p>
+    <w:p>
+      <w:pPr>
+        <w:spacing w:after="71"/>
+      </w:pPr>
+    </w:p>
+    <w:p>
+      <w:pPr>
+        <w:jc w:val="both"/>
+      </w:pPr>
+      <w:r>
+        <w:t xml:space="preserve">Irgendwo in diesem Buch steht ein Satz, der dich getroffen hat.</w:t>
+      </w:r>
+    </w:p>
+    <w:p>
+      <w:pPr>
+        <w:jc w:val="both"/>
+      </w:pPr>
+      <w:r>
+        <w:t xml:space="preserve">Du weisst schon, welcher.</w:t>
+      </w:r>
+    </w:p>
+    <w:p>
+      <w:pPr>
+        <w:spacing w:after="71"/>
+      </w:pPr>
+    </w:p>
+    <w:p>
+      <w:pPr>
+        <w:jc w:val="both"/>
+      </w:pPr>
+      <w:r>
+        <w:t xml:space="preserve">Fotografier die Seite.</w:t>
+      </w:r>
+    </w:p>
+    <w:p>
+      <w:pPr>
+        <w:shd w:val="clear" w:color="auto" w:fill="F0F0F0"/>
+        <w:spacing w:before="160" w:after="280"/>
+        <w:ind w:left="283" w:right="283"/>
+        <w:jc w:val="center"/>
+      </w:pPr>
+      <w:r>
+        <w:rPr>
+          <w:b/>
+          <w:i/>
+        </w:rPr>
+        <w:t xml:space="preserve">„Teil sie unter #DasFunktionsIch. Irgendwo sitzt gerade eine Frau, die genau diesen Satz braucht und ihn noch nicht kennt.“</w:t>
+      </w:r>
+      <w:proofErr w:type="gramStart"/>
+      <w:proofErr w:type="gramEnd"/>
+      <w:proofErr w:type="gramStart"/>
+      <w:proofErr w:type="gramEnd"/>
+    </w:p>
+    <w:p>
+      <w:pPr>
+        <w:jc w:val="both"/>
+      </w:pPr>
+      <w:r>
+        <w:t xml:space="preserve">Du musst nichts dazu schreiben.</w:t>
+      </w:r>
+    </w:p>
+    <w:p>
+      <w:pPr>
+        <w:jc w:val="both"/>
+      </w:pPr>
+      <w:r>
+        <w:t xml:space="preserve">Das Bild reicht.</w:t>
+      </w:r>
+    </w:p>
+    <w:p>
+      <w:pPr>
+        <w:spacing w:after="71"/>
+      </w:pPr>
+    </w:p>
+    <w:p>
+      <w:pPr>
         <w:spacing w:after="142"/>
       </w:pPr>
     </w:p>
@@ -18651,7 +18988,15 @@
         <w:jc w:val="both"/>
       </w:pPr>
       <w:r>
-        <w:t>Seit Jahren begleitet sie Frauen, die irgendwann gemerkt haben:</w:t>
+        <w:t>Seit sechsundzwanzig Jahren begleitet sie Menschen in ihrer Praxis.</w:t>
+      </w:r>
+    </w:p>
+    <w:p>
+      <w:pPr>
+        <w:jc w:val="both"/>
+      </w:pPr>
+      <w:r>
+        <w:t xml:space="preserve">Die meisten davon Frauen, die irgendwann gemerkt haben:</w:t>
       </w:r>
     </w:p>
     <w:p>

</xml_diff>

<commit_message>
Buch 6: typografische Anfuehrungszeichen in den neuen Absaetzen
</commit_message>
<xml_diff>
--- a/outputs/buch6/buch6-MANUSKRIPT.docx
+++ b/outputs/buch6/buch6-MANUSKRIPT.docx
@@ -11996,7 +11996,7 @@
         <w:jc w:val="both"/>
       </w:pPr>
       <w:r>
-        <w:t xml:space="preserve">„Beim ersten Mal habe ich nach zwei Minuten aufgehört", sagte sie. „Ich hielt es nicht aus."</w:t>
+        <w:t xml:space="preserve">„Beim ersten Mal habe ich nach zwei Minuten aufgehört“, sagte sie. „Ich hielt es nicht aus.“</w:t>
       </w:r>
     </w:p>
     <w:p>
@@ -15600,7 +15600,7 @@
         <w:jc w:val="both"/>
       </w:pPr>
       <w:r>
-        <w:t xml:space="preserve">„Ich habe die Liste dreimal nachgezählt", sagte sie. „Ich dachte, ich hätte mich verzählt."</w:t>
+        <w:t xml:space="preserve">„Ich habe die Liste dreimal nachgezählt“, sagte sie. „Ich dachte, ich hätte mich verzählt.“</w:t>
       </w:r>
     </w:p>
     <w:p>

</xml_diff>

<commit_message>
Buch 6: Titelseite an das Cover angeglichen
</commit_message>
<xml_diff>
--- a/outputs/buch6/buch6-MANUSKRIPT.docx
+++ b/outputs/buch6/buch6-MANUSKRIPT.docx
@@ -104,17 +104,18 @@
           <w:i/>
           <w:sz w:val="24"/>
         </w:rPr>
-        <w:t>Wie du aufhörst, für alle stark zu sein.</w:t>
-      </w:r>
-      <w:r>
+        <w:t>Das Funktions-Ich</w:t>
         <w:br/>
-      </w:r>
+        <w:t>Wenn du für alle stark bist</w:t>
+        <w:br/>
+        <w:t>und dich dabei verlierst</w:t>
+      </w:r>
+      <w:r/>
       <w:r>
         <w:rPr>
           <w:i/>
           <w:sz w:val="24"/>
         </w:rPr>
-        <w:t>und endlich wieder du selbst wirst</w:t>
       </w:r>
     </w:p>
     <w:p>

</xml_diff>

<commit_message>
Buch 6: Wortstellung 'damit es niemand sieht', Zwischentitel fett und seitenfest
</commit_message>
<xml_diff>
--- a/outputs/buch6/buch6-MANUSKRIPT.docx
+++ b/outputs/buch6/buch6-MANUSKRIPT.docx
@@ -169,7 +169,7 @@
       </w:r>
       <w:r>
         <w:br/>
-        <w:t>die im Auto weinen, damit niemand es sieht.</w:t>
+        <w:t>die im Auto weinen, damit es niemand sieht.</w:t>
       </w:r>
     </w:p>
     <w:p>
@@ -855,7 +855,7 @@
             <w:rStyle w:val="Hyperlink"/>
             <w:noProof/>
           </w:rPr>
-          <w:t>Kapitel 6: Ich weine im Auto. Damit niemand es sieht</w:t>
+          <w:t>Kapitel 6: Ich weine im Auto. Damit es niemand sieht</w:t>
         </w:r>
         <w:r>
           <w:rPr>
@@ -6524,7 +6524,7 @@
         <w:rPr>
           <w:sz w:val="22"/>
         </w:rPr>
-        <w:t>Ich weine im Auto. Damit niemand es sieht</w:t>
+        <w:t>Ich weine im Auto. Damit es niemand sieht</w:t>
       </w:r>
     </w:p>
     <w:p>
@@ -7167,7 +7167,7 @@
           <w:sz w:val="28"/>
         </w:rPr>
         <w:lastRenderedPageBreak/>
-        <w:t>Kapitel 6: Ich weine im Auto. Damit niemand es sieht</w:t>
+        <w:t>Kapitel 6: Ich weine im Auto. Damit es niemand sieht</w:t>
       </w:r>
       <w:bookmarkEnd w:id="7"/>
     </w:p>
@@ -7195,7 +7195,7 @@
           <w:b/>
           <w:i/>
         </w:rPr>
-        <w:t xml:space="preserve">„Du weinst im Auto, damit niemand es sieht. Das </w:t>
+        <w:t xml:space="preserve">„Du weinst im Auto, damit es niemand sieht. Das </w:t>
       </w:r>
       <w:proofErr w:type="spellStart"/>
       <w:r>
@@ -7302,12 +7302,10 @@
         <w:jc w:val="both"/>
       </w:pPr>
       <w:r>
-        <w:t xml:space="preserve">„Im Auto weine ich. Damit niemand es </w:t>
+        <w:t>„Im Auto weine ich. Damit es niemand sieht.“</w:t>
       </w:r>
       <w:proofErr w:type="gramStart"/>
-      <w:r>
-        <w:t>sieht.“</w:t>
-      </w:r>
+      <w:r/>
       <w:proofErr w:type="gramEnd"/>
     </w:p>
     <w:p>
@@ -12888,6 +12886,9 @@
         <w:jc w:val="both"/>
       </w:pPr>
       <w:r>
+        <w:rPr>
+          <w:b/>
+        </w:rPr>
         <w:t>Situation 1: Sie fragt nach dem Grund.</w:t>
       </w:r>
     </w:p>
@@ -13046,6 +13047,9 @@
         <w:jc w:val="both"/>
       </w:pPr>
       <w:r>
+        <w:rPr>
+          <w:b/>
+        </w:rPr>
         <w:t>Situation 2: Sie erinnert dich an ihre Verdienste.</w:t>
       </w:r>
     </w:p>
@@ -13161,6 +13165,9 @@
         <w:jc w:val="both"/>
       </w:pPr>
       <w:r>
+        <w:rPr>
+          <w:b/>
+        </w:rPr>
         <w:t>Situation 3: Sie schweigt.</w:t>
       </w:r>
     </w:p>
@@ -13287,6 +13294,9 @@
         <w:jc w:val="both"/>
       </w:pPr>
       <w:r>
+        <w:rPr>
+          <w:b/>
+        </w:rPr>
         <w:t>Die einzige Regel, die du dir merken musst:</w:t>
       </w:r>
     </w:p>
@@ -15102,6 +15112,9 @@
         <w:jc w:val="both"/>
       </w:pPr>
       <w:r>
+        <w:rPr>
+          <w:b/>
+        </w:rPr>
         <w:t>Woche 1: Nur merken. Nichts ändern.</w:t>
       </w:r>
     </w:p>
@@ -15207,6 +15220,9 @@
         <w:jc w:val="both"/>
       </w:pPr>
       <w:r>
+        <w:rPr>
+          <w:b/>
+        </w:rPr>
         <w:t>Woche 2: Eine Sache am Tag für dich.</w:t>
       </w:r>
     </w:p>
@@ -15285,6 +15301,9 @@
         <w:jc w:val="both"/>
       </w:pPr>
       <w:r>
+        <w:rPr>
+          <w:b/>
+        </w:rPr>
         <w:t>Woche 3: Ein Nein.</w:t>
       </w:r>
     </w:p>
@@ -15397,6 +15416,9 @@
         <w:jc w:val="both"/>
       </w:pPr>
       <w:r>
+        <w:rPr>
+          <w:b/>
+        </w:rPr>
         <w:t>Woche 4: Eine Bitte.</w:t>
       </w:r>
     </w:p>
@@ -15654,10 +15676,16 @@
       </w:pPr>
       <w:proofErr w:type="gramStart"/>
       <w:r>
+        <w:rPr>
+          <w:b/>
+        </w:rPr>
         <w:t>Was am</w:t>
       </w:r>
       <w:proofErr w:type="gramEnd"/>
       <w:r>
+        <w:rPr>
+          <w:b/>
+        </w:rPr>
         <w:t xml:space="preserve"> Ende zählt:</w:t>
       </w:r>
     </w:p>
@@ -18663,6 +18691,9 @@
         <w:jc w:val="both"/>
       </w:pPr>
       <w:r>
+        <w:rPr>
+          <w:b/>
+        </w:rPr>
         <w:t xml:space="preserve">Und noch etwas.</w:t>
       </w:r>
     </w:p>

</xml_diff>

<commit_message>
Buch 6: fehlender Seitenumbruch vor Kapitel 15, Kapitelanfaenge tiefer gesetzt, Grammatikfehler behoben
</commit_message>
<xml_diff>
--- a/outputs/buch6/buch6-MANUSKRIPT.docx
+++ b/outputs/buch6/buch6-MANUSKRIPT.docx
@@ -13586,6 +13586,11 @@
       </w:r>
     </w:p>
     <w:p>
+      <w:r>
+        <w:br w:type="page"/>
+      </w:r>
+    </w:p>
+    <w:p>
       <w:pPr>
         <w:pStyle w:val="berschrift2"/>
       </w:pPr>
@@ -15922,7 +15927,7 @@
           <w:i/>
           <w:sz w:val="22"/>
         </w:rPr>
-        <w:t xml:space="preserve">Du wirst wieder du. Nicht </w:t>
+        <w:t>Du wirst wieder du. Nicht die von früher. Besser.</w:t>
       </w:r>
       <w:proofErr w:type="gramStart"/>
       <w:r>
@@ -15930,7 +15935,6 @@
           <w:i/>
           <w:sz w:val="22"/>
         </w:rPr>
-        <w:t>die</w:t>
       </w:r>
       <w:proofErr w:type="gramEnd"/>
       <w:r>
@@ -15938,7 +15942,6 @@
           <w:i/>
           <w:sz w:val="22"/>
         </w:rPr>
-        <w:t xml:space="preserve"> alte du. Besser.</w:t>
       </w:r>
     </w:p>
     <w:p>

</xml_diff>

<commit_message>
Buch 6: Seitenumbruch aus Satz geloest, Hashtag-Einladung mit Plattform benannt
</commit_message>
<xml_diff>
--- a/outputs/buch6/buch6-MANUSKRIPT.docx
+++ b/outputs/buch6/buch6-MANUSKRIPT.docx
@@ -18403,6 +18403,9 @@
       <w:r>
         <w:t xml:space="preserve"> </w:t>
       </w:r>
+      <w:r/>
+    </w:p>
+    <w:p>
       <w:r>
         <w:br w:type="page"/>
       </w:r>
@@ -18731,7 +18734,7 @@
         <w:jc w:val="both"/>
       </w:pPr>
       <w:r>
-        <w:t xml:space="preserve">Fotografier die Seite.</w:t>
+        <w:t>Fotografier die Seite und stell sie auf Instagram oder TikTok.</w:t>
       </w:r>
     </w:p>
     <w:p>
@@ -18746,7 +18749,7 @@
           <w:b/>
           <w:i/>
         </w:rPr>
-        <w:t xml:space="preserve">„Teil sie unter #DasFunktionsIch. Irgendwo sitzt gerade eine Frau, die genau diesen Satz braucht und ihn noch nicht kennt.“</w:t>
+        <w:t>„Setz den Hashtag #DasFunktionsIch darunter. Irgendwo sitzt gerade eine Frau, die genau diesen Satz braucht. Vielleicht findet sie ihn über dich.“</w:t>
       </w:r>
       <w:proofErr w:type="gramStart"/>
       <w:proofErr w:type="gramEnd"/>

</xml_diff>

<commit_message>
Buch 6: Teilen-Einladung umgedreht, dient jetzt zuerst der Leserin
</commit_message>
<xml_diff>
--- a/outputs/buch6/buch6-MANUSKRIPT.docx
+++ b/outputs/buch6/buch6-MANUSKRIPT.docx
@@ -18734,8 +18734,39 @@
         <w:jc w:val="both"/>
       </w:pPr>
       <w:r>
-        <w:t>Fotografier die Seite und stell sie auf Instagram oder TikTok.</w:t>
-      </w:r>
+        <w:t xml:space="preserve">Fotografier die Seite.</w:t>
+      </w:r>
+    </w:p>
+    <w:p>
+      <w:pPr>
+        <w:spacing w:after="71"/>
+      </w:pPr>
+    </w:p>
+    <w:p>
+      <w:pPr>
+        <w:jc w:val="both"/>
+      </w:pPr>
+      <w:r>
+        <w:t xml:space="preserve">Erst mal nur für dich. Damit du sie wiederfindest an einem Tag, an dem dir nichts mehr einfällt.</w:t>
+      </w:r>
+    </w:p>
+    <w:p>
+      <w:pPr>
+        <w:spacing w:after="71"/>
+      </w:pPr>
+    </w:p>
+    <w:p>
+      <w:pPr>
+        <w:jc w:val="both"/>
+      </w:pPr>
+      <w:r>
+        <w:t xml:space="preserve">Und dann, wenn du magst, teil sie öffentlich. Auf Instagram oder TikTok, unter #DasFunktionsIch.</w:t>
+      </w:r>
+    </w:p>
+    <w:p>
+      <w:pPr>
+        <w:spacing w:after="71"/>
+      </w:pPr>
     </w:p>
     <w:p>
       <w:pPr>
@@ -18749,7 +18780,7 @@
           <w:b/>
           <w:i/>
         </w:rPr>
-        <w:t>„Setz den Hashtag #DasFunktionsIch darunter. Irgendwo sitzt gerade eine Frau, die genau diesen Satz braucht. Vielleicht findet sie ihn über dich.“</w:t>
+        <w:t>„Etwas sichtbar zu machen, das du jahrelang nur gedacht hast, verändert etwas. Auch wenn es nur ein Foto ist.“</w:t>
       </w:r>
       <w:proofErr w:type="gramStart"/>
       <w:proofErr w:type="gramEnd"/>
@@ -18769,7 +18800,7 @@
         <w:jc w:val="both"/>
       </w:pPr>
       <w:r>
-        <w:t xml:space="preserve">Das Bild reicht.</w:t>
+        <w:t>Und du musst es überhaupt nicht tun.</w:t>
       </w:r>
     </w:p>
     <w:p>

</xml_diff>

<commit_message>
Buch 6: Foto geht per Mail statt oeffentlich, doppelte Einladung entfernt
</commit_message>
<xml_diff>
--- a/outputs/buch6/buch6-MANUSKRIPT.docx
+++ b/outputs/buch6/buch6-MANUSKRIPT.docx
@@ -18681,14 +18681,6 @@
     </w:p>
     <w:p>
       <w:pPr>
-        <w:jc w:val="both"/>
-      </w:pPr>
-      <w:r>
-        <w:t>Und falls du mir schreiben magst, was dieses Buch ausgelöst hat, lese ich jede Nachricht.</w:t>
-      </w:r>
-    </w:p>
-    <w:p>
-      <w:pPr>
         <w:spacing w:after="71"/>
       </w:pPr>
     </w:p>
@@ -18760,7 +18752,7 @@
         <w:jc w:val="both"/>
       </w:pPr>
       <w:r>
-        <w:t>Und dann, wenn du magst, teil sie öffentlich. Auf Instagram oder TikTok, unter #DasFunktionsIch und #SafeToThrive.</w:t>
+        <w:t>Und wenn du magst, schick mir das Bild an dieselbe Adresse.</w:t>
       </w:r>
     </w:p>
     <w:p>
@@ -18780,7 +18772,7 @@
           <w:b/>
           <w:i/>
         </w:rPr>
-        <w:t>„Etwas sichtbar zu machen, das du jahrelang nur gedacht hast, verändert etwas. Auch wenn es nur ein Foto ist.“</w:t>
+        <w:t>„Etwas sichtbar zu machen, das du jahrelang nur gedacht hast, verändert etwas. Auch wenn es nur ein Foto ist, das ausser mir niemand sieht.“</w:t>
       </w:r>
       <w:proofErr w:type="gramStart"/>
       <w:proofErr w:type="gramEnd"/>
@@ -18800,7 +18792,7 @@
         <w:jc w:val="both"/>
       </w:pPr>
       <w:r>
-        <w:t>Und du musst es überhaupt nicht tun.</w:t>
+        <w:t>Ich lese jede Nachricht.</w:t>
       </w:r>
     </w:p>
     <w:p>

</xml_diff>

<commit_message>
Buch 6: letzter Kommafehler, Signatur ohne Extraseite, Cover auf 125 Seiten
</commit_message>
<xml_diff>
--- a/outputs/buch6/buch6-MANUSKRIPT.docx
+++ b/outputs/buch6/buch6-MANUSKRIPT.docx
@@ -8778,7 +8778,7 @@
         <w:jc w:val="both"/>
       </w:pPr>
       <w:r>
-        <w:t>Und Lea, damals sechs Jahre alt, hat das Einzige getan was sie konnte:</w:t>
+        <w:t>Und Lea, damals sechs Jahre alt, hat das Einzige getan, was sie konnte:</w:t>
       </w:r>
     </w:p>
     <w:p>
@@ -18794,16 +18794,6 @@
       <w:r>
         <w:t>Ich lese jede Nachricht.</w:t>
       </w:r>
-    </w:p>
-    <w:p>
-      <w:pPr>
-        <w:spacing w:after="71"/>
-      </w:pPr>
-    </w:p>
-    <w:p>
-      <w:pPr>
-        <w:spacing w:after="142"/>
-      </w:pPr>
     </w:p>
     <w:p>
       <w:pPr>

</xml_diff>

<commit_message>
Buch 6: Impressum mit ladungsfaehiger Anschrift und Herstellerangabe
</commit_message>
<xml_diff>
--- a/outputs/buch6/buch6-MANUSKRIPT.docx
+++ b/outputs/buch6/buch6-MANUSKRIPT.docx
@@ -19568,6 +19568,50 @@
     </w:p>
     <w:p>
       <w:pPr>
+        <w:spacing w:after="80"/>
+      </w:pPr>
+      <w:r>
+        <w:rPr>
+          <w:sz w:val="18"/>
+        </w:rPr>
+        <w:t xml:space="preserve"/>
+      </w:r>
+    </w:p>
+    <w:p>
+      <w:pPr>
+        <w:spacing w:after="80"/>
+      </w:pPr>
+      <w:r>
+        <w:rPr>
+          <w:sz w:val="18"/>
+        </w:rPr>
+        <w:t xml:space="preserve">Petra Tanner</w:t>
+      </w:r>
+    </w:p>
+    <w:p>
+      <w:pPr>
+        <w:spacing w:after="80"/>
+      </w:pPr>
+      <w:r>
+        <w:rPr>
+          <w:sz w:val="18"/>
+        </w:rPr>
+        <w:t xml:space="preserve">Wiesentalstrasse 68</w:t>
+      </w:r>
+    </w:p>
+    <w:p>
+      <w:pPr>
+        <w:spacing w:after="80"/>
+      </w:pPr>
+      <w:r>
+        <w:rPr>
+          <w:sz w:val="18"/>
+        </w:rPr>
+        <w:t xml:space="preserve">9240 Uzwil, Schweiz</w:t>
+      </w:r>
+    </w:p>
+    <w:p>
+      <w:pPr>
         <w:spacing w:after="113"/>
       </w:pPr>
     </w:p>
@@ -19580,6 +19624,17 @@
           <w:sz w:val="18"/>
         </w:rPr>
         <w:t>Selbstverlag</w:t>
+      </w:r>
+    </w:p>
+    <w:p>
+      <w:pPr>
+        <w:spacing w:after="80"/>
+      </w:pPr>
+      <w:r>
+        <w:rPr>
+          <w:sz w:val="18"/>
+        </w:rPr>
+        <w:t xml:space="preserve">Unabhängig veröffentlicht über Amazon Kindle Direct Publishing</w:t>
       </w:r>
     </w:p>
     <w:p>

</xml_diff>

<commit_message>
Buch 6: Krisennummern auf die Notfall-Seiten, Selbsttest rechtlich eingeordnet
- Notfall-Seiten enthalten jetzt den Hinweis auf professionelle Hilfe
  samt Telefonseelsorge Schweiz/Deutschland/Oesterreich
- Selbsttest ausdruecklich als Standortbestimmung, nicht als Diagnose,
  mit Hinweis auf koerperliche Ursachen und aerztliche Abklaerung
- Taschenbuch-PDF neu erzeugt, 127 Seiten

Co-Authored-By: Claude Opus 5 <noreply@anthropic.com>
Claude-Session: https://claude.ai/code/session_011oFtWvyjvkDdc6K2GcSXHx
</commit_message>
<xml_diff>
--- a/outputs/buch6/buch6-MANUSKRIPT.docx
+++ b/outputs/buch6/buch6-MANUSKRIPT.docx
@@ -3148,6 +3148,66 @@
       </w:pPr>
     </w:p>
     <w:p>
+      <w:pPr>
+        <w:jc w:val="both"/>
+      </w:pPr>
+      <w:r>
+        <w:rPr>
+          <w:b/>
+        </w:rPr>
+        <w:t xml:space="preserve">Ein Hinweis dazu.</w:t>
+      </w:r>
+    </w:p>
+    <w:p>
+      <w:pPr>
+        <w:spacing w:after="71"/>
+      </w:pPr>
+    </w:p>
+    <w:p>
+      <w:pPr>
+        <w:jc w:val="both"/>
+      </w:pPr>
+      <w:r>
+        <w:t xml:space="preserve">Das hier ist kein Test im medizinischen Sinn und keine Diagnose. Es ist eine Standortbestimmung, mehr nicht.</w:t>
+      </w:r>
+    </w:p>
+    <w:p>
+      <w:pPr>
+        <w:spacing w:after="71"/>
+      </w:pPr>
+    </w:p>
+    <w:p>
+      <w:pPr>
+        <w:jc w:val="both"/>
+      </w:pPr>
+      <w:r>
+        <w:t xml:space="preserve">Erschöpfung kann auch körperliche Ursachen haben, von der Schilddrüse bis zum Eisenmangel. Und sie kann eine Depression sein.</w:t>
+      </w:r>
+    </w:p>
+    <w:p>
+      <w:pPr>
+        <w:spacing w:after="71"/>
+      </w:pPr>
+    </w:p>
+    <w:p>
+      <w:pPr>
+        <w:jc w:val="both"/>
+      </w:pPr>
+      <w:r>
+        <w:t xml:space="preserve">Wenn du seit Wochen nicht mehr herauskommst, lass das bitte ärztlich abklären. Unabhängig davon, was hier steht.</w:t>
+      </w:r>
+    </w:p>
+    <w:p>
+      <w:pPr>
+        <w:spacing w:after="71"/>
+      </w:pPr>
+    </w:p>
+    <w:p>
+      <w:pPr>
+        <w:spacing w:after="71"/>
+      </w:pPr>
+    </w:p>
+    <w:p>
       <w:r>
         <w:br w:type="page"/>
       </w:r>
@@ -3588,6 +3648,79 @@
       <w:r>
         <w:t>Morgen ist auch noch ein Tag. Dieser Satz ist keine Ausrede, wenn du ihn heute wirklich brauchst.</w:t>
       </w:r>
+    </w:p>
+    <w:p>
+      <w:pPr>
+        <w:spacing w:after="71"/>
+      </w:pPr>
+    </w:p>
+    <w:p>
+      <w:pPr>
+        <w:jc w:val="both"/>
+      </w:pPr>
+      <w:r>
+        <w:rPr>
+          <w:b/>
+        </w:rPr>
+        <w:t xml:space="preserve">Und wenn es mehr ist als ein schlechter Tag.</w:t>
+      </w:r>
+    </w:p>
+    <w:p>
+      <w:pPr>
+        <w:spacing w:after="71"/>
+      </w:pPr>
+    </w:p>
+    <w:p>
+      <w:pPr>
+        <w:jc w:val="both"/>
+      </w:pPr>
+      <w:r>
+        <w:t xml:space="preserve">Wenn du seit Wochen nicht mehr herauskommst. Wenn du nachts wach liegst und denkst, dass es ohne dich leichter wäre.</w:t>
+      </w:r>
+    </w:p>
+    <w:p>
+      <w:pPr>
+        <w:spacing w:after="71"/>
+      </w:pPr>
+    </w:p>
+    <w:p>
+      <w:pPr>
+        <w:jc w:val="both"/>
+      </w:pPr>
+      <w:r>
+        <w:t xml:space="preserve">Dann ist dieses Buch nicht genug. Das ist keine Schwäche, das ist einfach so.</w:t>
+      </w:r>
+    </w:p>
+    <w:p>
+      <w:pPr>
+        <w:spacing w:after="71"/>
+      </w:pPr>
+    </w:p>
+    <w:p>
+      <w:pPr>
+        <w:jc w:val="both"/>
+      </w:pPr>
+      <w:r>
+        <w:t xml:space="preserve">Ruf an. Kostenlos, anonym, Tag und Nacht besetzt.</w:t>
+      </w:r>
+    </w:p>
+    <w:p>
+      <w:pPr>
+        <w:spacing w:after="71"/>
+      </w:pPr>
+    </w:p>
+    <w:p>
+      <w:pPr>
+        <w:jc w:val="both"/>
+      </w:pPr>
+      <w:r>
+        <w:t xml:space="preserve">Schweiz 143  ·  Deutschland 0800 111 0 111  ·  Österreich 142</w:t>
+      </w:r>
+    </w:p>
+    <w:p>
+      <w:pPr>
+        <w:spacing w:after="71"/>
+      </w:pPr>
     </w:p>
     <w:p>
       <w:pPr>

</xml_diff>

<commit_message>
Buch 6: Berufsbezeichnung korrigiert und Diagnose-Formulierung entschaerft
- Therapeutin durch Coachin und geistige Heilerin ersetzt, alle Stellen
- Klarstellung Zur Autorin in den Rechtlichen Hinweisen: keine Aerztin,
  keine Psychotherapeutin, keine Heilkunde im medizinischen Sinn
- TikTok-Zeile Kapitel 1 ohne Abgrenzungsdiagnose formuliert

Co-Authored-By: Claude Opus 5 <noreply@anthropic.com>
Claude-Session: https://claude.ai/code/session_011oFtWvyjvkDdc6K2GcSXHx
</commit_message>
<xml_diff>
--- a/outputs/buch6/buch6-MANUSKRIPT.docx
+++ b/outputs/buch6/buch6-MANUSKRIPT.docx
@@ -3916,7 +3916,7 @@
           <w:b/>
           <w:i/>
         </w:rPr>
-        <w:t>„Du funktionierst. Aber du lebst nicht. Das ist kein Burnout. Das ist das Funktions-</w:t>
+        <w:t>„Du funktionierst. Aber du lebst nicht. Es fühlt sich an wie Burnout. Ich nenne es das Funktions-Ich.“</w:t>
       </w:r>
       <w:proofErr w:type="gramStart"/>
       <w:r>
@@ -3924,7 +3924,6 @@
           <w:b/>
           <w:i/>
         </w:rPr>
-        <w:t>Ich.“</w:t>
       </w:r>
       <w:proofErr w:type="gramEnd"/>
     </w:p>
@@ -9464,7 +9463,7 @@
         <w:jc w:val="both"/>
       </w:pPr>
       <w:r>
-        <w:t>Nicht als Klientin. Als Therapeutin. Als Frau. Als Mensch.</w:t>
+        <w:t>Nicht als Klientin. Als Begleiterin. Als Frau. Als Mensch.</w:t>
       </w:r>
     </w:p>
     <w:p>
@@ -19050,16 +19049,12 @@
         <w:jc w:val="both"/>
       </w:pPr>
       <w:r>
-        <w:t xml:space="preserve">Auch </w:t>
+        <w:t>Auch die, die andere begleitet, hat ein Funktions-Ich.</w:t>
       </w:r>
       <w:proofErr w:type="gramStart"/>
-      <w:r>
-        <w:t>die</w:t>
-      </w:r>
+      <w:r/>
       <w:proofErr w:type="gramEnd"/>
-      <w:r>
-        <w:t xml:space="preserve"> Therapeutin hat ein Funktions-Ich.</w:t>
-      </w:r>
+      <w:r/>
     </w:p>
     <w:p>
       <w:pPr>
@@ -19151,7 +19146,7 @@
         <w:jc w:val="both"/>
       </w:pPr>
       <w:r>
-        <w:t>Petra Tanner ist Therapeutin und Coachin in der Schweiz.</w:t>
+        <w:t>Petra Tanner ist Coachin und geistige Heilerin in der Schweiz.</w:t>
       </w:r>
     </w:p>
     <w:p>
@@ -19442,6 +19437,39 @@
       <w:pPr>
         <w:spacing w:after="142"/>
       </w:pPr>
+    </w:p>
+    <w:p>
+      <w:r>
+        <w:t xml:space="preserve"/>
+      </w:r>
+    </w:p>
+    <w:p>
+      <w:pPr>
+        <w:spacing w:after="80"/>
+      </w:pPr>
+      <w:r>
+        <w:rPr>
+          <w:sz w:val="18"/>
+        </w:rPr>
+        <w:t xml:space="preserve">Die Autorin ist keine Ärztin, Psychologin oder Psychotherapeutin. Sie arbeitet als Coachin und geistige Heilerin und übt keine Heilkunde im medizinischen Sinn aus. Die Begleitung in ihrer Praxis ersetzt weder ärztliche noch psychotherapeutische Behandlung und stellt keine solche dar.</w:t>
+      </w:r>
+    </w:p>
+    <w:p>
+      <w:pPr>
+        <w:spacing w:after="80"/>
+      </w:pPr>
+      <w:r>
+        <w:rPr>
+          <w:b/>
+          <w:sz w:val="18"/>
+        </w:rPr>
+        <w:t xml:space="preserve">Zur Autorin</w:t>
+      </w:r>
+    </w:p>
+    <w:p>
+      <w:r>
+        <w:t xml:space="preserve"/>
+      </w:r>
     </w:p>
     <w:p>
       <w:pPr>

</xml_diff>

<commit_message>
Buch 6: Kapiteltitel 6 korrigiert, nur noch Coachin, Zur Autorin richtig gesetzt
- Kapitel 6 heisst jetzt: Ich weine im Auto, damit es niemand sieht
- Bezeichnung geistige Heilerin entfernt, ueberall nur noch Coachin
- Ueberschrift Zur Autorin stand faelschlich unter ihrem Absatz, korrigiert
- Krisennummern im Rechtlichen als ein Block, nicht mehr ueber zwei Seiten
- Regel in context/rechtssicherheit.md nachgezogen

Co-Authored-By: Claude Opus 5 <noreply@anthropic.com>
Claude-Session: https://claude.ai/code/session_011oFtWvyjvkDdc6K2GcSXHx
</commit_message>
<xml_diff>
--- a/outputs/buch6/buch6-MANUSKRIPT.docx
+++ b/outputs/buch6/buch6-MANUSKRIPT.docx
@@ -6656,7 +6656,7 @@
         <w:rPr>
           <w:sz w:val="22"/>
         </w:rPr>
-        <w:t>Ich weine im Auto. Damit es niemand sieht</w:t>
+        <w:t>Ich weine im Auto, damit es niemand sieht</w:t>
       </w:r>
     </w:p>
     <w:p>
@@ -7298,8 +7298,7 @@
           <w:color w:val="000000"/>
           <w:sz w:val="28"/>
         </w:rPr>
-        <w:lastRenderedPageBreak/>
-        <w:t>Kapitel 6: Ich weine im Auto. Damit es niemand sieht</w:t>
+        <w:t>Kapitel 6: Ich weine im Auto, damit es niemand sieht</w:t>
       </w:r>
       <w:bookmarkEnd w:id="7"/>
     </w:p>
@@ -19146,7 +19145,7 @@
         <w:jc w:val="both"/>
       </w:pPr>
       <w:r>
-        <w:t>Petra Tanner ist Coachin und geistige Heilerin in der Schweiz.</w:t>
+        <w:t>Petra Tanner ist Coachin in der Schweiz.</w:t>
       </w:r>
     </w:p>
     <w:p>
@@ -19449,17 +19448,6 @@
       </w:pPr>
       <w:r>
         <w:rPr>
-          <w:sz w:val="18"/>
-        </w:rPr>
-        <w:t xml:space="preserve">Die Autorin ist keine Ärztin, Psychologin oder Psychotherapeutin. Sie arbeitet als Coachin und geistige Heilerin und übt keine Heilkunde im medizinischen Sinn aus. Die Begleitung in ihrer Praxis ersetzt weder ärztliche noch psychotherapeutische Behandlung und stellt keine solche dar.</w:t>
-      </w:r>
-    </w:p>
-    <w:p>
-      <w:pPr>
-        <w:spacing w:after="80"/>
-      </w:pPr>
-      <w:r>
-        <w:rPr>
           <w:b/>
           <w:sz w:val="18"/>
         </w:rPr>
@@ -19467,6 +19455,17 @@
       </w:r>
     </w:p>
     <w:p>
+      <w:pPr>
+        <w:spacing w:after="80"/>
+      </w:pPr>
+      <w:r>
+        <w:rPr>
+          <w:sz w:val="18"/>
+        </w:rPr>
+        <w:t>Die Autorin ist keine Ärztin, Psychologin oder Psychotherapeutin. Sie arbeitet als Coachin und übt keine Heilkunde im medizinischen Sinn aus. Die Begleitung in ihrer Praxis ersetzt weder ärztliche noch psychotherapeutische Behandlung und stellt keine solche dar.</w:t>
+      </w:r>
+    </w:p>
+    <w:p>
       <w:r>
         <w:t xml:space="preserve"/>
       </w:r>
@@ -19508,28 +19507,10 @@
           <w:sz w:val="18"/>
         </w:rPr>
         <w:t>Krisentelefon Deutschland: 0800 111 0 111 (kostenlos, 24/7)</w:t>
-      </w:r>
-    </w:p>
-    <w:p>
-      <w:pPr>
-        <w:spacing w:after="80"/>
-      </w:pPr>
-      <w:r>
-        <w:rPr>
-          <w:sz w:val="18"/>
-        </w:rPr>
-        <w:t>Krisentelefon Österreich: 142 (Telefonseelsorge, 24/7)</w:t>
-      </w:r>
-    </w:p>
-    <w:p>
-      <w:pPr>
-        <w:spacing w:after="80"/>
-      </w:pPr>
-      <w:r>
-        <w:rPr>
-          <w:sz w:val="18"/>
-        </w:rPr>
-        <w:t>Krisentelefon Schweiz: 143 (Die Dargebotene Hand, 24/7)</w:t>
+        <w:br/>
+        <w:t xml:space="preserve">Krisentelefon Österreich: 142 (Telefonseelsorge, 24/7)</w:t>
+        <w:br/>
+        <w:t xml:space="preserve">Krisentelefon Schweiz: 143 (Die Dargebotene Hand, 24/7)</w:t>
       </w:r>
     </w:p>
     <w:p>

</xml_diff>

<commit_message>
Buch 6: Schlusslektorat, 49 Kommafehler korrigiert, keine leeren Seiten
- Fehlende Kommas bei Relativ- und Nebensaetzen im ganzen Buch korrigiert,
  darunter die Kapiteltitel 3, 9, 12 und 15
- Selbsttest-Hinweis gestrafft, damit keine fast leere Seite entsteht
- word2pdf verwirft jetzt Leerraum direkt vor einem Seitenumbruch,
  das war die Ursache der leeren Seite
- Umfang jetzt 126 Seiten, Ruecken 8,00 mm, Cover 310,40 x 216,40 mm
- SEITEN in tools/buch6-cover.py, README und offene Punkte nachgezogen

Co-Authored-By: Claude Opus 5 <noreply@anthropic.com>
Claude-Session: https://claude.ai/code/session_011oFtWvyjvkDdc6K2GcSXHx
</commit_message>
<xml_diff>
--- a/outputs/buch6/buch6-MANUSKRIPT.docx
+++ b/outputs/buch6/buch6-MANUSKRIPT.docx
@@ -3168,33 +3168,33 @@
         <w:jc w:val="both"/>
       </w:pPr>
       <w:r>
-        <w:t xml:space="preserve">Das hier ist kein Test im medizinischen Sinn und keine Diagnose. Es ist eine Standortbestimmung, mehr nicht.</w:t>
-      </w:r>
-    </w:p>
-    <w:p>
-      <w:pPr>
-        <w:spacing w:after="71"/>
-      </w:pPr>
-    </w:p>
-    <w:p>
-      <w:pPr>
-        <w:jc w:val="both"/>
-      </w:pPr>
-      <w:r>
-        <w:t xml:space="preserve">Erschöpfung kann auch körperliche Ursachen haben, von der Schilddrüse bis zum Eisenmangel. Und sie kann eine Depression sein.</w:t>
-      </w:r>
-    </w:p>
-    <w:p>
-      <w:pPr>
-        <w:spacing w:after="71"/>
-      </w:pPr>
-    </w:p>
-    <w:p>
-      <w:pPr>
-        <w:jc w:val="both"/>
-      </w:pPr>
-      <w:r>
-        <w:t xml:space="preserve">Wenn du seit Wochen nicht mehr herauskommst, lass das bitte ärztlich abklären. Unabhängig davon, was hier steht.</w:t>
+        <w:t>Das hier ist kein medizinischer Test und keine Diagnose, sondern eine Standortbestimmung.</w:t>
+      </w:r>
+    </w:p>
+    <w:p>
+      <w:pPr>
+        <w:spacing w:after="71"/>
+      </w:pPr>
+    </w:p>
+    <w:p>
+      <w:pPr>
+        <w:jc w:val="both"/>
+      </w:pPr>
+      <w:r>
+        <w:t>Erschöpfung kann körperliche Ursachen haben, von der Schilddrüse bis zum Eisenmangel. Sie kann auch eine Depression sein.</w:t>
+      </w:r>
+    </w:p>
+    <w:p>
+      <w:pPr>
+        <w:spacing w:after="71"/>
+      </w:pPr>
+    </w:p>
+    <w:p>
+      <w:pPr>
+        <w:jc w:val="both"/>
+      </w:pPr>
+      <w:r>
+        <w:t>Lass das bitte ärztlich abklären, wenn es seit Wochen so geht.</w:t>
       </w:r>
     </w:p>
     <w:p>
@@ -3851,7 +3851,7 @@
         <w:rPr>
           <w:sz w:val="22"/>
         </w:rPr>
-        <w:t>Die Müdigkeit die kein Schlaf heilt</w:t>
+        <w:t>Die Müdigkeit, die kein Schlaf heilt</w:t>
       </w:r>
     </w:p>
     <w:p>
@@ -5219,8 +5219,7 @@
           <w:color w:val="000000"/>
           <w:sz w:val="28"/>
         </w:rPr>
-        <w:lastRenderedPageBreak/>
-        <w:t>Kapitel 3: Die Müdigkeit die kein Schlaf heilt</w:t>
+        <w:t>Kapitel 3: Die Müdigkeit, die kein Schlaf heilt</w:t>
       </w:r>
       <w:bookmarkEnd w:id="3"/>
     </w:p>
@@ -5277,7 +5276,7 @@
         <w:jc w:val="both"/>
       </w:pPr>
       <w:r>
-        <w:t>Und wachst auf als wären es drei gewesen.</w:t>
+        <w:t>Und wachst auf, als wären es drei gewesen.</w:t>
       </w:r>
     </w:p>
     <w:p>
@@ -6222,7 +6221,7 @@
         <w:jc w:val="both"/>
       </w:pPr>
       <w:r>
-        <w:t>Mit den Mitteln die es hat.</w:t>
+        <w:t>Mit den Mitteln, die es hat.</w:t>
       </w:r>
     </w:p>
     <w:p>
@@ -6360,7 +6359,7 @@
         <w:jc w:val="both"/>
       </w:pPr>
       <w:r>
-        <w:t>Und wundert sich warum sie nicht Nein sagen kann.</w:t>
+        <w:t>Und wundert sich, warum sie nicht Nein sagen kann.</w:t>
       </w:r>
     </w:p>
     <w:p>
@@ -6625,7 +6624,7 @@
           <w:i/>
           <w:sz w:val="22"/>
         </w:rPr>
-        <w:t>Du weisst jetzt wo es herkommt.</w:t>
+        <w:t>Du weisst jetzt, wo es herkommt.</w:t>
       </w:r>
     </w:p>
     <w:p>
@@ -6947,7 +6946,7 @@
         <w:jc w:val="both"/>
       </w:pPr>
       <w:r>
-        <w:t>Es hat nur die Gesichter die andere von ihm erwarten.</w:t>
+        <w:t>Es hat nur die Gesichter, die andere von ihm erwarten.</w:t>
       </w:r>
     </w:p>
     <w:p>
@@ -7407,33 +7406,7 @@
         <w:jc w:val="both"/>
       </w:pPr>
       <w:r>
-        <w:t xml:space="preserve">„Im Auto kann ich sein wie ich </w:t>
-      </w:r>
-      <w:proofErr w:type="gramStart"/>
-      <w:r>
-        <w:t>bin.“</w:t>
-      </w:r>
-      <w:proofErr w:type="gramEnd"/>
-    </w:p>
-    <w:p>
-      <w:pPr>
-        <w:jc w:val="both"/>
-      </w:pPr>
-      <w:r>
-        <w:t xml:space="preserve">„Ich sitze manchmal noch fünf Minuten da, bevor ich </w:t>
-      </w:r>
-      <w:proofErr w:type="gramStart"/>
-      <w:r>
-        <w:t>reingehe.“</w:t>
-      </w:r>
-      <w:proofErr w:type="gramEnd"/>
-    </w:p>
-    <w:p>
-      <w:pPr>
-        <w:jc w:val="both"/>
-      </w:pPr>
-      <w:r>
-        <w:t>„Im Auto weine ich. Damit es niemand sieht.“</w:t>
+        <w:t>„Im Auto kann ich sein, wie ich bin.“</w:t>
       </w:r>
       <w:proofErr w:type="gramStart"/>
       <w:r/>
@@ -7441,15 +7414,39 @@
     </w:p>
     <w:p>
       <w:pPr>
-        <w:spacing w:after="71"/>
-      </w:pPr>
-    </w:p>
-    <w:p>
-      <w:pPr>
-        <w:jc w:val="both"/>
-      </w:pPr>
-      <w:r>
-        <w:t>Das Auto ist der einzige Ort geworden an dem du nicht stark sein musst.</w:t>
+        <w:jc w:val="both"/>
+      </w:pPr>
+      <w:r>
+        <w:t xml:space="preserve">„Ich sitze manchmal noch fünf Minuten da, bevor ich </w:t>
+      </w:r>
+      <w:proofErr w:type="gramStart"/>
+      <w:r>
+        <w:t>reingehe.“</w:t>
+      </w:r>
+      <w:proofErr w:type="gramEnd"/>
+    </w:p>
+    <w:p>
+      <w:pPr>
+        <w:jc w:val="both"/>
+      </w:pPr>
+      <w:r>
+        <w:t>„Im Auto weine ich. Damit es niemand sieht.“</w:t>
+      </w:r>
+      <w:proofErr w:type="gramStart"/>
+      <w:r/>
+      <w:proofErr w:type="gramEnd"/>
+    </w:p>
+    <w:p>
+      <w:pPr>
+        <w:spacing w:after="71"/>
+      </w:pPr>
+    </w:p>
+    <w:p>
+      <w:pPr>
+        <w:jc w:val="both"/>
+      </w:pPr>
+      <w:r>
+        <w:t>Das Auto ist der einzige Ort geworden, an dem du nicht stark sein musst.</w:t>
       </w:r>
     </w:p>
     <w:p>
@@ -7478,16 +7475,12 @@
         <w:jc w:val="both"/>
       </w:pPr>
       <w:r>
-        <w:t xml:space="preserve">Keinen Ort in deinem eigenen Leben </w:t>
+        <w:t>Keinen Ort in deinem eigenen Leben, an dem du sein darfst, wie du bist.</w:t>
       </w:r>
       <w:proofErr w:type="gramStart"/>
-      <w:r>
-        <w:t>an</w:t>
-      </w:r>
+      <w:r/>
       <w:proofErr w:type="gramEnd"/>
-      <w:r>
-        <w:t xml:space="preserve"> dem du sein darfst wie du bist.</w:t>
-      </w:r>
+      <w:r/>
     </w:p>
     <w:p>
       <w:pPr>
@@ -7550,7 +7543,7 @@
         <w:jc w:val="both"/>
       </w:pPr>
       <w:r>
-        <w:t>Wenn ich zeige wie es mir wirklich geht, belaste ich andere.</w:t>
+        <w:t>Wenn ich zeige, wie es mir wirklich geht, belaste ich andere.</w:t>
       </w:r>
     </w:p>
     <w:p>
@@ -8004,7 +7997,7 @@
         <w:jc w:val="both"/>
       </w:pPr>
       <w:r>
-        <w:t>Bis ich erklärt habe wie es geht, habe ich es selbst gemacht.</w:t>
+        <w:t>Bis ich erklärt habe, wie es geht, habe ich es selbst gemacht.</w:t>
       </w:r>
     </w:p>
     <w:p>
@@ -8896,7 +8889,7 @@
         <w:jc w:val="both"/>
       </w:pPr>
       <w:r>
-        <w:t>Der Rückzug. Der Gesichtsausdruck der sagt: Du hast mich verletzt.</w:t>
+        <w:t>Der Rückzug. Der Gesichtsausdruck, der sagt: Du hast mich verletzt.</w:t>
       </w:r>
     </w:p>
     <w:p>
@@ -8976,12 +8969,10 @@
         <w:jc w:val="both"/>
       </w:pPr>
       <w:r>
-        <w:t xml:space="preserve">„Es fühlt sich an als würde ich gleich </w:t>
+        <w:t>„Es fühlt sich an, als würde ich gleich bestraft.“</w:t>
       </w:r>
       <w:proofErr w:type="gramStart"/>
-      <w:r>
-        <w:t>bestraft.“</w:t>
-      </w:r>
+      <w:r/>
       <w:proofErr w:type="gramEnd"/>
     </w:p>
     <w:p>
@@ -8994,7 +8985,7 @@
         <w:jc w:val="both"/>
       </w:pPr>
       <w:r>
-        <w:t>Das ist der Körper der sich erinnert.</w:t>
+        <w:t>Das ist der Körper, der sich erinnert.</w:t>
       </w:r>
     </w:p>
     <w:p>
@@ -9266,21 +9257,19 @@
         <w:rPr>
           <w:sz w:val="22"/>
         </w:rPr>
-        <w:t xml:space="preserve">Der Tag </w:t>
+        <w:t>Der Tag, an dem ich aufgehört habe, stark zu sein</w:t>
       </w:r>
       <w:proofErr w:type="gramStart"/>
       <w:r>
         <w:rPr>
           <w:sz w:val="22"/>
         </w:rPr>
-        <w:t>an</w:t>
       </w:r>
       <w:proofErr w:type="gramEnd"/>
       <w:r>
         <w:rPr>
           <w:sz w:val="22"/>
         </w:rPr>
-        <w:t xml:space="preserve"> dem ich aufgehört habe, stark zu sein</w:t>
       </w:r>
     </w:p>
     <w:p>
@@ -9330,8 +9319,7 @@
           <w:color w:val="000000"/>
           <w:sz w:val="28"/>
         </w:rPr>
-        <w:lastRenderedPageBreak/>
-        <w:t xml:space="preserve">Kapitel 9: Der Tag </w:t>
+        <w:t>Kapitel 9: Der Tag, an dem ich aufgehört habe, stark zu sein</w:t>
       </w:r>
       <w:proofErr w:type="gramStart"/>
       <w:r>
@@ -9340,7 +9328,6 @@
           <w:color w:val="000000"/>
           <w:sz w:val="28"/>
         </w:rPr>
-        <w:t>an</w:t>
       </w:r>
       <w:proofErr w:type="gramEnd"/>
       <w:r>
@@ -9349,7 +9336,6 @@
           <w:color w:val="000000"/>
           <w:sz w:val="28"/>
         </w:rPr>
-        <w:t xml:space="preserve"> dem ich aufgehört habe, stark zu sein</w:t>
       </w:r>
       <w:bookmarkEnd w:id="11"/>
     </w:p>
@@ -9654,28 +9640,28 @@
         <w:jc w:val="both"/>
       </w:pPr>
       <w:r>
-        <w:t>Das war der Moment in dem ich mein eigenes Funktions-Ich gesehen habe.</w:t>
-      </w:r>
-    </w:p>
-    <w:p>
-      <w:pPr>
-        <w:spacing w:after="71"/>
-      </w:pPr>
-    </w:p>
-    <w:p>
-      <w:pPr>
-        <w:jc w:val="both"/>
-      </w:pPr>
-      <w:r>
-        <w:t>Ich half Menschen herauszufinden was sie brauchen.</w:t>
-      </w:r>
-    </w:p>
-    <w:p>
-      <w:pPr>
-        <w:jc w:val="both"/>
-      </w:pPr>
-      <w:r>
-        <w:t>Und hatte keine Ahnung was ICH brauchte.</w:t>
+        <w:t>Das war der Moment, in dem ich mein eigenes Funktions-Ich gesehen habe.</w:t>
+      </w:r>
+    </w:p>
+    <w:p>
+      <w:pPr>
+        <w:spacing w:after="71"/>
+      </w:pPr>
+    </w:p>
+    <w:p>
+      <w:pPr>
+        <w:jc w:val="both"/>
+      </w:pPr>
+      <w:r>
+        <w:t>Ich half Menschen herauszufinden, was sie brauchen.</w:t>
+      </w:r>
+    </w:p>
+    <w:p>
+      <w:pPr>
+        <w:jc w:val="both"/>
+      </w:pPr>
+      <w:r>
+        <w:t>Und hatte keine Ahnung, was ICH brauchte.</w:t>
       </w:r>
     </w:p>
     <w:p>
@@ -9838,7 +9824,7 @@
         <w:jc w:val="both"/>
       </w:pPr>
       <w:r>
-        <w:t>Er redet über mich wie über eine Maschine die überhitzt ist.</w:t>
+        <w:t>Er redet über mich wie über eine Maschine, die überhitzt ist.</w:t>
       </w:r>
     </w:p>
     <w:p>
@@ -9970,7 +9956,7 @@
         <w:jc w:val="both"/>
       </w:pPr>
       <w:r>
-        <w:t xml:space="preserve">Der Moment in dem du aufhörst zu sagen: „Mir geht es </w:t>
+        <w:t xml:space="preserve">Der Moment, in dem du aufhörst zu sagen: „Mir geht es </w:t>
       </w:r>
       <w:proofErr w:type="gramStart"/>
       <w:r>
@@ -10046,7 +10032,7 @@
           <w:i/>
           <w:sz w:val="21"/>
         </w:rPr>
-        <w:t>Gab es einen Moment in dem du gedacht hast: So geht es nicht weiter?</w:t>
+        <w:t>Gab es einen Moment, in dem du gedacht hast: So geht es nicht weiter?</w:t>
       </w:r>
       <w:r>
         <w:br/>
@@ -11140,7 +11126,7 @@
         <w:jc w:val="both"/>
       </w:pPr>
       <w:r>
-        <w:t>Ich hatte eine Klientin die mir sagte:</w:t>
+        <w:t>Ich hatte eine Klientin, die mir sagte:</w:t>
       </w:r>
     </w:p>
     <w:p>
@@ -11518,7 +11504,7 @@
         <w:rPr>
           <w:sz w:val="22"/>
         </w:rPr>
-        <w:t>Was ich wirklich brauche und wie ich lerne es zu sagen</w:t>
+        <w:t>Was ich wirklich brauche und wie ich lerne, es zu sagen</w:t>
       </w:r>
     </w:p>
     <w:p>
@@ -11554,7 +11540,7 @@
         <w:rPr>
           <w:sz w:val="22"/>
         </w:rPr>
-        <w:t>Um Hilfe bitten ohne dich zu erklären</w:t>
+        <w:t>Um Hilfe bitten, ohne dich zu erklären</w:t>
       </w:r>
     </w:p>
     <w:p>
@@ -11604,8 +11590,7 @@
           <w:color w:val="000000"/>
           <w:sz w:val="28"/>
         </w:rPr>
-        <w:lastRenderedPageBreak/>
-        <w:t>Kapitel 12: Was ich wirklich brauche und wie ich lerne es zu sagen</w:t>
+        <w:t>Kapitel 12: Was ich wirklich brauche und wie ich lerne, es zu sagen</w:t>
       </w:r>
       <w:bookmarkEnd w:id="15"/>
     </w:p>
@@ -11726,7 +11711,7 @@
         <w:jc w:val="both"/>
       </w:pPr>
       <w:r>
-        <w:t>Ich brauche fünf Minuten in denen niemand etwas von mir will.</w:t>
+        <w:t>Ich brauche fünf Minuten, in denen niemand etwas von mir will.</w:t>
       </w:r>
     </w:p>
     <w:p>
@@ -11790,7 +11775,7 @@
         <w:jc w:val="both"/>
       </w:pPr>
       <w:r>
-        <w:t>Wie ein Muskel der lange nicht benutzt wurde.</w:t>
+        <w:t>Wie ein Muskel, der lange nicht benutzt wurde.</w:t>
       </w:r>
     </w:p>
     <w:p>
@@ -12222,7 +12207,7 @@
           <w:i/>
           <w:sz w:val="21"/>
         </w:rPr>
-        <w:t>Eine Sache. So klein wie sie ist.</w:t>
+        <w:t>Eine Sache. So klein, wie sie ist.</w:t>
       </w:r>
       <w:r>
         <w:br/>
@@ -12401,7 +12386,7 @@
         <w:jc w:val="both"/>
       </w:pPr>
       <w:r>
-        <w:t>Kein Roman warum du absagen musst.</w:t>
+        <w:t>Kein Roman, warum du absagen musst.</w:t>
       </w:r>
     </w:p>
     <w:p>
@@ -12554,7 +12539,7 @@
         <w:jc w:val="both"/>
       </w:pPr>
       <w:r>
-        <w:t>Von früher als Nein wirklich gefährlich war.</w:t>
+        <w:t>Von früher, als Nein wirklich gefährlich war.</w:t>
       </w:r>
     </w:p>
     <w:p>
@@ -12596,7 +12581,7 @@
         <w:jc w:val="both"/>
       </w:pPr>
       <w:r>
-        <w:t>Nicht bei der Person bei der es am meisten wehtut.</w:t>
+        <w:t>Nicht bei der Person, bei der es am meisten wehtut.</w:t>
       </w:r>
     </w:p>
     <w:p>
@@ -12631,15 +12616,15 @@
         <w:jc w:val="both"/>
       </w:pPr>
       <w:r>
-        <w:t>Eine Einladung die du nicht annehmen willst.</w:t>
-      </w:r>
-    </w:p>
-    <w:p>
-      <w:pPr>
-        <w:jc w:val="both"/>
-      </w:pPr>
-      <w:r>
-        <w:t>Eine Bitte die du erfüllen könntest aber nicht willst.</w:t>
+        <w:t>Eine Einladung, die du nicht annehmen willst.</w:t>
+      </w:r>
+    </w:p>
+    <w:p>
+      <w:pPr>
+        <w:jc w:val="both"/>
+      </w:pPr>
+      <w:r>
+        <w:t>Eine Bitte, die du erfüllen könntest, aber nicht willst.</w:t>
       </w:r>
     </w:p>
     <w:p>
@@ -13732,7 +13717,7 @@
           <w:color w:val="000000"/>
           <w:sz w:val="28"/>
         </w:rPr>
-        <w:t>Kapitel 15: Um Hilfe bitten ohne dich zu erklären</w:t>
+        <w:t>Kapitel 15: Um Hilfe bitten, ohne dich zu erklären</w:t>
       </w:r>
       <w:bookmarkEnd w:id="17"/>
     </w:p>
@@ -14262,12 +14247,10 @@
         <w:jc w:val="both"/>
       </w:pPr>
       <w:r>
-        <w:t xml:space="preserve">„Wenn mir jemand hilft, kann ich nicht schlafen bis ich es ausgeglichen </w:t>
+        <w:t>„Wenn mir jemand hilft, kann ich nicht schlafen, bis ich es ausgeglichen habe.“</w:t>
       </w:r>
       <w:proofErr w:type="gramStart"/>
-      <w:r>
-        <w:t>habe.“</w:t>
-      </w:r>
+      <w:r/>
       <w:proofErr w:type="gramEnd"/>
     </w:p>
     <w:p>
@@ -14440,7 +14423,7 @@
         <w:jc w:val="both"/>
       </w:pPr>
       <w:r>
-        <w:t>Nähe entsteht, wenn jemand dich sieht wie du bist.</w:t>
+        <w:t>Nähe entsteht, wenn jemand dich sieht, wie du bist.</w:t>
       </w:r>
     </w:p>
     <w:p>
@@ -14661,7 +14644,7 @@
         <w:jc w:val="both"/>
       </w:pPr>
       <w:r>
-        <w:t>Hier ist die Frage die alles blockiert:</w:t>
+        <w:t>Hier ist die Frage, die alles blockiert:</w:t>
       </w:r>
     </w:p>
     <w:p>
@@ -14850,16 +14833,12 @@
         <w:jc w:val="both"/>
       </w:pPr>
       <w:r>
-        <w:t xml:space="preserve">Sie war </w:t>
+        <w:t>Sie war an dem interessiert, was du geleistet hast.</w:t>
       </w:r>
       <w:proofErr w:type="gramStart"/>
-      <w:r>
-        <w:t>an</w:t>
-      </w:r>
+      <w:r/>
       <w:proofErr w:type="gramEnd"/>
-      <w:r>
-        <w:t xml:space="preserve"> dem interessiert was du geleistet hast.</w:t>
-      </w:r>
+      <w:r/>
     </w:p>
     <w:p>
       <w:pPr>
@@ -14892,7 +14871,7 @@
         <w:jc w:val="both"/>
       </w:pPr>
       <w:r>
-        <w:t>Die Menschen die wirklich für dich da sind, bleiben.</w:t>
+        <w:t>Die Menschen, die wirklich für dich da sind, bleiben.</w:t>
       </w:r>
     </w:p>
     <w:p>
@@ -15079,7 +15058,7 @@
           <w:i/>
           <w:sz w:val="21"/>
         </w:rPr>
-        <w:t>Ist die Beziehung stabil genug um das zu tragen?</w:t>
+        <w:t>Ist die Beziehung stabil genug, um das zu tragen?</w:t>
       </w:r>
       <w:r>
         <w:br/>
@@ -15089,7 +15068,7 @@
           <w:i/>
           <w:sz w:val="21"/>
         </w:rPr>
-        <w:t>Wenn ja: Das Nein ist sicherer als du denkst.</w:t>
+        <w:t>Wenn ja: Das Nein ist sicherer, als du denkst.</w:t>
       </w:r>
       <w:r>
         <w:br/>
@@ -16566,7 +16545,7 @@
         <w:jc w:val="both"/>
       </w:pPr>
       <w:r>
-        <w:t>Nicht die Rückfälle. Die Zeit bis du es siehst.</w:t>
+        <w:t>Nicht die Rückfälle. Die Zeit, bis du es siehst.</w:t>
       </w:r>
     </w:p>
     <w:p>
@@ -17387,16 +17366,12 @@
         <w:jc w:val="both"/>
       </w:pPr>
       <w:r>
-        <w:t xml:space="preserve">Es </w:t>
+        <w:t>Es hat dich funktionieren lassen, als alles andere zusammenbrach.</w:t>
       </w:r>
       <w:proofErr w:type="gramStart"/>
-      <w:r>
-        <w:t>hat</w:t>
-      </w:r>
+      <w:r/>
       <w:proofErr w:type="gramEnd"/>
-      <w:r>
-        <w:t xml:space="preserve"> dich funktionieren lassen als alles andere zusammenbrach.</w:t>
-      </w:r>
+      <w:r/>
     </w:p>
     <w:p>
       <w:pPr>
@@ -17443,7 +17418,7 @@
         <w:jc w:val="both"/>
       </w:pPr>
       <w:r>
-        <w:t>Nicht das Ich das nie müde ist.</w:t>
+        <w:t>Nicht das Ich, das nie müde ist.</w:t>
       </w:r>
     </w:p>
     <w:p>
@@ -17464,7 +17439,7 @@
         <w:jc w:val="both"/>
       </w:pPr>
       <w:r>
-        <w:t>Das Ich das manchmal keine Ahnung hat was es will.</w:t>
+        <w:t>Das Ich, das manchmal keine Ahnung hat, was es will.</w:t>
       </w:r>
     </w:p>
     <w:p>
@@ -17530,7 +17505,7 @@
         <w:jc w:val="both"/>
       </w:pPr>
       <w:r>
-        <w:t>Und jetzt die Frage die bleibt:</w:t>
+        <w:t>Und jetzt die Frage, die bleibt:</w:t>
       </w:r>
     </w:p>
     <w:p>
@@ -17781,7 +17756,7 @@
         <w:jc w:val="both"/>
       </w:pPr>
       <w:r>
-        <w:t>Frag dich heute was du brauchst.</w:t>
+        <w:t>Frag dich heute, was du brauchst.</w:t>
       </w:r>
     </w:p>
     <w:p>
@@ -18633,7 +18608,7 @@
         <w:jc w:val="both"/>
       </w:pPr>
       <w:r>
-        <w:t>Du weisst jetzt wo es herkommt.</w:t>
+        <w:t>Du weisst jetzt, wo es herkommt.</w:t>
       </w:r>
     </w:p>
     <w:p>
@@ -19216,27 +19191,17 @@
         <w:jc w:val="both"/>
       </w:pPr>
       <w:r>
-        <w:t>Dies</w:t>
-      </w:r>
-      <w:r>
-        <w:t xml:space="preserve"> </w:t>
-      </w:r>
+        <w:t>Dies ist ihr 3. Buch.</w:t>
+      </w:r>
+      <w:r/>
       <w:proofErr w:type="spellStart"/>
-      <w:r>
-        <w:t>ist</w:t>
-      </w:r>
+      <w:r/>
       <w:proofErr w:type="spellEnd"/>
-      <w:r>
-        <w:t xml:space="preserve"> </w:t>
-      </w:r>
+      <w:r/>
       <w:proofErr w:type="spellStart"/>
-      <w:r>
-        <w:t>ihr</w:t>
-      </w:r>
+      <w:r/>
       <w:proofErr w:type="spellEnd"/>
-      <w:r>
-        <w:t xml:space="preserve"> 3. Buch</w:t>
-      </w:r>
+      <w:r/>
     </w:p>
     <w:p>
       <w:pPr>

</xml_diff>

<commit_message>
Buch 6: Fallfigur heisst jetzt Anna statt Claudia
Auf Wunsch von Petra, sie hatte nie eine Klientin dieses Namens.
Alle fuenf Stellen, Umfang unveraendert 126 Seiten.

Co-Authored-By: Claude Opus 5 <noreply@anthropic.com>
Claude-Session: https://claude.ai/code/session_011oFtWvyjvkDdc6K2GcSXHx
</commit_message>
<xml_diff>
--- a/outputs/buch6/buch6-MANUSKRIPT.docx
+++ b/outputs/buch6/buch6-MANUSKRIPT.docx
@@ -4169,7 +4169,7 @@
         <w:jc w:val="both"/>
       </w:pPr>
       <w:r>
-        <w:t>Eine Frau sass mir gegenüber, nennen wir sie Claudia. Vierzig, zwei Kinder, Vollzeit.</w:t>
+        <w:t>Eine Frau sass mir gegenüber, nennen wir sie Anna. Vierzig, zwei Kinder, Vollzeit.</w:t>
       </w:r>
     </w:p>
     <w:p>
@@ -12072,7 +12072,7 @@
         <w:jc w:val="both"/>
       </w:pPr>
       <w:r>
-        <w:t xml:space="preserve">Claudia hat mit etwas angefangen, das lächerlich klein klingt.</w:t>
+        <w:t>Anna hat mit etwas angefangen, das lächerlich klein klingt.</w:t>
       </w:r>
     </w:p>
     <w:p>
@@ -13473,7 +13473,7 @@
         <w:jc w:val="both"/>
       </w:pPr>
       <w:r>
-        <w:t>Claudia, die du aus dem ersten Kapitel kennst, hat es zuerst bei ihrer Schwester versucht.</w:t>
+        <w:t>Anna, die du aus dem ersten Kapitel kennst, hat es zuerst bei ihrer Schwester versucht.</w:t>
       </w:r>
     </w:p>
     <w:p>
@@ -15712,7 +15712,7 @@
         <w:jc w:val="both"/>
       </w:pPr>
       <w:r>
-        <w:t xml:space="preserve">Claudia hat in Woche 1 einunddreissig Striche gezählt.</w:t>
+        <w:t>Anna hat in Woche 1 einunddreissig Striche gezählt.</w:t>
       </w:r>
     </w:p>
     <w:p>
@@ -16685,7 +16685,7 @@
         <w:jc w:val="both"/>
       </w:pPr>
       <w:r>
-        <w:t>Claudia hat mir im vierten Monat geschrieben.</w:t>
+        <w:t>Anna hat mir im vierten Monat geschrieben.</w:t>
       </w:r>
     </w:p>
     <w:p>

</xml_diff>

<commit_message>
Journal zu 'Ich bin so müde' erstellen; Rechtssicherheitsfehler (Ausschlussdiagnose-Formel) beheben; Journal-Hinweis und Social-Media-Kontakte im Hauptbuch ergänzen
</commit_message>
<xml_diff>
--- a/outputs/buch6/buch6-MANUSKRIPT.docx
+++ b/outputs/buch6/buch6-MANUSKRIPT.docx
@@ -18795,6 +18795,19 @@
         <w:jc w:val="both"/>
       </w:pPr>
       <w:r>
+        <w:t>Zu diesem Buch gibt es auch ein Journal: „Ich bin so müde. — Das Journal“, mit Reflexionsfragen und Schreibraum zu jedem Kapitel. Erhältlich ebenfalls bei Amazon.</w:t>
+      </w:r>
+    </w:p>
+    <w:p>
+      <w:pPr>
+        <w:spacing w:after="71"/>
+      </w:pPr>
+    </w:p>
+    <w:p>
+      <w:pPr>
+        <w:jc w:val="both"/>
+      </w:pPr>
+      <w:r>
         <w:rPr>
           <w:b/>
         </w:rPr>
@@ -19642,6 +19655,28 @@
           <w:sz w:val="18"/>
         </w:rPr>
         <w:t>info.safetothrive@gmail.com</w:t>
+      </w:r>
+    </w:p>
+    <w:p>
+      <w:pPr>
+        <w:spacing w:after="80"/>
+      </w:pPr>
+      <w:r>
+        <w:rPr>
+          <w:sz w:val="18"/>
+        </w:rPr>
+        <w:t>Facebook-Gruppe: Safe to Thrive — Dein Leben. Deine Regeln, https://www.facebook.com/share/g/17ca96zXDd/</w:t>
+      </w:r>
+    </w:p>
+    <w:p>
+      <w:pPr>
+        <w:spacing w:after="80"/>
+      </w:pPr>
+      <w:r>
+        <w:rPr>
+          <w:sz w:val="18"/>
+        </w:rPr>
+        <w:t>Instagram: @petratanner.autorin</w:t>
       </w:r>
     </w:p>
     <w:p>

</xml_diff>

<commit_message>
Buch 6: leere Seite 5 im Word-Manuskript entfernt
Zwei überflüssige Leerabsätze direkt vor dem Seitenumbruch zur Einleitung
erzeugten beim Öffnen in Word eine eigene leere Seite (im eigenen PDF-Bau
nicht sichtbar, da der Renderer Absätze enger setzt). Entfernt, Inhalt
sonst unverändert.

Co-Authored-By: Claude Sonnet 5 <noreply@anthropic.com>
Claude-Session: https://claude.ai/code/session_011oFtWvyjvkDdc6K2GcSXHx
</commit_message>
<xml_diff>
--- a/outputs/buch6/buch6-MANUSKRIPT.docx
+++ b/outputs/buch6/buch6-MANUSKRIPT.docx
@@ -2198,22 +2198,6 @@
           <w:fldChar w:fldCharType="end"/>
         </w:r>
       </w:hyperlink>
-    </w:p>
-    <w:p>
-      <w:pPr>
-        <w:sectPr>
-          <w:footerReference w:type="default" r:id="rId9"/>
-          <w:pgSz w:w="8391" w:h="11906"/>
-          <w:pgMar w:top="1247" w:right="1077" w:bottom="1247" w:left="1077" w:header="720" w:footer="720" w:gutter="0"/>
-          <w:cols w:space="720"/>
-          <w:docGrid w:linePitch="360"/>
-        </w:sectPr>
-      </w:pPr>
-    </w:p>
-    <w:p>
-      <w:r>
-        <w:fldChar w:fldCharType="end"/>
-      </w:r>
     </w:p>
     <w:p>
       <w:r>

</xml_diff>

<commit_message>
Buch 6: Bonusseite nutzte fälschlich Überschriften-Schriftgrösse für Fliesstext
Die geklonten Absätze der Bonusseite (Text, QR-Hinweis, Link, Signatur)
hatten versehentlich den Stil "Heading 2" (14pt fett) statt normaler
Fliesstext-Formatierung geerbt, weil die automatische Referenzsuche im
Einfüge-Skript eine Kapitelüberschrift statt eines echten Textabsatzes
als Vorlage nahm. Dadurch wirkte die Seite in Word viel zu gross und lief
auf eine zusätzliche, fast leere Folgeseite über. Jetzt auf normale
Absatzformatierung (Stil "Normal", nicht fett ausser Überschrift und
"Petra Tanner") zurückgesetzt, passt wieder auf eine Seite.

Co-Authored-By: Claude Sonnet 5 <noreply@anthropic.com>
Claude-Session: https://claude.ai/code/session_011oFtWvyjvkDdc6K2GcSXHx
</commit_message>
<xml_diff>
--- a/outputs/buch6/buch6-MANUSKRIPT.docx
+++ b/outputs/buch6/buch6-MANUSKRIPT.docx
@@ -19482,60 +19482,52 @@
       <w:bookmarkEnd w:id="4"/>
     </w:p>
     <w:p>
-      <w:pPr>
-        <w:pStyle w:val="berschrift2"/>
-      </w:pPr>
+      <w:pPr/>
       <w:bookmarkStart w:id="4" w:name="_Toc235888468"/>
       <w:r>
         <w:rPr>
           <w:rFonts w:ascii="Times New Roman" w:hAnsi="Times New Roman"/>
+          <w:b w:val="0"/>
           <w:color w:val="000000"/>
-          <w:sz w:val="28"/>
         </w:rPr>
         <w:t>Du kennst diese Momente: Du funktionierst den ganzen Tag, und abends bleibt nichts mehr von dir übrig.</w:t>
       </w:r>
       <w:bookmarkEnd w:id="4"/>
     </w:p>
     <w:p>
-      <w:pPr>
-        <w:pStyle w:val="berschrift2"/>
-      </w:pPr>
+      <w:pPr/>
       <w:bookmarkStart w:id="4" w:name="_Toc235888468"/>
       <w:r>
         <w:rPr>
           <w:rFonts w:ascii="Times New Roman" w:hAnsi="Times New Roman"/>
+          <w:b w:val="0"/>
           <w:color w:val="000000"/>
-          <w:sz w:val="28"/>
         </w:rPr>
         <w:t>Das kostenlose Begleit-PDF hilft dir, früher zu erkennen, wann du nur noch funktionierst statt wirklich da zu sein, und was du in genau diesem Moment wirklich brauchst.</w:t>
       </w:r>
       <w:bookmarkEnd w:id="4"/>
     </w:p>
     <w:p>
-      <w:pPr>
-        <w:pStyle w:val="berschrift2"/>
-      </w:pPr>
+      <w:pPr/>
       <w:bookmarkStart w:id="4" w:name="_Toc235888468"/>
       <w:r>
         <w:rPr>
           <w:rFonts w:ascii="Times New Roman" w:hAnsi="Times New Roman"/>
+          <w:b w:val="0"/>
           <w:color w:val="000000"/>
-          <w:sz w:val="28"/>
         </w:rPr>
         <w:t>Du musst nicht warten, bis dich die Erschöpfung völlig einholt, bevor du dich selbst ernst nimmst.</w:t>
       </w:r>
       <w:bookmarkEnd w:id="4"/>
     </w:p>
     <w:p>
-      <w:pPr>
-        <w:pStyle w:val="berschrift2"/>
-      </w:pPr>
+      <w:pPr/>
       <w:bookmarkStart w:id="4" w:name="_Toc235888468"/>
       <w:r>
         <w:rPr>
           <w:rFonts w:ascii="Times New Roman" w:hAnsi="Times New Roman"/>
+          <w:b w:val="0"/>
           <w:color w:val="000000"/>
-          <w:sz w:val="28"/>
         </w:rPr>
         <w:t>Scanne den QR-Code oder öffne den folgenden Link:</w:t>
       </w:r>
@@ -19546,6 +19538,9 @@
         <w:jc w:val="center"/>
       </w:pPr>
       <w:r>
+        <w:rPr>
+          <w:b w:val="0"/>
+        </w:rPr>
         <w:drawing>
           <wp:inline xmlns:a="http://schemas.openxmlformats.org/drawingml/2006/main" xmlns:pic="http://schemas.openxmlformats.org/drawingml/2006/picture">
             <wp:extent cx="1620000" cy="1620000"/>
@@ -19581,76 +19576,64 @@
       </w:r>
     </w:p>
     <w:p>
-      <w:pPr>
-        <w:pStyle w:val="berschrift2"/>
-      </w:pPr>
+      <w:pPr/>
       <w:bookmarkStart w:id="4" w:name="_Toc235888468"/>
       <w:r>
         <w:rPr>
           <w:rFonts w:ascii="Times New Roman" w:hAnsi="Times New Roman"/>
+          <w:b w:val="0"/>
           <w:color w:val="000000"/>
-          <w:sz w:val="28"/>
         </w:rPr>
         <w:t>https://beyondlimitsnow25.mytentary.com/p/em4KK8</w:t>
       </w:r>
       <w:bookmarkEnd w:id="4"/>
     </w:p>
     <w:p>
-      <w:pPr>
-        <w:pStyle w:val="berschrift2"/>
-      </w:pPr>
+      <w:pPr/>
       <w:bookmarkStart w:id="4" w:name="_Toc235888468"/>
       <w:r>
         <w:rPr>
           <w:rFonts w:ascii="Times New Roman" w:hAnsi="Times New Roman"/>
+          <w:b w:val="0"/>
           <w:color w:val="000000"/>
-          <w:sz w:val="28"/>
         </w:rPr>
         <w:t>Mit der Anmeldung erhältst du auch E-Mails von Petra Tanner mit Impulsen und Neuigkeiten zu ihren Büchern. Eine Abmeldung ist jederzeit möglich.</w:t>
       </w:r>
       <w:bookmarkEnd w:id="4"/>
     </w:p>
     <w:p>
-      <w:pPr>
-        <w:pStyle w:val="berschrift2"/>
-      </w:pPr>
+      <w:pPr/>
       <w:bookmarkStart w:id="4" w:name="_Toc235888468"/>
       <w:r>
         <w:rPr>
           <w:rFonts w:ascii="Times New Roman" w:hAnsi="Times New Roman"/>
+          <w:b w:val="0"/>
           <w:color w:val="000000"/>
-          <w:sz w:val="28"/>
         </w:rPr>
       </w:r>
       <w:bookmarkEnd w:id="4"/>
     </w:p>
     <w:p>
-      <w:pPr>
-        <w:pStyle w:val="berschrift2"/>
-      </w:pPr>
+      <w:pPr/>
       <w:bookmarkStart w:id="4" w:name="_Toc235888468"/>
       <w:r>
         <w:rPr>
           <w:rFonts w:ascii="Times New Roman" w:hAnsi="Times New Roman"/>
           <w:b/>
           <w:color w:val="000000"/>
-          <w:sz w:val="28"/>
         </w:rPr>
         <w:t>Petra Tanner</w:t>
       </w:r>
       <w:bookmarkEnd w:id="4"/>
     </w:p>
     <w:p>
-      <w:pPr>
-        <w:pStyle w:val="berschrift2"/>
-      </w:pPr>
+      <w:pPr/>
       <w:bookmarkStart w:id="4" w:name="_Toc235888468"/>
       <w:r>
         <w:rPr>
           <w:rFonts w:ascii="Times New Roman" w:hAnsi="Times New Roman"/>
           <w:b w:val="0"/>
           <w:color w:val="000000"/>
-          <w:sz w:val="28"/>
         </w:rPr>
         <w:t>Autorin und Mentorin</w:t>
       </w:r>

</xml_diff>

<commit_message>
Buch 6: Trennstrich oben auf Seite 6 entfernt
Ein Absatzrahmen (untere Randlinie) auf einem Leerabsatz vor der
Einleitung erzeugte in Word einen sichtbaren horizontalen Strich, den es
im gebauten PDF nicht gab. Entfernt.

Co-Authored-By: Claude Sonnet 5 <noreply@anthropic.com>
Claude-Session: https://claude.ai/code/session_011oFtWvyjvkDdc6K2GcSXHx
</commit_message>
<xml_diff>
--- a/outputs/buch6/buch6-MANUSKRIPT.docx
+++ b/outputs/buch6/buch6-MANUSKRIPT.docx
@@ -2390,11 +2390,7 @@
       </w:pPr>
     </w:p>
     <w:p>
-      <w:pPr>
-        <w:pBdr>
-          <w:bottom w:val="single" w:sz="4" w:space="0" w:color="AAAAAA"/>
-        </w:pBdr>
-      </w:pPr>
+      <w:pPr/>
     </w:p>
     <w:p>
       <w:pPr>

</xml_diff>

<commit_message>
Buch 6: 'Zur Autorin' beginnt jetzt auf eigener Seite nach der Bonusseite
Seitenumbruch vor 'Zur Autorin' eingefügt, damit die Bonusseite (Text,
QR-Code, Link, Signatur) sauber für sich steht und 'Zur Autorin' nicht
mehr als einzelne Überschrift am Fuss der Bonusseite hängt.

Co-Authored-By: Claude Sonnet 5 <noreply@anthropic.com>
Claude-Session: https://claude.ai/code/session_011oFtWvyjvkDdc6K2GcSXHx
</commit_message>
<xml_diff>
--- a/outputs/buch6/buch6-MANUSKRIPT.docx
+++ b/outputs/buch6/buch6-MANUSKRIPT.docx
@@ -19634,6 +19634,12 @@
         <w:t>Autorin und Mentorin</w:t>
       </w:r>
       <w:bookmarkEnd w:id="4"/>
+    </w:p>
+    <w:p>
+      <w:pPr/>
+      <w:r>
+        <w:br w:type="page"/>
+      </w:r>
     </w:p>
     <w:p>
       <w:pPr>

</xml_diff>